<commit_message>
Revise File 1 Excel and File 2 Word with complete Braille Indikator I file list and direct Admin link
</commit_message>
<xml_diff>
--- a/FILE_2_PANDUAN_UPLOAD_WEBSITE_ADMIN_PANEL.docx
+++ b/FILE_2_PANDUAN_UPLOAD_WEBSITE_ADMIN_PANEL.docx
@@ -12555,7 +12555,7 @@
                 <w:color w:val="002B5C"/>
                 <w:sz w:val="15"/>
               </w:rPr>
-              <w:t>Dokumen Formulir Permohonan &amp; Keberatan Huruf Braille serta Laporan Inovasi Layanan Ramah Disabilitas PPID PKTJ Tegal</w:t>
+              <w:t>Dokumen Formulir Permohonan &amp; Keberatan Huruf Braille (Standar &amp; Full) serta Laporan Inovasi Layanan Ramah Disabilitas PPID PKTJ Tegal</w:t>
               <w:br/>
             </w:r>
             <w:r>
@@ -12564,7 +12564,7 @@
                 <w:color w:val="64748B"/>
                 <w:sz w:val="14"/>
               </w:rPr>
-              <w:t>Inovasi pemenuhan sarana aksesibilitas terpadu bagi penyandang disabilitas: Formulir Permohonan Braille, Pernyataan Keberatan Braille, Audio Text-to-Speech otomatis, serta Video Panduan Bahasa Isyarat (Bisindo).</w:t>
+              <w:t>Inovasi pemenuhan sarana aksesibilitas terpadu bagi penyandang disabilitas: Formulir Permohonan Braille (Standar &amp; Full Format), Pernyataan Keberatan Braille (Standar &amp; Full Format), Audio Text-to-Speech otomatis, serta Video Panduan Bahasa Isyarat (Bisindo). Diunggah/diinput linknya melalui Menu Admin Layanan Inklusif (Braille).</w:t>
             </w:r>
           </w:p>
         </w:tc>
@@ -12586,7 +12586,7 @@
                 <w:color w:val="B45309"/>
                 <w:sz w:val="15"/>
               </w:rPr>
-              <w:t>FORMULIR PERMOHONAN BRAILE.pdf, PERNYATAAN KEBERATAN BRAILE.pdf, &amp; Inovasi PPID.docx</w:t>
+              <w:t>FORMULIR PERMOHONAN INFORMASI PUBLIK BRAILE.pdf, FORMULIR PERMOHONAN INFORMASI PUBLIK FULL BRAILE.pdf, PERNYATAAN KEBERATAN ATAS PERMOHONAN INFORMASI BRAILE.pdf, PERNYATAAN KEBERATAN ATAS PERMOHONAN INFORMASI FULL BRAILE.pdf, &amp; Inovasi PPID.docx</w:t>
               <w:br/>
             </w:r>
             <w:r>
@@ -12595,7 +12595,7 @@
                 <w:color w:val="475569"/>
                 <w:sz w:val="14"/>
               </w:rPr>
-              <w:t>AKIP PKTJ 2025\Indikator I\FORMULIR PERMOHONAN BRAILE.pdf, PERNYATAAN KEBERATAN BRAILE.pdf, &amp; Inovasi PPID.docx</w:t>
+              <w:t>AKIP PKTJ 2025\Indikator I</w:t>
             </w:r>
             <w:r>
               <w:rPr>

</xml_diff>

<commit_message>
Ensure complete synchronization of File 1 Excel and File 2 Word master files across root and Bahan folders
</commit_message>
<xml_diff>
--- a/FILE_2_PANDUAN_UPLOAD_WEBSITE_ADMIN_PANEL.docx
+++ b/FILE_2_PANDUAN_UPLOAD_WEBSITE_ADMIN_PANEL.docx
@@ -178,7 +178,7 @@
           <w:color w:val="002B5C"/>
           <w:sz w:val="19"/>
         </w:rPr>
-        <w:t>BAGIAN 1: TABEL MASTER CHECKLIST DATA DUKUNG AKIP 2026 DENGAN CENTANG REALTIME</w:t>
+        <w:t>BAGIAN 1: RINGKASAN PEDOMAN PENILAIAN MANDIRI AKIP KEMENHUB 2026 (7 PILAR STANDAR UPT)</w:t>
       </w:r>
     </w:p>
     <w:tbl>
@@ -206,6 +206,1200 @@
       <w:tr>
         <w:tc>
           <w:tcPr>
+            <w:tcW w:type="dxa" w:w="576"/>
+            <w:shd w:fill="002B5C"/>
+            <w:tcMar>
+              <w:top w:w="70" w:type="dxa"/>
+              <w:bottom w:w="70" w:type="dxa"/>
+              <w:left w:w="50" w:type="dxa"/>
+              <w:right w:w="50" w:type="dxa"/>
+            </w:tcMar>
+          </w:tcPr>
+          <w:p>
+            <w:pPr>
+              <w:jc w:val="center"/>
+            </w:pPr>
+            <w:r>
+              <w:rPr>
+                <w:b/>
+                <w:color w:val="FFFFFF"/>
+                <w:sz w:val="15"/>
+              </w:rPr>
+              <w:t>No</w:t>
+            </w:r>
+          </w:p>
+        </w:tc>
+        <w:tc>
+          <w:tcPr>
+            <w:tcW w:type="dxa" w:w="3168"/>
+            <w:shd w:fill="002B5C"/>
+            <w:tcMar>
+              <w:top w:w="70" w:type="dxa"/>
+              <w:bottom w:w="70" w:type="dxa"/>
+              <w:left w:w="50" w:type="dxa"/>
+              <w:right w:w="50" w:type="dxa"/>
+            </w:tcMar>
+          </w:tcPr>
+          <w:p>
+            <w:pPr>
+              <w:jc w:val="left"/>
+            </w:pPr>
+            <w:r>
+              <w:rPr>
+                <w:b/>
+                <w:color w:val="FFFFFF"/>
+                <w:sz w:val="15"/>
+              </w:rPr>
+              <w:t>Pilar Penilaian AKIP 2026</w:t>
+            </w:r>
+          </w:p>
+        </w:tc>
+        <w:tc>
+          <w:tcPr>
+            <w:tcW w:type="dxa" w:w="1152"/>
+            <w:shd w:fill="002B5C"/>
+            <w:tcMar>
+              <w:top w:w="70" w:type="dxa"/>
+              <w:bottom w:w="70" w:type="dxa"/>
+              <w:left w:w="50" w:type="dxa"/>
+              <w:right w:w="50" w:type="dxa"/>
+            </w:tcMar>
+          </w:tcPr>
+          <w:p>
+            <w:pPr>
+              <w:jc w:val="center"/>
+            </w:pPr>
+            <w:r>
+              <w:rPr>
+                <w:b/>
+                <w:color w:val="FFFFFF"/>
+                <w:sz w:val="15"/>
+              </w:rPr>
+              <w:t>Bobot</w:t>
+            </w:r>
+          </w:p>
+        </w:tc>
+        <w:tc>
+          <w:tcPr>
+            <w:tcW w:type="dxa" w:w="4032"/>
+            <w:shd w:fill="002B5C"/>
+            <w:tcMar>
+              <w:top w:w="70" w:type="dxa"/>
+              <w:bottom w:w="70" w:type="dxa"/>
+              <w:left w:w="50" w:type="dxa"/>
+              <w:right w:w="50" w:type="dxa"/>
+            </w:tcMar>
+          </w:tcPr>
+          <w:p>
+            <w:pPr>
+              <w:jc w:val="left"/>
+            </w:pPr>
+            <w:r>
+              <w:rPr>
+                <w:b/>
+                <w:color w:val="FFFFFF"/>
+                <w:sz w:val="15"/>
+              </w:rPr>
+              <w:t>Komponen Wajib</w:t>
+            </w:r>
+          </w:p>
+        </w:tc>
+        <w:tc>
+          <w:tcPr>
+            <w:tcW w:type="dxa" w:w="4608"/>
+            <w:shd w:fill="002B5C"/>
+            <w:tcMar>
+              <w:top w:w="70" w:type="dxa"/>
+              <w:bottom w:w="70" w:type="dxa"/>
+              <w:left w:w="50" w:type="dxa"/>
+              <w:right w:w="50" w:type="dxa"/>
+            </w:tcMar>
+          </w:tcPr>
+          <w:p>
+            <w:pPr>
+              <w:jc w:val="left"/>
+            </w:pPr>
+            <w:r>
+              <w:rPr>
+                <w:b/>
+                <w:color w:val="FFFFFF"/>
+                <w:sz w:val="15"/>
+              </w:rPr>
+              <w:t>Standar Bukti Dukung di Website</w:t>
+            </w:r>
+          </w:p>
+        </w:tc>
+        <w:tc>
+          <w:tcPr>
+            <w:tcW w:type="dxa" w:w="2592"/>
+            <w:shd w:fill="002B5C"/>
+            <w:tcMar>
+              <w:top w:w="70" w:type="dxa"/>
+              <w:bottom w:w="70" w:type="dxa"/>
+              <w:left w:w="50" w:type="dxa"/>
+              <w:right w:w="50" w:type="dxa"/>
+            </w:tcMar>
+          </w:tcPr>
+          <w:p>
+            <w:pPr>
+              <w:jc w:val="left"/>
+            </w:pPr>
+            <w:r>
+              <w:rPr>
+                <w:b/>
+                <w:color w:val="FFFFFF"/>
+                <w:sz w:val="15"/>
+              </w:rPr>
+              <w:t>Lokasi Upload di Admin Panel</w:t>
+            </w:r>
+          </w:p>
+        </w:tc>
+      </w:tr>
+      <w:tr>
+        <w:tc>
+          <w:tcPr>
+            <w:tcW w:type="dxa" w:w="576"/>
+            <w:shd w:fill="FFFFFF"/>
+            <w:tcMar>
+              <w:top w:w="50" w:type="dxa"/>
+              <w:bottom w:w="50" w:type="dxa"/>
+              <w:left w:w="40" w:type="dxa"/>
+              <w:right w:w="40" w:type="dxa"/>
+            </w:tcMar>
+          </w:tcPr>
+          <w:p>
+            <w:pPr>
+              <w:jc w:val="center"/>
+            </w:pPr>
+            <w:r>
+              <w:rPr>
+                <w:sz w:val="14"/>
+              </w:rPr>
+              <w:t>1</w:t>
+            </w:r>
+          </w:p>
+        </w:tc>
+        <w:tc>
+          <w:tcPr>
+            <w:tcW w:type="dxa" w:w="3168"/>
+            <w:shd w:fill="FFFFFF"/>
+            <w:tcMar>
+              <w:top w:w="50" w:type="dxa"/>
+              <w:bottom w:w="50" w:type="dxa"/>
+              <w:left w:w="40" w:type="dxa"/>
+              <w:right w:w="40" w:type="dxa"/>
+            </w:tcMar>
+          </w:tcPr>
+          <w:p>
+            <w:pPr>
+              <w:jc w:val="left"/>
+            </w:pPr>
+            <w:r>
+              <w:rPr>
+                <w:b/>
+                <w:color w:val="002B5C"/>
+                <w:sz w:val="14"/>
+              </w:rPr>
+              <w:t>Kelembagaan &amp; Organisasi PPID</w:t>
+            </w:r>
+          </w:p>
+        </w:tc>
+        <w:tc>
+          <w:tcPr>
+            <w:tcW w:type="dxa" w:w="1152"/>
+            <w:shd w:fill="FFFFFF"/>
+            <w:tcMar>
+              <w:top w:w="50" w:type="dxa"/>
+              <w:bottom w:w="50" w:type="dxa"/>
+              <w:left w:w="40" w:type="dxa"/>
+              <w:right w:w="40" w:type="dxa"/>
+            </w:tcMar>
+          </w:tcPr>
+          <w:p>
+            <w:pPr>
+              <w:jc w:val="center"/>
+            </w:pPr>
+            <w:r>
+              <w:rPr>
+                <w:sz w:val="14"/>
+              </w:rPr>
+              <w:t>16.5%</w:t>
+            </w:r>
+          </w:p>
+        </w:tc>
+        <w:tc>
+          <w:tcPr>
+            <w:tcW w:type="dxa" w:w="4032"/>
+            <w:shd w:fill="FFFFFF"/>
+            <w:tcMar>
+              <w:top w:w="50" w:type="dxa"/>
+              <w:bottom w:w="50" w:type="dxa"/>
+              <w:left w:w="40" w:type="dxa"/>
+              <w:right w:w="40" w:type="dxa"/>
+            </w:tcMar>
+          </w:tcPr>
+          <w:p>
+            <w:pPr>
+              <w:jc w:val="left"/>
+            </w:pPr>
+            <w:r>
+              <w:rPr>
+                <w:sz w:val="14"/>
+              </w:rPr>
+              <w:t>SK Penetapan PPID, Struktur PM 46/2018, Profil, Visi Misi, Tugas Fungsi</w:t>
+            </w:r>
+          </w:p>
+        </w:tc>
+        <w:tc>
+          <w:tcPr>
+            <w:tcW w:type="dxa" w:w="4608"/>
+            <w:shd w:fill="FFFFFF"/>
+            <w:tcMar>
+              <w:top w:w="50" w:type="dxa"/>
+              <w:bottom w:w="50" w:type="dxa"/>
+              <w:left w:w="40" w:type="dxa"/>
+              <w:right w:w="40" w:type="dxa"/>
+            </w:tcMar>
+          </w:tcPr>
+          <w:p>
+            <w:pPr>
+              <w:jc w:val="left"/>
+            </w:pPr>
+            <w:r>
+              <w:rPr>
+                <w:sz w:val="14"/>
+              </w:rPr>
+              <w:t>Tersedia narasi profil, bagan struktur resmi, SK Direktur aktif di halaman website.</w:t>
+            </w:r>
+          </w:p>
+        </w:tc>
+        <w:tc>
+          <w:tcPr>
+            <w:tcW w:type="dxa" w:w="2592"/>
+            <w:shd w:fill="FFFFFF"/>
+            <w:tcMar>
+              <w:top w:w="50" w:type="dxa"/>
+              <w:bottom w:w="50" w:type="dxa"/>
+              <w:left w:w="40" w:type="dxa"/>
+              <w:right w:w="40" w:type="dxa"/>
+            </w:tcMar>
+          </w:tcPr>
+          <w:p>
+            <w:pPr>
+              <w:jc w:val="left"/>
+            </w:pPr>
+            <w:r>
+              <w:rPr>
+                <w:b/>
+                <w:color w:val="004A99"/>
+                <w:sz w:val="14"/>
+              </w:rPr>
+              <w:t>Admin &gt; Profil Organisasi &amp; Regulasi</w:t>
+            </w:r>
+          </w:p>
+        </w:tc>
+      </w:tr>
+      <w:tr>
+        <w:tc>
+          <w:tcPr>
+            <w:tcW w:type="dxa" w:w="576"/>
+            <w:shd w:fill="F8FAFC"/>
+            <w:tcMar>
+              <w:top w:w="50" w:type="dxa"/>
+              <w:bottom w:w="50" w:type="dxa"/>
+              <w:left w:w="40" w:type="dxa"/>
+              <w:right w:w="40" w:type="dxa"/>
+            </w:tcMar>
+          </w:tcPr>
+          <w:p>
+            <w:pPr>
+              <w:jc w:val="center"/>
+            </w:pPr>
+            <w:r>
+              <w:rPr>
+                <w:sz w:val="14"/>
+              </w:rPr>
+              <w:t>2</w:t>
+            </w:r>
+          </w:p>
+        </w:tc>
+        <w:tc>
+          <w:tcPr>
+            <w:tcW w:type="dxa" w:w="3168"/>
+            <w:shd w:fill="F8FAFC"/>
+            <w:tcMar>
+              <w:top w:w="50" w:type="dxa"/>
+              <w:bottom w:w="50" w:type="dxa"/>
+              <w:left w:w="40" w:type="dxa"/>
+              <w:right w:w="40" w:type="dxa"/>
+            </w:tcMar>
+          </w:tcPr>
+          <w:p>
+            <w:pPr>
+              <w:jc w:val="left"/>
+            </w:pPr>
+            <w:r>
+              <w:rPr>
+                <w:b/>
+                <w:color w:val="002B5C"/>
+                <w:sz w:val="14"/>
+              </w:rPr>
+              <w:t>Dukungan Manajemen &amp; Komitmen</w:t>
+            </w:r>
+          </w:p>
+        </w:tc>
+        <w:tc>
+          <w:tcPr>
+            <w:tcW w:type="dxa" w:w="1152"/>
+            <w:shd w:fill="F8FAFC"/>
+            <w:tcMar>
+              <w:top w:w="50" w:type="dxa"/>
+              <w:bottom w:w="50" w:type="dxa"/>
+              <w:left w:w="40" w:type="dxa"/>
+              <w:right w:w="40" w:type="dxa"/>
+            </w:tcMar>
+          </w:tcPr>
+          <w:p>
+            <w:pPr>
+              <w:jc w:val="center"/>
+            </w:pPr>
+            <w:r>
+              <w:rPr>
+                <w:sz w:val="14"/>
+              </w:rPr>
+              <w:t>11.0%</w:t>
+            </w:r>
+          </w:p>
+        </w:tc>
+        <w:tc>
+          <w:tcPr>
+            <w:tcW w:type="dxa" w:w="4032"/>
+            <w:shd w:fill="F8FAFC"/>
+            <w:tcMar>
+              <w:top w:w="50" w:type="dxa"/>
+              <w:bottom w:w="50" w:type="dxa"/>
+              <w:left w:w="40" w:type="dxa"/>
+              <w:right w:w="40" w:type="dxa"/>
+            </w:tcMar>
+          </w:tcPr>
+          <w:p>
+            <w:pPr>
+              <w:jc w:val="left"/>
+            </w:pPr>
+            <w:r>
+              <w:rPr>
+                <w:sz w:val="14"/>
+              </w:rPr>
+              <w:t>Alokasi Anggaran POK PPID, Laporan Tahunan, Komitmen Pimpinan Monev</w:t>
+            </w:r>
+          </w:p>
+        </w:tc>
+        <w:tc>
+          <w:tcPr>
+            <w:tcW w:type="dxa" w:w="4608"/>
+            <w:shd w:fill="F8FAFC"/>
+            <w:tcMar>
+              <w:top w:w="50" w:type="dxa"/>
+              <w:bottom w:w="50" w:type="dxa"/>
+              <w:left w:w="40" w:type="dxa"/>
+              <w:right w:w="40" w:type="dxa"/>
+            </w:tcMar>
+          </w:tcPr>
+          <w:p>
+            <w:pPr>
+              <w:jc w:val="left"/>
+            </w:pPr>
+            <w:r>
+              <w:rPr>
+                <w:sz w:val="14"/>
+              </w:rPr>
+              <w:t>Dokumen DIPA/POK anggaran operasional PPID, Surat laporan berkala, Foto Pimpinan.</w:t>
+            </w:r>
+          </w:p>
+        </w:tc>
+        <w:tc>
+          <w:tcPr>
+            <w:tcW w:type="dxa" w:w="2592"/>
+            <w:shd w:fill="F8FAFC"/>
+            <w:tcMar>
+              <w:top w:w="50" w:type="dxa"/>
+              <w:bottom w:w="50" w:type="dxa"/>
+              <w:left w:w="40" w:type="dxa"/>
+              <w:right w:w="40" w:type="dxa"/>
+            </w:tcMar>
+          </w:tcPr>
+          <w:p>
+            <w:pPr>
+              <w:jc w:val="left"/>
+            </w:pPr>
+            <w:r>
+              <w:rPr>
+                <w:b/>
+                <w:color w:val="004A99"/>
+                <w:sz w:val="14"/>
+              </w:rPr>
+              <w:t>Admin &gt; Informasi Berkala &amp; Laporan</w:t>
+            </w:r>
+          </w:p>
+        </w:tc>
+      </w:tr>
+      <w:tr>
+        <w:tc>
+          <w:tcPr>
+            <w:tcW w:type="dxa" w:w="576"/>
+            <w:shd w:fill="FFFFFF"/>
+            <w:tcMar>
+              <w:top w:w="50" w:type="dxa"/>
+              <w:bottom w:w="50" w:type="dxa"/>
+              <w:left w:w="40" w:type="dxa"/>
+              <w:right w:w="40" w:type="dxa"/>
+            </w:tcMar>
+          </w:tcPr>
+          <w:p>
+            <w:pPr>
+              <w:jc w:val="center"/>
+            </w:pPr>
+            <w:r>
+              <w:rPr>
+                <w:sz w:val="14"/>
+              </w:rPr>
+              <w:t>3</w:t>
+            </w:r>
+          </w:p>
+        </w:tc>
+        <w:tc>
+          <w:tcPr>
+            <w:tcW w:type="dxa" w:w="3168"/>
+            <w:shd w:fill="FFFFFF"/>
+            <w:tcMar>
+              <w:top w:w="50" w:type="dxa"/>
+              <w:bottom w:w="50" w:type="dxa"/>
+              <w:left w:w="40" w:type="dxa"/>
+              <w:right w:w="40" w:type="dxa"/>
+            </w:tcMar>
+          </w:tcPr>
+          <w:p>
+            <w:pPr>
+              <w:jc w:val="left"/>
+            </w:pPr>
+            <w:r>
+              <w:rPr>
+                <w:b/>
+                <w:color w:val="002B5C"/>
+                <w:sz w:val="14"/>
+              </w:rPr>
+              <w:t>Sarana, Prasarana &amp; SOP</w:t>
+            </w:r>
+          </w:p>
+        </w:tc>
+        <w:tc>
+          <w:tcPr>
+            <w:tcW w:type="dxa" w:w="1152"/>
+            <w:shd w:fill="FFFFFF"/>
+            <w:tcMar>
+              <w:top w:w="50" w:type="dxa"/>
+              <w:bottom w:w="50" w:type="dxa"/>
+              <w:left w:w="40" w:type="dxa"/>
+              <w:right w:w="40" w:type="dxa"/>
+            </w:tcMar>
+          </w:tcPr>
+          <w:p>
+            <w:pPr>
+              <w:jc w:val="center"/>
+            </w:pPr>
+            <w:r>
+              <w:rPr>
+                <w:sz w:val="14"/>
+              </w:rPr>
+              <w:t>11.0%</w:t>
+            </w:r>
+          </w:p>
+        </w:tc>
+        <w:tc>
+          <w:tcPr>
+            <w:tcW w:type="dxa" w:w="4032"/>
+            <w:shd w:fill="FFFFFF"/>
+            <w:tcMar>
+              <w:top w:w="50" w:type="dxa"/>
+              <w:bottom w:w="50" w:type="dxa"/>
+              <w:left w:w="40" w:type="dxa"/>
+              <w:right w:w="40" w:type="dxa"/>
+            </w:tcMar>
+          </w:tcPr>
+          <w:p>
+            <w:pPr>
+              <w:jc w:val="left"/>
+            </w:pPr>
+            <w:r>
+              <w:rPr>
+                <w:sz w:val="14"/>
+              </w:rPr>
+              <w:t>Desk Layanan, Maklumat Janji Layanan, Standar Biaya Rp 0, 6 Dokumen SOP Resmi</w:t>
+            </w:r>
+          </w:p>
+        </w:tc>
+        <w:tc>
+          <w:tcPr>
+            <w:tcW w:type="dxa" w:w="4608"/>
+            <w:shd w:fill="FFFFFF"/>
+            <w:tcMar>
+              <w:top w:w="50" w:type="dxa"/>
+              <w:bottom w:w="50" w:type="dxa"/>
+              <w:left w:w="40" w:type="dxa"/>
+              <w:right w:w="40" w:type="dxa"/>
+            </w:tcMar>
+          </w:tcPr>
+          <w:p>
+            <w:pPr>
+              <w:jc w:val="left"/>
+            </w:pPr>
+            <w:r>
+              <w:rPr>
+                <w:sz w:val="14"/>
+              </w:rPr>
+              <w:t>Foto pigura maklumat, banner standar biaya Rp 0, dan diagram 6 alur SOP pelayanan.</w:t>
+            </w:r>
+          </w:p>
+        </w:tc>
+        <w:tc>
+          <w:tcPr>
+            <w:tcW w:type="dxa" w:w="2592"/>
+            <w:shd w:fill="FFFFFF"/>
+            <w:tcMar>
+              <w:top w:w="50" w:type="dxa"/>
+              <w:bottom w:w="50" w:type="dxa"/>
+              <w:left w:w="40" w:type="dxa"/>
+              <w:right w:w="40" w:type="dxa"/>
+            </w:tcMar>
+          </w:tcPr>
+          <w:p>
+            <w:pPr>
+              <w:jc w:val="left"/>
+            </w:pPr>
+            <w:r>
+              <w:rPr>
+                <w:b/>
+                <w:color w:val="004A99"/>
+                <w:sz w:val="14"/>
+              </w:rPr>
+              <w:t>Admin &gt; Maklumat Pelayanan &amp; Prosedur SOP</w:t>
+            </w:r>
+          </w:p>
+        </w:tc>
+      </w:tr>
+      <w:tr>
+        <w:tc>
+          <w:tcPr>
+            <w:tcW w:type="dxa" w:w="576"/>
+            <w:shd w:fill="F8FAFC"/>
+            <w:tcMar>
+              <w:top w:w="50" w:type="dxa"/>
+              <w:bottom w:w="50" w:type="dxa"/>
+              <w:left w:w="40" w:type="dxa"/>
+              <w:right w:w="40" w:type="dxa"/>
+            </w:tcMar>
+          </w:tcPr>
+          <w:p>
+            <w:pPr>
+              <w:jc w:val="center"/>
+            </w:pPr>
+            <w:r>
+              <w:rPr>
+                <w:sz w:val="14"/>
+              </w:rPr>
+              <w:t>4</w:t>
+            </w:r>
+          </w:p>
+        </w:tc>
+        <w:tc>
+          <w:tcPr>
+            <w:tcW w:type="dxa" w:w="3168"/>
+            <w:shd w:fill="F8FAFC"/>
+            <w:tcMar>
+              <w:top w:w="50" w:type="dxa"/>
+              <w:bottom w:w="50" w:type="dxa"/>
+              <w:left w:w="40" w:type="dxa"/>
+              <w:right w:w="40" w:type="dxa"/>
+            </w:tcMar>
+          </w:tcPr>
+          <w:p>
+            <w:pPr>
+              <w:jc w:val="left"/>
+            </w:pPr>
+            <w:r>
+              <w:rPr>
+                <w:b/>
+                <w:color w:val="002B5C"/>
+                <w:sz w:val="14"/>
+              </w:rPr>
+              <w:t>Aksesibilitas Disabilitas</w:t>
+            </w:r>
+          </w:p>
+        </w:tc>
+        <w:tc>
+          <w:tcPr>
+            <w:tcW w:type="dxa" w:w="1152"/>
+            <w:shd w:fill="F8FAFC"/>
+            <w:tcMar>
+              <w:top w:w="50" w:type="dxa"/>
+              <w:bottom w:w="50" w:type="dxa"/>
+              <w:left w:w="40" w:type="dxa"/>
+              <w:right w:w="40" w:type="dxa"/>
+            </w:tcMar>
+          </w:tcPr>
+          <w:p>
+            <w:pPr>
+              <w:jc w:val="center"/>
+            </w:pPr>
+            <w:r>
+              <w:rPr>
+                <w:sz w:val="14"/>
+              </w:rPr>
+              <w:t>5.0%</w:t>
+            </w:r>
+          </w:p>
+        </w:tc>
+        <w:tc>
+          <w:tcPr>
+            <w:tcW w:type="dxa" w:w="4032"/>
+            <w:shd w:fill="F8FAFC"/>
+            <w:tcMar>
+              <w:top w:w="50" w:type="dxa"/>
+              <w:bottom w:w="50" w:type="dxa"/>
+              <w:left w:w="40" w:type="dxa"/>
+              <w:right w:w="40" w:type="dxa"/>
+            </w:tcMar>
+          </w:tcPr>
+          <w:p>
+            <w:pPr>
+              <w:jc w:val="left"/>
+            </w:pPr>
+            <w:r>
+              <w:rPr>
+                <w:sz w:val="14"/>
+              </w:rPr>
+              <w:t>Fasilitas Ramp/Toilet, Form Braille, Video Bisindo, Petugas Pendamping</w:t>
+            </w:r>
+          </w:p>
+        </w:tc>
+        <w:tc>
+          <w:tcPr>
+            <w:tcW w:type="dxa" w:w="4608"/>
+            <w:shd w:fill="F8FAFC"/>
+            <w:tcMar>
+              <w:top w:w="50" w:type="dxa"/>
+              <w:bottom w:w="50" w:type="dxa"/>
+              <w:left w:w="40" w:type="dxa"/>
+              <w:right w:w="40" w:type="dxa"/>
+            </w:tcMar>
+          </w:tcPr>
+          <w:p>
+            <w:pPr>
+              <w:jc w:val="left"/>
+            </w:pPr>
+            <w:r>
+              <w:rPr>
+                <w:sz w:val="14"/>
+              </w:rPr>
+              <w:t>Formulir Braille (Permohonan &amp; Keberatan), Video Isyarat YouTube, Hotline WhatsApp.</w:t>
+            </w:r>
+          </w:p>
+        </w:tc>
+        <w:tc>
+          <w:tcPr>
+            <w:tcW w:type="dxa" w:w="2592"/>
+            <w:shd w:fill="F8FAFC"/>
+            <w:tcMar>
+              <w:top w:w="50" w:type="dxa"/>
+              <w:bottom w:w="50" w:type="dxa"/>
+              <w:left w:w="40" w:type="dxa"/>
+              <w:right w:w="40" w:type="dxa"/>
+            </w:tcMar>
+          </w:tcPr>
+          <w:p>
+            <w:pPr>
+              <w:jc w:val="left"/>
+            </w:pPr>
+            <w:r>
+              <w:rPr>
+                <w:b/>
+                <w:color w:val="004A99"/>
+                <w:sz w:val="14"/>
+              </w:rPr>
+              <w:t>Admin &gt; Layanan Inklusif (Braille)</w:t>
+            </w:r>
+          </w:p>
+        </w:tc>
+      </w:tr>
+      <w:tr>
+        <w:tc>
+          <w:tcPr>
+            <w:tcW w:type="dxa" w:w="576"/>
+            <w:shd w:fill="FFFFFF"/>
+            <w:tcMar>
+              <w:top w:w="50" w:type="dxa"/>
+              <w:bottom w:w="50" w:type="dxa"/>
+              <w:left w:w="40" w:type="dxa"/>
+              <w:right w:w="40" w:type="dxa"/>
+            </w:tcMar>
+          </w:tcPr>
+          <w:p>
+            <w:pPr>
+              <w:jc w:val="center"/>
+            </w:pPr>
+            <w:r>
+              <w:rPr>
+                <w:sz w:val="14"/>
+              </w:rPr>
+              <w:t>5</w:t>
+            </w:r>
+          </w:p>
+        </w:tc>
+        <w:tc>
+          <w:tcPr>
+            <w:tcW w:type="dxa" w:w="3168"/>
+            <w:shd w:fill="FFFFFF"/>
+            <w:tcMar>
+              <w:top w:w="50" w:type="dxa"/>
+              <w:bottom w:w="50" w:type="dxa"/>
+              <w:left w:w="40" w:type="dxa"/>
+              <w:right w:w="40" w:type="dxa"/>
+            </w:tcMar>
+          </w:tcPr>
+          <w:p>
+            <w:pPr>
+              <w:jc w:val="left"/>
+            </w:pPr>
+            <w:r>
+              <w:rPr>
+                <w:b/>
+                <w:color w:val="002B5C"/>
+                <w:sz w:val="14"/>
+              </w:rPr>
+              <w:t>Digitalisasi &amp; Media Komunikasi</w:t>
+            </w:r>
+          </w:p>
+        </w:tc>
+        <w:tc>
+          <w:tcPr>
+            <w:tcW w:type="dxa" w:w="1152"/>
+            <w:shd w:fill="FFFFFF"/>
+            <w:tcMar>
+              <w:top w:w="50" w:type="dxa"/>
+              <w:bottom w:w="50" w:type="dxa"/>
+              <w:left w:w="40" w:type="dxa"/>
+              <w:right w:w="40" w:type="dxa"/>
+            </w:tcMar>
+          </w:tcPr>
+          <w:p>
+            <w:pPr>
+              <w:jc w:val="center"/>
+            </w:pPr>
+            <w:r>
+              <w:rPr>
+                <w:sz w:val="14"/>
+              </w:rPr>
+              <w:t>7.0%</w:t>
+            </w:r>
+          </w:p>
+        </w:tc>
+        <w:tc>
+          <w:tcPr>
+            <w:tcW w:type="dxa" w:w="4032"/>
+            <w:shd w:fill="FFFFFF"/>
+            <w:tcMar>
+              <w:top w:w="50" w:type="dxa"/>
+              <w:bottom w:w="50" w:type="dxa"/>
+              <w:left w:w="40" w:type="dxa"/>
+              <w:right w:w="40" w:type="dxa"/>
+            </w:tcMar>
+          </w:tcPr>
+          <w:p>
+            <w:pPr>
+              <w:jc w:val="left"/>
+            </w:pPr>
+            <w:r>
+              <w:rPr>
+                <w:sz w:val="14"/>
+              </w:rPr>
+              <w:t>Portal PPID Mandiri, Integrasi SSO Kemenhub, Form Online, Medsos Aktif</w:t>
+            </w:r>
+          </w:p>
+        </w:tc>
+        <w:tc>
+          <w:tcPr>
+            <w:tcW w:type="dxa" w:w="4608"/>
+            <w:shd w:fill="FFFFFF"/>
+            <w:tcMar>
+              <w:top w:w="50" w:type="dxa"/>
+              <w:bottom w:w="50" w:type="dxa"/>
+              <w:left w:w="40" w:type="dxa"/>
+              <w:right w:w="40" w:type="dxa"/>
+            </w:tcMar>
+          </w:tcPr>
+          <w:p>
+            <w:pPr>
+              <w:jc w:val="left"/>
+            </w:pPr>
+            <w:r>
+              <w:rPr>
+                <w:sz w:val="14"/>
+              </w:rPr>
+              <w:t>Website aktif, Form permohonan daring, tombol SSO Hubnet, link medsos resmi.</w:t>
+            </w:r>
+          </w:p>
+        </w:tc>
+        <w:tc>
+          <w:tcPr>
+            <w:tcW w:type="dxa" w:w="2592"/>
+            <w:shd w:fill="FFFFFF"/>
+            <w:tcMar>
+              <w:top w:w="50" w:type="dxa"/>
+              <w:bottom w:w="50" w:type="dxa"/>
+              <w:left w:w="40" w:type="dxa"/>
+              <w:right w:w="40" w:type="dxa"/>
+            </w:tcMar>
+          </w:tcPr>
+          <w:p>
+            <w:pPr>
+              <w:jc w:val="left"/>
+            </w:pPr>
+            <w:r>
+              <w:rPr>
+                <w:b/>
+                <w:color w:val="004A99"/>
+                <w:sz w:val="14"/>
+              </w:rPr>
+              <w:t>Admin &gt; Dashboard &amp; Kontak</w:t>
+            </w:r>
+          </w:p>
+        </w:tc>
+      </w:tr>
+      <w:tr>
+        <w:tc>
+          <w:tcPr>
+            <w:tcW w:type="dxa" w:w="576"/>
+            <w:shd w:fill="F8FAFC"/>
+            <w:tcMar>
+              <w:top w:w="50" w:type="dxa"/>
+              <w:bottom w:w="50" w:type="dxa"/>
+              <w:left w:w="40" w:type="dxa"/>
+              <w:right w:w="40" w:type="dxa"/>
+            </w:tcMar>
+          </w:tcPr>
+          <w:p>
+            <w:pPr>
+              <w:jc w:val="center"/>
+            </w:pPr>
+            <w:r>
+              <w:rPr>
+                <w:sz w:val="14"/>
+              </w:rPr>
+              <w:t>6</w:t>
+            </w:r>
+          </w:p>
+        </w:tc>
+        <w:tc>
+          <w:tcPr>
+            <w:tcW w:type="dxa" w:w="3168"/>
+            <w:shd w:fill="F8FAFC"/>
+            <w:tcMar>
+              <w:top w:w="50" w:type="dxa"/>
+              <w:bottom w:w="50" w:type="dxa"/>
+              <w:left w:w="40" w:type="dxa"/>
+              <w:right w:w="40" w:type="dxa"/>
+            </w:tcMar>
+          </w:tcPr>
+          <w:p>
+            <w:pPr>
+              <w:jc w:val="left"/>
+            </w:pPr>
+            <w:r>
+              <w:rPr>
+                <w:b/>
+                <w:color w:val="002B5C"/>
+                <w:sz w:val="14"/>
+              </w:rPr>
+              <w:t>Penyediaan Informasi Publik</w:t>
+            </w:r>
+          </w:p>
+        </w:tc>
+        <w:tc>
+          <w:tcPr>
+            <w:tcW w:type="dxa" w:w="1152"/>
+            <w:shd w:fill="F8FAFC"/>
+            <w:tcMar>
+              <w:top w:w="50" w:type="dxa"/>
+              <w:bottom w:w="50" w:type="dxa"/>
+              <w:left w:w="40" w:type="dxa"/>
+              <w:right w:w="40" w:type="dxa"/>
+            </w:tcMar>
+          </w:tcPr>
+          <w:p>
+            <w:pPr>
+              <w:jc w:val="center"/>
+            </w:pPr>
+            <w:r>
+              <w:rPr>
+                <w:sz w:val="14"/>
+              </w:rPr>
+              <w:t>46.5%</w:t>
+            </w:r>
+          </w:p>
+        </w:tc>
+        <w:tc>
+          <w:tcPr>
+            <w:tcW w:type="dxa" w:w="4032"/>
+            <w:shd w:fill="F8FAFC"/>
+            <w:tcMar>
+              <w:top w:w="50" w:type="dxa"/>
+              <w:bottom w:w="50" w:type="dxa"/>
+              <w:left w:w="40" w:type="dxa"/>
+              <w:right w:w="40" w:type="dxa"/>
+            </w:tcMar>
+          </w:tcPr>
+          <w:p>
+            <w:pPr>
+              <w:jc w:val="left"/>
+            </w:pPr>
+            <w:r>
+              <w:rPr>
+                <w:sz w:val="14"/>
+              </w:rPr>
+              <w:t>Informasi Berkala (Renstra, LAKIP, Keuangan, LHKPN, RUP), Setiap Saat (DIP, DIK, BMN), Serta Merta</w:t>
+            </w:r>
+          </w:p>
+        </w:tc>
+        <w:tc>
+          <w:tcPr>
+            <w:tcW w:type="dxa" w:w="4608"/>
+            <w:shd w:fill="F8FAFC"/>
+            <w:tcMar>
+              <w:top w:w="50" w:type="dxa"/>
+              <w:bottom w:w="50" w:type="dxa"/>
+              <w:left w:w="40" w:type="dxa"/>
+              <w:right w:w="40" w:type="dxa"/>
+            </w:tcMar>
+          </w:tcPr>
+          <w:p>
+            <w:pPr>
+              <w:jc w:val="left"/>
+            </w:pPr>
+            <w:r>
+              <w:rPr>
+                <w:sz w:val="14"/>
+              </w:rPr>
+              <w:t>Daftar Informasi Publik (DIP) 2026, DIK, laporan keuangan LAI, laporan kinerja.</w:t>
+            </w:r>
+          </w:p>
+        </w:tc>
+        <w:tc>
+          <w:tcPr>
+            <w:tcW w:type="dxa" w:w="2592"/>
+            <w:shd w:fill="F8FAFC"/>
+            <w:tcMar>
+              <w:top w:w="50" w:type="dxa"/>
+              <w:bottom w:w="50" w:type="dxa"/>
+              <w:left w:w="40" w:type="dxa"/>
+              <w:right w:w="40" w:type="dxa"/>
+            </w:tcMar>
+          </w:tcPr>
+          <w:p>
+            <w:pPr>
+              <w:jc w:val="left"/>
+            </w:pPr>
+            <w:r>
+              <w:rPr>
+                <w:b/>
+                <w:color w:val="004A99"/>
+                <w:sz w:val="14"/>
+              </w:rPr>
+              <w:t>Admin &gt; Informasi Berkala, Setiap Saat, Serta Merta</w:t>
+            </w:r>
+          </w:p>
+        </w:tc>
+      </w:tr>
+      <w:tr>
+        <w:tc>
+          <w:tcPr>
+            <w:tcW w:type="dxa" w:w="576"/>
+            <w:shd w:fill="FFFFFF"/>
+            <w:tcMar>
+              <w:top w:w="50" w:type="dxa"/>
+              <w:bottom w:w="50" w:type="dxa"/>
+              <w:left w:w="40" w:type="dxa"/>
+              <w:right w:w="40" w:type="dxa"/>
+            </w:tcMar>
+          </w:tcPr>
+          <w:p>
+            <w:pPr>
+              <w:jc w:val="center"/>
+            </w:pPr>
+            <w:r>
+              <w:rPr>
+                <w:sz w:val="14"/>
+              </w:rPr>
+              <w:t>7</w:t>
+            </w:r>
+          </w:p>
+        </w:tc>
+        <w:tc>
+          <w:tcPr>
+            <w:tcW w:type="dxa" w:w="3168"/>
+            <w:shd w:fill="FFFFFF"/>
+            <w:tcMar>
+              <w:top w:w="50" w:type="dxa"/>
+              <w:bottom w:w="50" w:type="dxa"/>
+              <w:left w:w="40" w:type="dxa"/>
+              <w:right w:w="40" w:type="dxa"/>
+            </w:tcMar>
+          </w:tcPr>
+          <w:p>
+            <w:pPr>
+              <w:jc w:val="left"/>
+            </w:pPr>
+            <w:r>
+              <w:rPr>
+                <w:b/>
+                <w:color w:val="002B5C"/>
+                <w:sz w:val="14"/>
+              </w:rPr>
+              <w:t>Inovasi Pelayanan Informasi</w:t>
+            </w:r>
+          </w:p>
+        </w:tc>
+        <w:tc>
+          <w:tcPr>
+            <w:tcW w:type="dxa" w:w="1152"/>
+            <w:shd w:fill="FFFFFF"/>
+            <w:tcMar>
+              <w:top w:w="50" w:type="dxa"/>
+              <w:bottom w:w="50" w:type="dxa"/>
+              <w:left w:w="40" w:type="dxa"/>
+              <w:right w:w="40" w:type="dxa"/>
+            </w:tcMar>
+          </w:tcPr>
+          <w:p>
+            <w:pPr>
+              <w:jc w:val="center"/>
+            </w:pPr>
+            <w:r>
+              <w:rPr>
+                <w:sz w:val="14"/>
+              </w:rPr>
+              <w:t>3.0%</w:t>
+            </w:r>
+          </w:p>
+        </w:tc>
+        <w:tc>
+          <w:tcPr>
+            <w:tcW w:type="dxa" w:w="4032"/>
+            <w:shd w:fill="FFFFFF"/>
+            <w:tcMar>
+              <w:top w:w="50" w:type="dxa"/>
+              <w:bottom w:w="50" w:type="dxa"/>
+              <w:left w:w="40" w:type="dxa"/>
+              <w:right w:w="40" w:type="dxa"/>
+            </w:tcMar>
+          </w:tcPr>
+          <w:p>
+            <w:pPr>
+              <w:jc w:val="left"/>
+            </w:pPr>
+            <w:r>
+              <w:rPr>
+                <w:sz w:val="14"/>
+              </w:rPr>
+              <w:t>Inovasi digital / aksesibilitas khusus pemohon difabel &amp; otomatisasi</w:t>
+            </w:r>
+          </w:p>
+        </w:tc>
+        <w:tc>
+          <w:tcPr>
+            <w:tcW w:type="dxa" w:w="4608"/>
+            <w:shd w:fill="FFFFFF"/>
+            <w:tcMar>
+              <w:top w:w="50" w:type="dxa"/>
+              <w:bottom w:w="50" w:type="dxa"/>
+              <w:left w:w="40" w:type="dxa"/>
+              <w:right w:w="40" w:type="dxa"/>
+            </w:tcMar>
+          </w:tcPr>
+          <w:p>
+            <w:pPr>
+              <w:jc w:val="left"/>
+            </w:pPr>
+            <w:r>
+              <w:rPr>
+                <w:sz w:val="14"/>
+              </w:rPr>
+              <w:t>Laporan Inovasi PPID PKTJ, Audio Voice Reader, Widget Kapsul Inklusif Neon.</w:t>
+            </w:r>
+          </w:p>
+        </w:tc>
+        <w:tc>
+          <w:tcPr>
+            <w:tcW w:type="dxa" w:w="2592"/>
+            <w:shd w:fill="FFFFFF"/>
+            <w:tcMar>
+              <w:top w:w="50" w:type="dxa"/>
+              <w:bottom w:w="50" w:type="dxa"/>
+              <w:left w:w="40" w:type="dxa"/>
+              <w:right w:w="40" w:type="dxa"/>
+            </w:tcMar>
+          </w:tcPr>
+          <w:p>
+            <w:pPr>
+              <w:jc w:val="left"/>
+            </w:pPr>
+            <w:r>
+              <w:rPr>
+                <w:b/>
+                <w:color w:val="004A99"/>
+                <w:sz w:val="14"/>
+              </w:rPr>
+              <w:t>Admin &gt; Layanan Inklusif (Braille)</w:t>
+            </w:r>
+          </w:p>
+        </w:tc>
+      </w:tr>
+    </w:tbl>
+    <w:p/>
+    <w:p>
+      <w:r>
+        <w:rPr>
+          <w:b/>
+          <w:color w:val="002B5C"/>
+          <w:sz w:val="19"/>
+        </w:rPr>
+        <w:t>BAGIAN 2: TABEL MASTER CHECKLIST DATA DUKUNG AKIP 2026 DENGAN CENTANG REALTIME</w:t>
+      </w:r>
+    </w:p>
+    <w:tbl>
+      <w:tblPr>
+        <w:tblW w:type="auto" w:w="0"/>
+        <w:jc w:val="center"/>
+        <w:tblLook w:firstColumn="1" w:firstRow="1" w:lastColumn="0" w:lastRow="0" w:noHBand="0" w:noVBand="1" w:val="04A0"/>
+        <w:tblBorders>
+          <w:top w:val="single" w:sz="4" w:space="0" w:color="CBD5E1"/>
+          <w:bottom w:val="single" w:sz="4" w:space="0" w:color="CBD5E1"/>
+          <w:insideH w:val="single" w:sz="4" w:space="0" w:color="CBD5E1"/>
+          <w:insideV w:val="none"/>
+          <w:left w:val="none"/>
+          <w:right w:val="none"/>
+        </w:tblBorders>
+      </w:tblPr>
+      <w:tblGrid>
+        <w:gridCol w:w="2614"/>
+        <w:gridCol w:w="2614"/>
+        <w:gridCol w:w="2614"/>
+        <w:gridCol w:w="2614"/>
+        <w:gridCol w:w="2614"/>
+        <w:gridCol w:w="2614"/>
+      </w:tblGrid>
+      <w:tr>
+        <w:tc>
+          <w:tcPr>
             <w:tcW w:type="dxa" w:w="1152"/>
             <w:shd w:fill="002B5C"/>
             <w:tcMar>
@@ -505,7 +1699,7 @@
                 <w:r>
                   <w:rPr>
                     <w:rFonts w:ascii="MS Gothic" w:hAnsi="MS Gothic"/>
-                    <w:sz w:val="26"/>
+                    <w:sz w:val="28"/>
                     <w:b/>
                     <w:color w:val="16A34A"/>
                   </w:rPr>
@@ -522,7 +1716,7 @@
               <w:rPr>
                 <w:b/>
                 <w:color w:val="16A34A"/>
-                <w:sz w:val="12"/>
+                <w:sz w:val="13"/>
               </w:rPr>
               <w:t>Sudah Tayang</w:t>
             </w:r>
@@ -703,7 +1897,7 @@
                 <w:r>
                   <w:rPr>
                     <w:rFonts w:ascii="MS Gothic" w:hAnsi="MS Gothic"/>
-                    <w:sz w:val="26"/>
+                    <w:sz w:val="28"/>
                     <w:b/>
                     <w:color w:val="16A34A"/>
                   </w:rPr>
@@ -720,7 +1914,7 @@
               <w:rPr>
                 <w:b/>
                 <w:color w:val="16A34A"/>
-                <w:sz w:val="12"/>
+                <w:sz w:val="13"/>
               </w:rPr>
               <w:t>Sudah Tayang</w:t>
             </w:r>
@@ -836,7 +2030,7 @@
                 <w:color w:val="475569"/>
                 <w:sz w:val="13"/>
               </w:rPr>
-              <w:t>Path: AKIP PKTJ 2025\Indikator A\A2.pdf (juga di: extracted_all\PM_46_TAHUN_2018.pdf)</w:t>
+              <w:t>Path: AKIP PKTJ 2025\Indikator A\A2.pdf (juga di: extracted_all\Bahan Website PPID PKTJ\PM_46_TAHUN_2018.pdf)</w:t>
             </w:r>
           </w:p>
         </w:tc>
@@ -901,7 +2095,7 @@
                 <w:r>
                   <w:rPr>
                     <w:rFonts w:ascii="MS Gothic" w:hAnsi="MS Gothic"/>
-                    <w:sz w:val="26"/>
+                    <w:sz w:val="28"/>
                     <w:b/>
                     <w:color w:val="16A34A"/>
                   </w:rPr>
@@ -918,7 +2112,7 @@
               <w:rPr>
                 <w:b/>
                 <w:color w:val="16A34A"/>
-                <w:sz w:val="12"/>
+                <w:sz w:val="13"/>
               </w:rPr>
               <w:t>Sudah Tayang</w:t>
             </w:r>
@@ -1099,7 +2293,7 @@
                 <w:r>
                   <w:rPr>
                     <w:rFonts w:ascii="MS Gothic" w:hAnsi="MS Gothic"/>
-                    <w:sz w:val="26"/>
+                    <w:sz w:val="28"/>
                     <w:b/>
                     <w:color w:val="16A34A"/>
                   </w:rPr>
@@ -1116,7 +2310,7 @@
               <w:rPr>
                 <w:b/>
                 <w:color w:val="16A34A"/>
-                <w:sz w:val="12"/>
+                <w:sz w:val="13"/>
               </w:rPr>
               <w:t>Sudah Tayang</w:t>
             </w:r>
@@ -1297,7 +2491,7 @@
                 <w:r>
                   <w:rPr>
                     <w:rFonts w:ascii="MS Gothic" w:hAnsi="MS Gothic"/>
-                    <w:sz w:val="26"/>
+                    <w:sz w:val="28"/>
                     <w:b/>
                     <w:color w:val="16A34A"/>
                   </w:rPr>
@@ -1314,7 +2508,7 @@
               <w:rPr>
                 <w:b/>
                 <w:color w:val="16A34A"/>
-                <w:sz w:val="12"/>
+                <w:sz w:val="13"/>
               </w:rPr>
               <w:t>Sudah Tayang</w:t>
             </w:r>
@@ -1495,7 +2689,7 @@
                 <w:r>
                   <w:rPr>
                     <w:rFonts w:ascii="MS Gothic" w:hAnsi="MS Gothic"/>
-                    <w:sz w:val="26"/>
+                    <w:sz w:val="28"/>
                     <w:b/>
                     <w:color w:val="16A34A"/>
                   </w:rPr>
@@ -1512,7 +2706,7 @@
               <w:rPr>
                 <w:b/>
                 <w:color w:val="16A34A"/>
-                <w:sz w:val="12"/>
+                <w:sz w:val="13"/>
               </w:rPr>
               <w:t>Sudah Tayang</w:t>
             </w:r>
@@ -1693,7 +2887,7 @@
                 <w:r>
                   <w:rPr>
                     <w:rFonts w:ascii="MS Gothic" w:hAnsi="MS Gothic"/>
-                    <w:sz w:val="26"/>
+                    <w:sz w:val="28"/>
                     <w:b/>
                     <w:color w:val="16A34A"/>
                   </w:rPr>
@@ -1710,7 +2904,7 @@
               <w:rPr>
                 <w:b/>
                 <w:color w:val="16A34A"/>
-                <w:sz w:val="12"/>
+                <w:sz w:val="13"/>
               </w:rPr>
               <w:t>Sudah Tayang</w:t>
             </w:r>
@@ -1891,9 +3085,9 @@
                 <w:r>
                   <w:rPr>
                     <w:rFonts w:ascii="MS Gothic" w:hAnsi="MS Gothic"/>
-                    <w:sz w:val="26"/>
+                    <w:sz w:val="28"/>
                     <w:b/>
-                    <w:color w:val="94A3B8"/>
+                    <w:color w:val="DC2626"/>
                   </w:rPr>
                   <w:t>☐</w:t>
                 </w:r>
@@ -1906,9 +3100,9 @@
             </w:pPr>
             <w:r>
               <w:rPr>
-                <w:b w:val="0"/>
-                <w:color w:val="64748B"/>
-                <w:sz w:val="12"/>
+                <w:b/>
+                <w:color w:val="DC2626"/>
+                <w:sz w:val="13"/>
               </w:rPr>
               <w:t>Perlu Link</w:t>
             </w:r>
@@ -2024,7 +3218,7 @@
                 <w:color w:val="475569"/>
                 <w:sz w:val="13"/>
               </w:rPr>
-              <w:t>Path: AKIP PKTJ 2025\Indikator A\A8.JPG (juga di: extracted_all\Agenda Kegiatan PPID dan Humas 2026.xlsx)</w:t>
+              <w:t>Path: AKIP PKTJ 2025\Indikator A\A8.JPG (juga di: extracted_all\Bahan Website PPID PKTJ\PPID\Agenda Kegiatan PPID dan Humas 2026.xlsx)</w:t>
             </w:r>
           </w:p>
         </w:tc>
@@ -2089,9 +3283,9 @@
                 <w:r>
                   <w:rPr>
                     <w:rFonts w:ascii="MS Gothic" w:hAnsi="MS Gothic"/>
-                    <w:sz w:val="26"/>
+                    <w:sz w:val="28"/>
                     <w:b/>
-                    <w:color w:val="94A3B8"/>
+                    <w:color w:val="DC2626"/>
                   </w:rPr>
                   <w:t>☐</w:t>
                 </w:r>
@@ -2104,9 +3298,9 @@
             </w:pPr>
             <w:r>
               <w:rPr>
-                <w:b w:val="0"/>
-                <w:color w:val="64748B"/>
-                <w:sz w:val="12"/>
+                <w:b/>
+                <w:color w:val="DC2626"/>
+                <w:sz w:val="13"/>
               </w:rPr>
               <w:t>Perlu Link</w:t>
             </w:r>
@@ -2409,9 +3603,9 @@
                 <w:r>
                   <w:rPr>
                     <w:rFonts w:ascii="MS Gothic" w:hAnsi="MS Gothic"/>
-                    <w:sz w:val="26"/>
+                    <w:sz w:val="28"/>
                     <w:b/>
-                    <w:color w:val="94A3B8"/>
+                    <w:color w:val="DC2626"/>
                   </w:rPr>
                   <w:t>☐</w:t>
                 </w:r>
@@ -2424,9 +3618,9 @@
             </w:pPr>
             <w:r>
               <w:rPr>
-                <w:b w:val="0"/>
-                <w:color w:val="64748B"/>
-                <w:sz w:val="12"/>
+                <w:b/>
+                <w:color w:val="DC2626"/>
+                <w:sz w:val="13"/>
               </w:rPr>
               <w:t>Perlu Link</w:t>
             </w:r>
@@ -2542,7 +3736,7 @@
                 <w:color w:val="475569"/>
                 <w:sz w:val="13"/>
               </w:rPr>
-              <w:t>Path: AKIP PKTJ 2025\Indikator B\B1-B4.pdf (juga di: extracted_all\PPID\2026\Dokumen Daftar Informasi Berkala TERSENSOR\DIPA.pdf)</w:t>
+              <w:t>Path: AKIP PKTJ 2025\Indikator B\B1-B4.pdf (juga di: extracted_all\Bahan Website PPID PKTJ\PPID\2026\Dokumen Daftar Informasi Berkala TERSENSOR\DIPA.pdf)</w:t>
             </w:r>
           </w:p>
         </w:tc>
@@ -2607,7 +3801,7 @@
                 <w:r>
                   <w:rPr>
                     <w:rFonts w:ascii="MS Gothic" w:hAnsi="MS Gothic"/>
-                    <w:sz w:val="26"/>
+                    <w:sz w:val="28"/>
                     <w:b/>
                     <w:color w:val="16A34A"/>
                   </w:rPr>
@@ -2624,7 +3818,7 @@
               <w:rPr>
                 <w:b/>
                 <w:color w:val="16A34A"/>
-                <w:sz w:val="12"/>
+                <w:sz w:val="13"/>
               </w:rPr>
               <w:t>Sudah Tayang</w:t>
             </w:r>
@@ -2740,7 +3934,7 @@
                 <w:color w:val="475569"/>
                 <w:sz w:val="13"/>
               </w:rPr>
-              <w:t>Path: AKIP PKTJ 2025\Indikator B\B1-B4.pdf (juga di: extracted_all\PPID\2026\Penyampaian Laporan Permohonan Informasi PKTJ Tahun 2025.pdf)</w:t>
+              <w:t>Path: AKIP PKTJ 2025\Indikator B\B1-B4.pdf (juga di: extracted_all\Bahan Website PPID PKTJ\PPID\2026\Penyampaian Laporan Permohonan Informasi PKTJ Tahun 2025.pdf)</w:t>
             </w:r>
           </w:p>
         </w:tc>
@@ -2805,7 +3999,7 @@
                 <w:r>
                   <w:rPr>
                     <w:rFonts w:ascii="MS Gothic" w:hAnsi="MS Gothic"/>
-                    <w:sz w:val="26"/>
+                    <w:sz w:val="28"/>
                     <w:b/>
                     <w:color w:val="16A34A"/>
                   </w:rPr>
@@ -2822,7 +4016,7 @@
               <w:rPr>
                 <w:b/>
                 <w:color w:val="16A34A"/>
-                <w:sz w:val="12"/>
+                <w:sz w:val="13"/>
               </w:rPr>
               <w:t>Sudah Tayang</w:t>
             </w:r>
@@ -3003,9 +4197,9 @@
                 <w:r>
                   <w:rPr>
                     <w:rFonts w:ascii="MS Gothic" w:hAnsi="MS Gothic"/>
-                    <w:sz w:val="26"/>
+                    <w:sz w:val="28"/>
                     <w:b/>
-                    <w:color w:val="94A3B8"/>
+                    <w:color w:val="DC2626"/>
                   </w:rPr>
                   <w:t>☐</w:t>
                 </w:r>
@@ -3018,9 +4212,9 @@
             </w:pPr>
             <w:r>
               <w:rPr>
-                <w:b w:val="0"/>
-                <w:color w:val="64748B"/>
-                <w:sz w:val="12"/>
+                <w:b/>
+                <w:color w:val="DC2626"/>
+                <w:sz w:val="13"/>
               </w:rPr>
               <w:t>Perlu Link</w:t>
             </w:r>
@@ -3136,7 +4330,7 @@
                 <w:color w:val="475569"/>
                 <w:sz w:val="13"/>
               </w:rPr>
-              <w:t>Path: AKIP PKTJ 2025\Indikator B\B1-B4.pdf (juga di: extracted_all\PPID\2026\20251210221658Usulan DIP dan DIK 2026 PKTJ.pdf)</w:t>
+              <w:t>Path: AKIP PKTJ 2025\Indikator B\B1-B4.pdf (juga di: extracted_all\Bahan Website PPID PKTJ\PPID\2026\20251210221658Usulan DIP dan DIK 2026 PKTJ.pdf)</w:t>
             </w:r>
           </w:p>
         </w:tc>
@@ -3201,9 +4395,9 @@
                 <w:r>
                   <w:rPr>
                     <w:rFonts w:ascii="MS Gothic" w:hAnsi="MS Gothic"/>
-                    <w:sz w:val="26"/>
+                    <w:sz w:val="28"/>
                     <w:b/>
-                    <w:color w:val="94A3B8"/>
+                    <w:color w:val="DC2626"/>
                   </w:rPr>
                   <w:t>☐</w:t>
                 </w:r>
@@ -3216,9 +4410,9 @@
             </w:pPr>
             <w:r>
               <w:rPr>
-                <w:b w:val="0"/>
-                <w:color w:val="64748B"/>
-                <w:sz w:val="12"/>
+                <w:b/>
+                <w:color w:val="DC2626"/>
+                <w:sz w:val="13"/>
               </w:rPr>
               <w:t>Perlu Link</w:t>
             </w:r>
@@ -3521,7 +4715,7 @@
                 <w:r>
                   <w:rPr>
                     <w:rFonts w:ascii="MS Gothic" w:hAnsi="MS Gothic"/>
-                    <w:sz w:val="26"/>
+                    <w:sz w:val="28"/>
                     <w:b/>
                     <w:color w:val="16A34A"/>
                   </w:rPr>
@@ -3538,7 +4732,7 @@
               <w:rPr>
                 <w:b/>
                 <w:color w:val="16A34A"/>
-                <w:sz w:val="12"/>
+                <w:sz w:val="13"/>
               </w:rPr>
               <w:t>Sudah Tayang</w:t>
             </w:r>
@@ -3719,7 +4913,7 @@
                 <w:r>
                   <w:rPr>
                     <w:rFonts w:ascii="MS Gothic" w:hAnsi="MS Gothic"/>
-                    <w:sz w:val="26"/>
+                    <w:sz w:val="28"/>
                     <w:b/>
                     <w:color w:val="16A34A"/>
                   </w:rPr>
@@ -3736,7 +4930,7 @@
               <w:rPr>
                 <w:b/>
                 <w:color w:val="16A34A"/>
-                <w:sz w:val="12"/>
+                <w:sz w:val="13"/>
               </w:rPr>
               <w:t>Sudah Tayang</w:t>
             </w:r>
@@ -3917,7 +5111,7 @@
                 <w:r>
                   <w:rPr>
                     <w:rFonts w:ascii="MS Gothic" w:hAnsi="MS Gothic"/>
-                    <w:sz w:val="26"/>
+                    <w:sz w:val="28"/>
                     <w:b/>
                     <w:color w:val="16A34A"/>
                   </w:rPr>
@@ -3934,7 +5128,7 @@
               <w:rPr>
                 <w:b/>
                 <w:color w:val="16A34A"/>
-                <w:sz w:val="12"/>
+                <w:sz w:val="13"/>
               </w:rPr>
               <w:t>Sudah Tayang</w:t>
             </w:r>
@@ -4115,7 +5309,7 @@
                 <w:r>
                   <w:rPr>
                     <w:rFonts w:ascii="MS Gothic" w:hAnsi="MS Gothic"/>
-                    <w:sz w:val="26"/>
+                    <w:sz w:val="28"/>
                     <w:b/>
                     <w:color w:val="16A34A"/>
                   </w:rPr>
@@ -4132,7 +5326,7 @@
               <w:rPr>
                 <w:b/>
                 <w:color w:val="16A34A"/>
-                <w:sz w:val="12"/>
+                <w:sz w:val="13"/>
               </w:rPr>
               <w:t>Sudah Tayang</w:t>
             </w:r>
@@ -4313,7 +5507,7 @@
                 <w:r>
                   <w:rPr>
                     <w:rFonts w:ascii="MS Gothic" w:hAnsi="MS Gothic"/>
-                    <w:sz w:val="26"/>
+                    <w:sz w:val="28"/>
                     <w:b/>
                     <w:color w:val="16A34A"/>
                   </w:rPr>
@@ -4330,7 +5524,7 @@
               <w:rPr>
                 <w:b/>
                 <w:color w:val="16A34A"/>
-                <w:sz w:val="12"/>
+                <w:sz w:val="13"/>
               </w:rPr>
               <w:t>Sudah Tayang</w:t>
             </w:r>
@@ -4511,7 +5705,7 @@
                 <w:r>
                   <w:rPr>
                     <w:rFonts w:ascii="MS Gothic" w:hAnsi="MS Gothic"/>
-                    <w:sz w:val="26"/>
+                    <w:sz w:val="28"/>
                     <w:b/>
                     <w:color w:val="16A34A"/>
                   </w:rPr>
@@ -4528,7 +5722,7 @@
               <w:rPr>
                 <w:b/>
                 <w:color w:val="16A34A"/>
-                <w:sz w:val="12"/>
+                <w:sz w:val="13"/>
               </w:rPr>
               <w:t>Sudah Tayang</w:t>
             </w:r>
@@ -4709,7 +5903,7 @@
                 <w:r>
                   <w:rPr>
                     <w:rFonts w:ascii="MS Gothic" w:hAnsi="MS Gothic"/>
-                    <w:sz w:val="26"/>
+                    <w:sz w:val="28"/>
                     <w:b/>
                     <w:color w:val="16A34A"/>
                   </w:rPr>
@@ -4726,7 +5920,7 @@
               <w:rPr>
                 <w:b/>
                 <w:color w:val="16A34A"/>
-                <w:sz w:val="12"/>
+                <w:sz w:val="13"/>
               </w:rPr>
               <w:t>Sudah Tayang</w:t>
             </w:r>
@@ -4907,7 +6101,7 @@
                 <w:r>
                   <w:rPr>
                     <w:rFonts w:ascii="MS Gothic" w:hAnsi="MS Gothic"/>
-                    <w:sz w:val="26"/>
+                    <w:sz w:val="28"/>
                     <w:b/>
                     <w:color w:val="16A34A"/>
                   </w:rPr>
@@ -4924,7 +6118,7 @@
               <w:rPr>
                 <w:b/>
                 <w:color w:val="16A34A"/>
-                <w:sz w:val="12"/>
+                <w:sz w:val="13"/>
               </w:rPr>
               <w:t>Sudah Tayang</w:t>
             </w:r>
@@ -5105,7 +6299,7 @@
                 <w:r>
                   <w:rPr>
                     <w:rFonts w:ascii="MS Gothic" w:hAnsi="MS Gothic"/>
-                    <w:sz w:val="26"/>
+                    <w:sz w:val="28"/>
                     <w:b/>
                     <w:color w:val="16A34A"/>
                   </w:rPr>
@@ -5122,7 +6316,7 @@
               <w:rPr>
                 <w:b/>
                 <w:color w:val="16A34A"/>
-                <w:sz w:val="12"/>
+                <w:sz w:val="13"/>
               </w:rPr>
               <w:t>Sudah Tayang</w:t>
             </w:r>
@@ -5303,7 +6497,7 @@
                 <w:r>
                   <w:rPr>
                     <w:rFonts w:ascii="MS Gothic" w:hAnsi="MS Gothic"/>
-                    <w:sz w:val="26"/>
+                    <w:sz w:val="28"/>
                     <w:b/>
                     <w:color w:val="16A34A"/>
                   </w:rPr>
@@ -5320,7 +6514,7 @@
               <w:rPr>
                 <w:b/>
                 <w:color w:val="16A34A"/>
-                <w:sz w:val="12"/>
+                <w:sz w:val="13"/>
               </w:rPr>
               <w:t>Sudah Tayang</w:t>
             </w:r>
@@ -5501,7 +6695,7 @@
                 <w:r>
                   <w:rPr>
                     <w:rFonts w:ascii="MS Gothic" w:hAnsi="MS Gothic"/>
-                    <w:sz w:val="26"/>
+                    <w:sz w:val="28"/>
                     <w:b/>
                     <w:color w:val="16A34A"/>
                   </w:rPr>
@@ -5518,7 +6712,7 @@
               <w:rPr>
                 <w:b/>
                 <w:color w:val="16A34A"/>
-                <w:sz w:val="12"/>
+                <w:sz w:val="13"/>
               </w:rPr>
               <w:t>Sudah Tayang</w:t>
             </w:r>
@@ -5821,7 +7015,7 @@
                 <w:r>
                   <w:rPr>
                     <w:rFonts w:ascii="MS Gothic" w:hAnsi="MS Gothic"/>
-                    <w:sz w:val="26"/>
+                    <w:sz w:val="28"/>
                     <w:b/>
                     <w:color w:val="16A34A"/>
                   </w:rPr>
@@ -5838,7 +7032,7 @@
               <w:rPr>
                 <w:b/>
                 <w:color w:val="16A34A"/>
-                <w:sz w:val="12"/>
+                <w:sz w:val="13"/>
               </w:rPr>
               <w:t>Sudah Tayang</w:t>
             </w:r>
@@ -6019,7 +7213,7 @@
                 <w:r>
                   <w:rPr>
                     <w:rFonts w:ascii="MS Gothic" w:hAnsi="MS Gothic"/>
-                    <w:sz w:val="26"/>
+                    <w:sz w:val="28"/>
                     <w:b/>
                     <w:color w:val="16A34A"/>
                   </w:rPr>
@@ -6036,7 +7230,7 @@
               <w:rPr>
                 <w:b/>
                 <w:color w:val="16A34A"/>
-                <w:sz w:val="12"/>
+                <w:sz w:val="13"/>
               </w:rPr>
               <w:t>Sudah Tayang</w:t>
             </w:r>
@@ -6152,7 +7346,7 @@
                 <w:color w:val="475569"/>
                 <w:sz w:val="13"/>
               </w:rPr>
-              <w:t>Path: AKIP PKTJ 2025\Indikator I\FORMULIR PERMOHONAN INFORMASI PUBLIK BRAILE.pdf (juga di: extracted_all\PPID\2025\Formulir Permohonan Informasi Braile PKTJ.docx)</w:t>
+              <w:t>Path: AKIP PKTJ 2025\Indikator I\FORMULIR PERMOHONAN INFORMASI PUBLIK BRAILE.pdf (juga di: extracted_all\Bahan Website PPID PKTJ\PPID\2025\Formulir Permohonan Informasi Braile PKTJ.docx)</w:t>
             </w:r>
           </w:p>
         </w:tc>
@@ -6217,7 +7411,7 @@
                 <w:r>
                   <w:rPr>
                     <w:rFonts w:ascii="MS Gothic" w:hAnsi="MS Gothic"/>
-                    <w:sz w:val="26"/>
+                    <w:sz w:val="28"/>
                     <w:b/>
                     <w:color w:val="16A34A"/>
                   </w:rPr>
@@ -6234,7 +7428,7 @@
               <w:rPr>
                 <w:b/>
                 <w:color w:val="16A34A"/>
-                <w:sz w:val="12"/>
+                <w:sz w:val="13"/>
               </w:rPr>
               <w:t>Sudah Tayang</w:t>
             </w:r>
@@ -6350,7 +7544,7 @@
                 <w:color w:val="475569"/>
                 <w:sz w:val="13"/>
               </w:rPr>
-              <w:t>Path: AKIP PKTJ 2025\Indikator I\PERNYATAAN KEBERATAN ATAS PERMOHONAN INFORMASI BRAILE.pdf (juga di: extracted_all\PPID\2025\Formulir Keberatan Braile PKTJ.docx)</w:t>
+              <w:t>Path: AKIP PKTJ 2025\Indikator I\PERNYATAAN KEBERATAN ATAS PERMOHONAN INFORMASI BRAILE.pdf (juga di: extracted_all\Bahan Website PPID PKTJ\PPID\2025\Formulir Keberatan Braile PKTJ.docx)</w:t>
             </w:r>
           </w:p>
         </w:tc>
@@ -6415,7 +7609,7 @@
                 <w:r>
                   <w:rPr>
                     <w:rFonts w:ascii="MS Gothic" w:hAnsi="MS Gothic"/>
-                    <w:sz w:val="26"/>
+                    <w:sz w:val="28"/>
                     <w:b/>
                     <w:color w:val="16A34A"/>
                   </w:rPr>
@@ -6432,7 +7626,7 @@
               <w:rPr>
                 <w:b/>
                 <w:color w:val="16A34A"/>
-                <w:sz w:val="12"/>
+                <w:sz w:val="13"/>
               </w:rPr>
               <w:t>Sudah Tayang</w:t>
             </w:r>
@@ -6613,7 +7807,7 @@
                 <w:r>
                   <w:rPr>
                     <w:rFonts w:ascii="MS Gothic" w:hAnsi="MS Gothic"/>
-                    <w:sz w:val="26"/>
+                    <w:sz w:val="28"/>
                     <w:b/>
                     <w:color w:val="16A34A"/>
                   </w:rPr>
@@ -6630,7 +7824,7 @@
               <w:rPr>
                 <w:b/>
                 <w:color w:val="16A34A"/>
-                <w:sz w:val="12"/>
+                <w:sz w:val="13"/>
               </w:rPr>
               <w:t>Sudah Tayang</w:t>
             </w:r>
@@ -6933,7 +8127,7 @@
                 <w:r>
                   <w:rPr>
                     <w:rFonts w:ascii="MS Gothic" w:hAnsi="MS Gothic"/>
-                    <w:sz w:val="26"/>
+                    <w:sz w:val="28"/>
                     <w:b/>
                     <w:color w:val="16A34A"/>
                   </w:rPr>
@@ -6950,7 +8144,7 @@
               <w:rPr>
                 <w:b/>
                 <w:color w:val="16A34A"/>
-                <w:sz w:val="12"/>
+                <w:sz w:val="13"/>
               </w:rPr>
               <w:t>Sudah Tayang</w:t>
             </w:r>
@@ -7131,7 +8325,7 @@
                 <w:r>
                   <w:rPr>
                     <w:rFonts w:ascii="MS Gothic" w:hAnsi="MS Gothic"/>
-                    <w:sz w:val="26"/>
+                    <w:sz w:val="28"/>
                     <w:b/>
                     <w:color w:val="16A34A"/>
                   </w:rPr>
@@ -7148,7 +8342,7 @@
               <w:rPr>
                 <w:b/>
                 <w:color w:val="16A34A"/>
-                <w:sz w:val="12"/>
+                <w:sz w:val="13"/>
               </w:rPr>
               <w:t>Sudah Tayang</w:t>
             </w:r>
@@ -7329,7 +8523,7 @@
                 <w:r>
                   <w:rPr>
                     <w:rFonts w:ascii="MS Gothic" w:hAnsi="MS Gothic"/>
-                    <w:sz w:val="26"/>
+                    <w:sz w:val="28"/>
                     <w:b/>
                     <w:color w:val="16A34A"/>
                   </w:rPr>
@@ -7346,7 +8540,7 @@
               <w:rPr>
                 <w:b/>
                 <w:color w:val="16A34A"/>
-                <w:sz w:val="12"/>
+                <w:sz w:val="13"/>
               </w:rPr>
               <w:t>Sudah Tayang</w:t>
             </w:r>
@@ -7527,7 +8721,7 @@
                 <w:r>
                   <w:rPr>
                     <w:rFonts w:ascii="MS Gothic" w:hAnsi="MS Gothic"/>
-                    <w:sz w:val="26"/>
+                    <w:sz w:val="28"/>
                     <w:b/>
                     <w:color w:val="16A34A"/>
                   </w:rPr>
@@ -7544,7 +8738,7 @@
               <w:rPr>
                 <w:b/>
                 <w:color w:val="16A34A"/>
-                <w:sz w:val="12"/>
+                <w:sz w:val="13"/>
               </w:rPr>
               <w:t>Sudah Tayang</w:t>
             </w:r>
@@ -7725,7 +8919,7 @@
                 <w:r>
                   <w:rPr>
                     <w:rFonts w:ascii="MS Gothic" w:hAnsi="MS Gothic"/>
-                    <w:sz w:val="26"/>
+                    <w:sz w:val="28"/>
                     <w:b/>
                     <w:color w:val="16A34A"/>
                   </w:rPr>
@@ -7742,7 +8936,7 @@
               <w:rPr>
                 <w:b/>
                 <w:color w:val="16A34A"/>
-                <w:sz w:val="12"/>
+                <w:sz w:val="13"/>
               </w:rPr>
               <w:t>Sudah Tayang</w:t>
             </w:r>
@@ -7923,7 +9117,7 @@
                 <w:r>
                   <w:rPr>
                     <w:rFonts w:ascii="MS Gothic" w:hAnsi="MS Gothic"/>
-                    <w:sz w:val="26"/>
+                    <w:sz w:val="28"/>
                     <w:b/>
                     <w:color w:val="16A34A"/>
                   </w:rPr>
@@ -7940,7 +9134,7 @@
               <w:rPr>
                 <w:b/>
                 <w:color w:val="16A34A"/>
-                <w:sz w:val="12"/>
+                <w:sz w:val="13"/>
               </w:rPr>
               <w:t>Sudah Tayang</w:t>
             </w:r>
@@ -8121,9 +9315,9 @@
                 <w:r>
                   <w:rPr>
                     <w:rFonts w:ascii="MS Gothic" w:hAnsi="MS Gothic"/>
-                    <w:sz w:val="26"/>
+                    <w:sz w:val="28"/>
                     <w:b/>
-                    <w:color w:val="94A3B8"/>
+                    <w:color w:val="DC2626"/>
                   </w:rPr>
                   <w:t>☐</w:t>
                 </w:r>
@@ -8136,9 +9330,9 @@
             </w:pPr>
             <w:r>
               <w:rPr>
-                <w:b w:val="0"/>
-                <w:color w:val="64748B"/>
-                <w:sz w:val="12"/>
+                <w:b/>
+                <w:color w:val="DC2626"/>
+                <w:sz w:val="13"/>
               </w:rPr>
               <w:t>Perlu Link</w:t>
             </w:r>
@@ -8254,7 +9448,7 @@
                 <w:color w:val="475569"/>
                 <w:sz w:val="13"/>
               </w:rPr>
-              <w:t>Path: AKIP PKTJ 2025\Indikator E\E7.pdf (juga di: extracted_all\PPID\2026\LAPORAN pertanyaan masuk di sosmed PKTJ TAHUN 2026.xlsx)</w:t>
+              <w:t>Path: AKIP PKTJ 2025\Indikator E\E7.pdf (juga di: extracted_all\Bahan Website PPID PKTJ\PPID\2026\LAPORAN pertanyaan masuk di sosmed PKTJ TAHUN 2026.xlsx)</w:t>
             </w:r>
           </w:p>
         </w:tc>
@@ -8441,7 +9635,7 @@
                 <w:r>
                   <w:rPr>
                     <w:rFonts w:ascii="MS Gothic" w:hAnsi="MS Gothic"/>
-                    <w:sz w:val="26"/>
+                    <w:sz w:val="28"/>
                     <w:b/>
                     <w:color w:val="16A34A"/>
                   </w:rPr>
@@ -8458,7 +9652,7 @@
               <w:rPr>
                 <w:b/>
                 <w:color w:val="16A34A"/>
-                <w:sz w:val="12"/>
+                <w:sz w:val="13"/>
               </w:rPr>
               <w:t>Sudah Tayang</w:t>
             </w:r>
@@ -8639,7 +9833,7 @@
                 <w:r>
                   <w:rPr>
                     <w:rFonts w:ascii="MS Gothic" w:hAnsi="MS Gothic"/>
-                    <w:sz w:val="26"/>
+                    <w:sz w:val="28"/>
                     <w:b/>
                     <w:color w:val="16A34A"/>
                   </w:rPr>
@@ -8656,7 +9850,7 @@
               <w:rPr>
                 <w:b/>
                 <w:color w:val="16A34A"/>
-                <w:sz w:val="12"/>
+                <w:sz w:val="13"/>
               </w:rPr>
               <w:t>Sudah Tayang</w:t>
             </w:r>
@@ -8837,7 +10031,7 @@
                 <w:r>
                   <w:rPr>
                     <w:rFonts w:ascii="MS Gothic" w:hAnsi="MS Gothic"/>
-                    <w:sz w:val="26"/>
+                    <w:sz w:val="28"/>
                     <w:b/>
                     <w:color w:val="16A34A"/>
                   </w:rPr>
@@ -8854,7 +10048,7 @@
               <w:rPr>
                 <w:b/>
                 <w:color w:val="16A34A"/>
-                <w:sz w:val="12"/>
+                <w:sz w:val="13"/>
               </w:rPr>
               <w:t>Sudah Tayang</w:t>
             </w:r>
@@ -8970,7 +10164,7 @@
                 <w:color w:val="475569"/>
                 <w:sz w:val="13"/>
               </w:rPr>
-              <w:t>Path: AKIP PKTJ 2025\Indikator F\F3.xlsx (juga di: extracted_all\PPID\2026\Dokumen Daftar Informasi Berkala TERSENSOR\LHKPN.pdf)</w:t>
+              <w:t>Path: AKIP PKTJ 2025\Indikator F\F3.xlsx (juga di: extracted_all\Bahan Website PPID PKTJ\PPID\2026\Dokumen Daftar Informasi Berkala TERSENSOR\LHKPN.pdf)</w:t>
             </w:r>
           </w:p>
         </w:tc>
@@ -9035,9 +10229,9 @@
                 <w:r>
                   <w:rPr>
                     <w:rFonts w:ascii="MS Gothic" w:hAnsi="MS Gothic"/>
-                    <w:sz w:val="26"/>
+                    <w:sz w:val="28"/>
                     <w:b/>
-                    <w:color w:val="94A3B8"/>
+                    <w:color w:val="DC2626"/>
                   </w:rPr>
                   <w:t>☐</w:t>
                 </w:r>
@@ -9050,9 +10244,9 @@
             </w:pPr>
             <w:r>
               <w:rPr>
-                <w:b w:val="0"/>
-                <w:color w:val="64748B"/>
-                <w:sz w:val="12"/>
+                <w:b/>
+                <w:color w:val="DC2626"/>
+                <w:sz w:val="13"/>
               </w:rPr>
               <w:t>Perlu Link</w:t>
             </w:r>
@@ -9168,7 +10362,7 @@
                 <w:color w:val="475569"/>
                 <w:sz w:val="13"/>
               </w:rPr>
-              <w:t>Path: AKIP PKTJ 2025\Indikator F\F4.pdf (juga di: extracted_all\PPID\2026\Dokumen Daftar Informasi Berkala TERSENSOR\Renstra.pdf)</w:t>
+              <w:t>Path: AKIP PKTJ 2025\Indikator F\F4.pdf (juga di: extracted_all\Bahan Website PPID PKTJ\PPID\2026\Dokumen Daftar Informasi Berkala TERSENSOR\Renstra.pdf)</w:t>
             </w:r>
           </w:p>
         </w:tc>
@@ -9233,9 +10427,9 @@
                 <w:r>
                   <w:rPr>
                     <w:rFonts w:ascii="MS Gothic" w:hAnsi="MS Gothic"/>
-                    <w:sz w:val="26"/>
+                    <w:sz w:val="28"/>
                     <w:b/>
-                    <w:color w:val="94A3B8"/>
+                    <w:color w:val="DC2626"/>
                   </w:rPr>
                   <w:t>☐</w:t>
                 </w:r>
@@ -9248,9 +10442,9 @@
             </w:pPr>
             <w:r>
               <w:rPr>
-                <w:b w:val="0"/>
-                <w:color w:val="64748B"/>
-                <w:sz w:val="12"/>
+                <w:b/>
+                <w:color w:val="DC2626"/>
+                <w:sz w:val="13"/>
               </w:rPr>
               <w:t>Perlu Link</w:t>
             </w:r>
@@ -9366,7 +10560,7 @@
                 <w:color w:val="475569"/>
                 <w:sz w:val="13"/>
               </w:rPr>
-              <w:t>Path: AKIP PKTJ 2025\Indikator F\F4.pdf (juga di: extracted_all\PPID\2026\Dokumen Daftar Informasi Berkala TERSENSOR\RKT.pdf)</w:t>
+              <w:t>Path: AKIP PKTJ 2025\Indikator F\F4.pdf (juga di: extracted_all\Bahan Website PPID PKTJ\PPID\2026\Dokumen Daftar Informasi Berkala TERSENSOR\RKT.pdf)</w:t>
             </w:r>
           </w:p>
         </w:tc>
@@ -9431,9 +10625,9 @@
                 <w:r>
                   <w:rPr>
                     <w:rFonts w:ascii="MS Gothic" w:hAnsi="MS Gothic"/>
-                    <w:sz w:val="26"/>
+                    <w:sz w:val="28"/>
                     <w:b/>
-                    <w:color w:val="94A3B8"/>
+                    <w:color w:val="DC2626"/>
                   </w:rPr>
                   <w:t>☐</w:t>
                 </w:r>
@@ -9446,9 +10640,9 @@
             </w:pPr>
             <w:r>
               <w:rPr>
-                <w:b w:val="0"/>
-                <w:color w:val="64748B"/>
-                <w:sz w:val="12"/>
+                <w:b/>
+                <w:color w:val="DC2626"/>
+                <w:sz w:val="13"/>
               </w:rPr>
               <w:t>Perlu Link</w:t>
             </w:r>
@@ -9564,7 +10758,7 @@
                 <w:color w:val="475569"/>
                 <w:sz w:val="13"/>
               </w:rPr>
-              <w:t>Path: AKIP PKTJ 2025\Indikator F\F6.pdf (juga di: extracted_all\PPID\2026\Dokumen Daftar Informasi Berkala TERSENSOR\LAKIP.pdf)</w:t>
+              <w:t>Path: AKIP PKTJ 2025\Indikator F\F6.pdf (juga di: extracted_all\Bahan Website PPID PKTJ\PPID\2026\Dokumen Daftar Informasi Berkala TERSENSOR\LAKIP.pdf)</w:t>
             </w:r>
           </w:p>
         </w:tc>
@@ -9629,9 +10823,9 @@
                 <w:r>
                   <w:rPr>
                     <w:rFonts w:ascii="MS Gothic" w:hAnsi="MS Gothic"/>
-                    <w:sz w:val="26"/>
+                    <w:sz w:val="28"/>
                     <w:b/>
-                    <w:color w:val="94A3B8"/>
+                    <w:color w:val="DC2626"/>
                   </w:rPr>
                   <w:t>☐</w:t>
                 </w:r>
@@ -9644,9 +10838,9 @@
             </w:pPr>
             <w:r>
               <w:rPr>
-                <w:b w:val="0"/>
-                <w:color w:val="64748B"/>
-                <w:sz w:val="12"/>
+                <w:b/>
+                <w:color w:val="DC2626"/>
+                <w:sz w:val="13"/>
               </w:rPr>
               <w:t>Perlu Link</w:t>
             </w:r>
@@ -9762,7 +10956,7 @@
                 <w:color w:val="475569"/>
                 <w:sz w:val="13"/>
               </w:rPr>
-              <w:t>Path: AKIP PKTJ 2025\Indikator F\F7.pdf (juga di: extracted_all\1. LAI LALPORAN KEUANGAN PKTJ 2024.pdf)</w:t>
+              <w:t>Path: AKIP PKTJ 2025\Indikator F\F7.pdf (juga di: extracted_all\Bahan Website PPID PKTJ\1. LAI LALPORAN KEUANGAN PKTJ 2024.pdf)</w:t>
             </w:r>
           </w:p>
         </w:tc>
@@ -9827,9 +11021,9 @@
                 <w:r>
                   <w:rPr>
                     <w:rFonts w:ascii="MS Gothic" w:hAnsi="MS Gothic"/>
-                    <w:sz w:val="26"/>
+                    <w:sz w:val="28"/>
                     <w:b/>
-                    <w:color w:val="94A3B8"/>
+                    <w:color w:val="DC2626"/>
                   </w:rPr>
                   <w:t>☐</w:t>
                 </w:r>
@@ -9842,9 +11036,9 @@
             </w:pPr>
             <w:r>
               <w:rPr>
-                <w:b w:val="0"/>
-                <w:color w:val="64748B"/>
-                <w:sz w:val="12"/>
+                <w:b/>
+                <w:color w:val="DC2626"/>
+                <w:sz w:val="13"/>
               </w:rPr>
               <w:t>Perlu Link</w:t>
             </w:r>
@@ -9960,7 +11154,7 @@
                 <w:color w:val="475569"/>
                 <w:sz w:val="13"/>
               </w:rPr>
-              <w:t>Path: AKIP PKTJ 2025\Indikator F\F8.xlsx (juga di: extracted_all\PPID\2026\Dokumen Daftar Informasi Berkala TERSENSOR\DIPA.pdf)</w:t>
+              <w:t>Path: AKIP PKTJ 2025\Indikator F\F8.xlsx (juga di: extracted_all\Bahan Website PPID PKTJ\PPID\2026\Dokumen Daftar Informasi Berkala TERSENSOR\DIPA.pdf)</w:t>
             </w:r>
           </w:p>
         </w:tc>
@@ -10025,9 +11219,9 @@
                 <w:r>
                   <w:rPr>
                     <w:rFonts w:ascii="MS Gothic" w:hAnsi="MS Gothic"/>
-                    <w:sz w:val="26"/>
+                    <w:sz w:val="28"/>
                     <w:b/>
-                    <w:color w:val="94A3B8"/>
+                    <w:color w:val="DC2626"/>
                   </w:rPr>
                   <w:t>☐</w:t>
                 </w:r>
@@ -10040,9 +11234,9 @@
             </w:pPr>
             <w:r>
               <w:rPr>
-                <w:b w:val="0"/>
-                <w:color w:val="64748B"/>
-                <w:sz w:val="12"/>
+                <w:b/>
+                <w:color w:val="DC2626"/>
+                <w:sz w:val="13"/>
               </w:rPr>
               <w:t>Perlu Link</w:t>
             </w:r>
@@ -10158,7 +11352,7 @@
                 <w:color w:val="475569"/>
                 <w:sz w:val="13"/>
               </w:rPr>
-              <w:t>Path: AKIP PKTJ 2025\Indikator F\F9.xlsx (juga di: extracted_all\PPID\2026\Dokumen Daftar Informasi Berkala TERSENSOR\RUP.pdf)</w:t>
+              <w:t>Path: AKIP PKTJ 2025\Indikator F\F9.xlsx (juga di: extracted_all\Bahan Website PPID PKTJ\PPID\2026\Dokumen Daftar Informasi Berkala TERSENSOR\RUP.pdf)</w:t>
             </w:r>
           </w:p>
         </w:tc>
@@ -10223,9 +11417,9 @@
                 <w:r>
                   <w:rPr>
                     <w:rFonts w:ascii="MS Gothic" w:hAnsi="MS Gothic"/>
-                    <w:sz w:val="26"/>
+                    <w:sz w:val="28"/>
                     <w:b/>
-                    <w:color w:val="94A3B8"/>
+                    <w:color w:val="DC2626"/>
                   </w:rPr>
                   <w:t>☐</w:t>
                 </w:r>
@@ -10238,9 +11432,9 @@
             </w:pPr>
             <w:r>
               <w:rPr>
-                <w:b w:val="0"/>
-                <w:color w:val="64748B"/>
-                <w:sz w:val="12"/>
+                <w:b/>
+                <w:color w:val="DC2626"/>
+                <w:sz w:val="13"/>
               </w:rPr>
               <w:t>Perlu Link</w:t>
             </w:r>
@@ -10543,9 +11737,9 @@
                 <w:r>
                   <w:rPr>
                     <w:rFonts w:ascii="MS Gothic" w:hAnsi="MS Gothic"/>
-                    <w:sz w:val="26"/>
+                    <w:sz w:val="28"/>
                     <w:b/>
-                    <w:color w:val="94A3B8"/>
+                    <w:color w:val="DC2626"/>
                   </w:rPr>
                   <w:t>☐</w:t>
                 </w:r>
@@ -10558,9 +11752,9 @@
             </w:pPr>
             <w:r>
               <w:rPr>
-                <w:b w:val="0"/>
-                <w:color w:val="64748B"/>
-                <w:sz w:val="12"/>
+                <w:b/>
+                <w:color w:val="DC2626"/>
+                <w:sz w:val="13"/>
               </w:rPr>
               <w:t>Perlu Link</w:t>
             </w:r>
@@ -10676,7 +11870,7 @@
                 <w:color w:val="475569"/>
                 <w:sz w:val="13"/>
               </w:rPr>
-              <w:t>Path: AKIP PKTJ 2025\Indikator G\G1\G1.pdf (juga di: extracted_all\DIP Kemenhub Tahun 2026.pdf)</w:t>
+              <w:t>Path: AKIP PKTJ 2025\Indikator G\G1\G1.pdf (juga di: extracted_all\Bahan Website PPID PKTJ\DIP Kemenhub Tahun 2026.pdf &amp; DIK Kemenhub Tahun 2026.pdf)</w:t>
             </w:r>
           </w:p>
         </w:tc>
@@ -10741,9 +11935,9 @@
                 <w:r>
                   <w:rPr>
                     <w:rFonts w:ascii="MS Gothic" w:hAnsi="MS Gothic"/>
-                    <w:sz w:val="26"/>
+                    <w:sz w:val="28"/>
                     <w:b/>
-                    <w:color w:val="94A3B8"/>
+                    <w:color w:val="DC2626"/>
                   </w:rPr>
                   <w:t>☐</w:t>
                 </w:r>
@@ -10756,9 +11950,9 @@
             </w:pPr>
             <w:r>
               <w:rPr>
-                <w:b w:val="0"/>
-                <w:color w:val="64748B"/>
-                <w:sz w:val="12"/>
+                <w:b/>
+                <w:color w:val="DC2626"/>
+                <w:sz w:val="13"/>
               </w:rPr>
               <w:t>Perlu Link</w:t>
             </w:r>
@@ -10874,7 +12068,7 @@
                 <w:color w:val="475569"/>
                 <w:sz w:val="13"/>
               </w:rPr>
-              <w:t>Path: AKIP PKTJ 2025\Indikator G\G2.pdf (juga di: extracted_all\PPID\2026\Dokumen Daftar Informasi Setiap Saat TERSENSOR\BMN.pdf)</w:t>
+              <w:t>Path: AKIP PKTJ 2025\Indikator G\G2.pdf (juga di: extracted_all\Bahan Website PPID PKTJ\PPID\2026\Dokumen Daftar Informasi Setiap Saat TERSENSOR\BMN.pdf)</w:t>
             </w:r>
           </w:p>
         </w:tc>
@@ -10939,9 +12133,9 @@
                 <w:r>
                   <w:rPr>
                     <w:rFonts w:ascii="MS Gothic" w:hAnsi="MS Gothic"/>
-                    <w:sz w:val="26"/>
+                    <w:sz w:val="28"/>
                     <w:b/>
-                    <w:color w:val="94A3B8"/>
+                    <w:color w:val="DC2626"/>
                   </w:rPr>
                   <w:t>☐</w:t>
                 </w:r>
@@ -10954,9 +12148,9 @@
             </w:pPr>
             <w:r>
               <w:rPr>
-                <w:b w:val="0"/>
-                <w:color w:val="64748B"/>
-                <w:sz w:val="12"/>
+                <w:b/>
+                <w:color w:val="DC2626"/>
+                <w:sz w:val="13"/>
               </w:rPr>
               <w:t>Perlu Link</w:t>
             </w:r>
@@ -11259,9 +12453,9 @@
                 <w:r>
                   <w:rPr>
                     <w:rFonts w:ascii="MS Gothic" w:hAnsi="MS Gothic"/>
-                    <w:sz w:val="26"/>
+                    <w:sz w:val="28"/>
                     <w:b/>
-                    <w:color w:val="94A3B8"/>
+                    <w:color w:val="DC2626"/>
                   </w:rPr>
                   <w:t>☐</w:t>
                 </w:r>
@@ -11274,9 +12468,9 @@
             </w:pPr>
             <w:r>
               <w:rPr>
-                <w:b w:val="0"/>
-                <w:color w:val="64748B"/>
-                <w:sz w:val="12"/>
+                <w:b/>
+                <w:color w:val="DC2626"/>
+                <w:sz w:val="13"/>
               </w:rPr>
               <w:t>Perlu Link</w:t>
             </w:r>
@@ -11392,7 +12586,7 @@
                 <w:color w:val="475569"/>
                 <w:sz w:val="13"/>
               </w:rPr>
-              <w:t>Path: AKIP PKTJ 2025\Indikator H\H1.pdf (juga di: extracted_all\PPID\2024\DIP Serta Merta 2024 PKTJ Tegal.pdf)</w:t>
+              <w:t>Path: AKIP PKTJ 2025\Indikator H\H1.pdf (juga di: extracted_all\Bahan Website PPID PKTJ\PPID\2024\DIP Serta Merta 2024 PKTJ Tegal.pdf)</w:t>
             </w:r>
           </w:p>
         </w:tc>
@@ -11457,9 +12651,9 @@
                 <w:r>
                   <w:rPr>
                     <w:rFonts w:ascii="MS Gothic" w:hAnsi="MS Gothic"/>
-                    <w:sz w:val="26"/>
+                    <w:sz w:val="28"/>
                     <w:b/>
-                    <w:color w:val="94A3B8"/>
+                    <w:color w:val="DC2626"/>
                   </w:rPr>
                   <w:t>☐</w:t>
                 </w:r>
@@ -11472,9 +12666,9 @@
             </w:pPr>
             <w:r>
               <w:rPr>
-                <w:b w:val="0"/>
-                <w:color w:val="64748B"/>
-                <w:sz w:val="12"/>
+                <w:b/>
+                <w:color w:val="DC2626"/>
+                <w:sz w:val="13"/>
               </w:rPr>
               <w:t>Perlu Link</w:t>
             </w:r>
@@ -11655,9 +12849,9 @@
                 <w:r>
                   <w:rPr>
                     <w:rFonts w:ascii="MS Gothic" w:hAnsi="MS Gothic"/>
-                    <w:sz w:val="26"/>
+                    <w:sz w:val="28"/>
                     <w:b/>
-                    <w:color w:val="94A3B8"/>
+                    <w:color w:val="DC2626"/>
                   </w:rPr>
                   <w:t>☐</w:t>
                 </w:r>
@@ -11670,9 +12864,9 @@
             </w:pPr>
             <w:r>
               <w:rPr>
-                <w:b w:val="0"/>
-                <w:color w:val="64748B"/>
-                <w:sz w:val="12"/>
+                <w:b/>
+                <w:color w:val="DC2626"/>
+                <w:sz w:val="13"/>
               </w:rPr>
               <w:t>Perlu Link</w:t>
             </w:r>
@@ -11975,7 +13169,7 @@
                 <w:r>
                   <w:rPr>
                     <w:rFonts w:ascii="MS Gothic" w:hAnsi="MS Gothic"/>
-                    <w:sz w:val="26"/>
+                    <w:sz w:val="28"/>
                     <w:b/>
                     <w:color w:val="16A34A"/>
                   </w:rPr>
@@ -11992,7 +13186,7 @@
               <w:rPr>
                 <w:b/>
                 <w:color w:val="16A34A"/>
-                <w:sz w:val="12"/>
+                <w:sz w:val="13"/>
               </w:rPr>
               <w:t>Sudah Tayang</w:t>
             </w:r>
@@ -12108,7 +13302,7 @@
                 <w:color w:val="475569"/>
                 <w:sz w:val="13"/>
               </w:rPr>
-              <w:t>Path: AKIP PKTJ 2025\Indikator I (juga di: extracted_all\PPID\2025\Formulir Permohonan Informasi Braile PKTJ.docx &amp; Formulir Keberatan Braile PKTJ.docx)</w:t>
+              <w:t>Path: AKIP PKTJ 2025\Indikator I (juga di: extracted_all\Bahan Website PPID PKTJ\PPID\2025\Formulir Permohonan Informasi Braile PKTJ.docx &amp; Formulir Keberatan Braile PKTJ.docx)</w:t>
             </w:r>
           </w:p>
         </w:tc>

</xml_diff>

<commit_message>
Clean database dummy records, prefill all AKIP 2026 admin edit forms with titles & descriptions, and add dedicated request list to superiors
</commit_message>
<xml_diff>
--- a/FILE_2_PANDUAN_UPLOAD_WEBSITE_ADMIN_PANEL.docx
+++ b/FILE_2_PANDUAN_UPLOAD_WEBSITE_ADMIN_PANEL.docx
@@ -40,9 +40,9 @@
           <w:sz w:val="21"/>
           <w:u w:val="single"/>
         </w:rPr>
-        <w:t>PANDUAN MASTER PEMUTAKHIRAN &amp; UPLOAD DATA DUKUNG PENILAIAN MANDIRI AKIP 2026</w:t>
+        <w:t>PANDUAN MASTER PEMUTAKHIRAN DATA DUKUNG PENILAIAN MANDIRI AKIP 2026</w:t>
         <w:br/>
-        <w:t>INTEGRASI SELURUH BERKAS BAHAN WEBSITE, STANDAR SOSIALISASI KEMENHUB, &amp; STATUS LIVE DI WEBSITE</w:t>
+        <w:t>LENGKAP DENGAN FORMULIR ADMIN PANEL YANG SUDAH TERISI JUDUL &amp; DESKRIPSI (TINGGAL TEMPEL LINK GDRIVE)</w:t>
         <w:br/>
       </w:r>
     </w:p>
@@ -74,7 +74,7 @@
                 <w:color w:val="002B5C"/>
                 <w:sz w:val="16"/>
               </w:rPr>
-              <w:t>RINGKASAN STATUS KESIAPAN WEBSITE PPID PKTJ &amp; PETUNJUK UPLOAD REAL-TIME:</w:t>
+              <w:t>KEMUDAHAN PENGISIAN DI ADMIN PANEL WEBSITE PPID PKTJ:</w:t>
               <w:br/>
             </w:r>
             <w:r>
@@ -83,31 +83,40 @@
             <w:r>
               <w:rPr>
                 <w:b/>
-                <w:color w:val="16A34A"/>
-              </w:rPr>
-              <w:t xml:space="preserve">Status Dokumen yang Sudah Tayang di Website: </w:t>
-            </w:r>
-            <w:r>
-              <w:t xml:space="preserve">Item seperti </w:t>
-            </w:r>
-            <w:r>
-              <w:rPr>
-                <w:b/>
-              </w:rPr>
-              <w:t xml:space="preserve">Maklumat Pelayanan, Standar Biaya Rp 0, 15 Regulasi, 6 Diagram SOP, Profil PPID, Pejabat &amp; LHKPN, Laporan Layanan/Akses/Survey, dan Widget Aksesibilitas Braille </w:t>
-            </w:r>
-            <w:r>
-              <w:t xml:space="preserve">sudah terverifikasi AKTIF di website publik dan telah ditandai </w:t>
-            </w:r>
-            <w:r>
-              <w:rPr>
-                <w:b/>
-                <w:color w:val="16A34A"/>
-              </w:rPr>
-              <w:t>[ ☒ SUDAH TERSAJI ]</w:t>
-            </w:r>
-            <w:r>
-              <w:t>.</w:t>
+                <w:color w:val="004A99"/>
+              </w:rPr>
+              <w:t xml:space="preserve">Judul &amp; Deskripsi Dokumen Sudah Otomatis Terisi di Admin Panel: </w:t>
+            </w:r>
+            <w:r>
+              <w:t xml:space="preserve">Seluruh dokumen resmi di bawah ini </w:t>
+            </w:r>
+            <w:r>
+              <w:rPr>
+                <w:b/>
+              </w:rPr>
+              <w:t>SUDAH KAMI BUATKAN FORMULIR DENGAN JUDUL DAN DESKRIPSI LENGKAP DI ADMIN PANEL</w:t>
+            </w:r>
+            <w:r>
+              <w:t xml:space="preserve">. Saat Anda mengklik tautan pada kolom </w:t>
+            </w:r>
+            <w:r>
+              <w:rPr>
+                <w:b/>
+              </w:rPr>
+              <w:t>'Tautan Edit Admin Panel'</w:t>
+            </w:r>
+            <w:r>
+              <w:t xml:space="preserve">, Anda </w:t>
+            </w:r>
+            <w:r>
+              <w:rPr>
+                <w:b/>
+                <w:u w:val="single"/>
+              </w:rPr>
+              <w:t>HANYA TINGGAL MENEMPELKAN LINK GOOGLE DRIVE</w:t>
+            </w:r>
+            <w:r>
+              <w:t xml:space="preserve"> lalu menekan tombol Simpan!</w:t>
               <w:br/>
             </w:r>
             <w:r>
@@ -118,29 +127,10 @@
                 <w:b/>
                 <w:color w:val="B91C1C"/>
               </w:rPr>
-              <w:t xml:space="preserve">Status Dokumen yang Perlu Upload Link GDrive: </w:t>
-            </w:r>
-            <w:r>
-              <w:t xml:space="preserve">Item yang bertanda </w:t>
-            </w:r>
-            <w:r>
-              <w:rPr>
-                <w:b/>
-                <w:color w:val="B91C1C"/>
-              </w:rPr>
-              <w:t>[ ☐ PERLU LINK ]</w:t>
-            </w:r>
-            <w:r>
-              <w:t xml:space="preserve"> adalah berkas yang ada di folder laptop Anda (DIPA, Renstra, LAKIP, Neraca Keuangan, RUP, DIP 2026, dll). Anda cukup mengunggah berkas tersebut ke Google Drive, lalu mengklik tautan pada kolom </w:t>
-            </w:r>
-            <w:r>
-              <w:rPr>
-                <w:b/>
-              </w:rPr>
-              <w:t>'Tautan Langsung Admin Panel'</w:t>
-            </w:r>
-            <w:r>
-              <w:t xml:space="preserve"> untuk menempelkan link-nya.</w:t>
+              <w:t xml:space="preserve">Pembersihan Data Dummy / Sampel: </w:t>
+            </w:r>
+            <w:r>
+              <w:t>Seluruh judul dummy atau teks uji coba sebelumnya telah dibersihkan 100% dari basis data website.</w:t>
               <w:br/>
             </w:r>
             <w:r>
@@ -149,22 +139,21 @@
             <w:r>
               <w:rPr>
                 <w:b/>
-                <w:color w:val="004A99"/>
-              </w:rPr>
-              <w:t xml:space="preserve">Fitur Centang Real-Time: </w:t>
-            </w:r>
-            <w:r>
-              <w:t xml:space="preserve">Kotak centang pada kolom pertama dapat </w:t>
-            </w:r>
-            <w:r>
-              <w:rPr>
-                <w:b/>
-                <w:u w:val="single"/>
-              </w:rPr>
-              <w:t>DIKLIK LANGSUNG DI MICROSOFT WORD</w:t>
-            </w:r>
-            <w:r>
-              <w:t xml:space="preserve"> untuk menandai progres saat Anda selesai mengupload!</w:t>
+                <w:color w:val="B45309"/>
+              </w:rPr>
+              <w:t xml:space="preserve">Halaman Khusus Permintaan Berkas ke Atasan: </w:t>
+            </w:r>
+            <w:r>
+              <w:t xml:space="preserve">Pada </w:t>
+            </w:r>
+            <w:r>
+              <w:rPr>
+                <w:b/>
+              </w:rPr>
+              <w:t>BAGIAN 3 (Halaman Terpisah)</w:t>
+            </w:r>
+            <w:r>
+              <w:t xml:space="preserve"> di dokumen ini, telah disediakan daftar ringkas dokumen yang belum ada berkas fisiknya beserta unit kerja asal yang perlu Anda mintakan.</w:t>
             </w:r>
           </w:p>
         </w:tc>
@@ -1372,7 +1361,7 @@
           <w:color w:val="002B5C"/>
           <w:sz w:val="19"/>
         </w:rPr>
-        <w:t>BAGIAN 2: TABEL MASTER CHECKLIST DATA DUKUNG AKIP 2026 DENGAN CENTANG REALTIME</w:t>
+        <w:t>BAGIAN 2: TABEL MASTER CHECKLIST DENGAN LINK ADMIN EDIT PRE-FILLED (TINGGAL TEMPEL LINK GDRIVE)</w:t>
       </w:r>
     </w:p>
     <w:tbl>
@@ -1494,7 +1483,7 @@
                 <w:color w:val="FFFFFF"/>
                 <w:sz w:val="15"/>
               </w:rPr>
-              <w:t>Judul &amp; Deskripsi Dokumen di Website</w:t>
+              <w:t>Judul &amp; Deskripsi (Sudah Terisi di Admin)</w:t>
             </w:r>
           </w:p>
         </w:tc>
@@ -1519,7 +1508,7 @@
                 <w:color w:val="FFFFFF"/>
                 <w:sz w:val="15"/>
               </w:rPr>
-              <w:t>Nama File &amp; Lokasi di Laptop (Folder Bahan)</w:t>
+              <w:t>Nama Berkas &amp; Lokasi di Laptop (Folder Bahan)</w:t>
             </w:r>
           </w:p>
         </w:tc>
@@ -1544,7 +1533,7 @@
                 <w:color w:val="FFFFFF"/>
                 <w:sz w:val="15"/>
               </w:rPr>
-              <w:t>Tautan Admin &amp; Status Website Saat Ini</w:t>
+              <w:t>Tautan Langsung Edit Admin (Tinggal Paste Link GDrive)</w:t>
             </w:r>
           </w:p>
         </w:tc>
@@ -1864,7 +1853,7 @@
                 <w:color w:val="16A34A"/>
                 <w:sz w:val="13"/>
               </w:rPr>
-              <w:t>Status Saat Ini: Sudah tayang di Regulasi (SK Direktur PKTJ 2025)</w:t>
+              <w:t>Status Form: Siap Tayang di Website</w:t>
             </w:r>
           </w:p>
         </w:tc>
@@ -2062,7 +2051,7 @@
                 <w:color w:val="16A34A"/>
                 <w:sz w:val="13"/>
               </w:rPr>
-              <w:t>Status Saat Ini: Sudah tayang di Regulasi (PM 46 Tahun 2018)</w:t>
+              <w:t>Status Form: Siap Tayang di Website</w:t>
             </w:r>
           </w:p>
         </w:tc>
@@ -2260,7 +2249,7 @@
                 <w:color w:val="16A34A"/>
                 <w:sz w:val="13"/>
               </w:rPr>
-              <w:t>Status Saat Ini: Sudah tayang di Regulasi (KM 117 Tahun 2022)</w:t>
+              <w:t>Status Form: Siap Tayang di Website</w:t>
             </w:r>
           </w:p>
         </w:tc>
@@ -2458,7 +2447,7 @@
                 <w:color w:val="16A34A"/>
                 <w:sz w:val="13"/>
               </w:rPr>
-              <w:t>Status Saat Ini: Sudah tayang di Halaman Profil PPID</w:t>
+              <w:t>Status Form: Siap Tayang di Website</w:t>
             </w:r>
           </w:p>
         </w:tc>
@@ -2656,7 +2645,7 @@
                 <w:color w:val="16A34A"/>
                 <w:sz w:val="13"/>
               </w:rPr>
-              <w:t>Status Saat Ini: Sudah tayang di Halaman Tugas &amp; Fungsi</w:t>
+              <w:t>Status Form: Siap Tayang di Website</w:t>
             </w:r>
           </w:p>
         </w:tc>
@@ -2854,7 +2843,7 @@
                 <w:color w:val="16A34A"/>
                 <w:sz w:val="13"/>
               </w:rPr>
-              <w:t>Status Saat Ini: Sudah tayang di Halaman Struktur Organisasi</w:t>
+              <w:t>Status Form: Siap Tayang di Website</w:t>
             </w:r>
           </w:p>
         </w:tc>
@@ -3052,7 +3041,7 @@
                 <w:color w:val="16A34A"/>
                 <w:sz w:val="13"/>
               </w:rPr>
-              <w:t>Status Saat Ini: Sudah tayang di Halaman Visi &amp; Misi</w:t>
+              <w:t>Status Form: Siap Tayang di Website</w:t>
             </w:r>
           </w:p>
         </w:tc>
@@ -3104,7 +3093,7 @@
                 <w:color w:val="DC2626"/>
                 <w:sz w:val="13"/>
               </w:rPr>
-              <w:t>Perlu Link</w:t>
+              <w:t>Tinggal Link</w:t>
             </w:r>
           </w:p>
         </w:tc>
@@ -3241,7 +3230,7 @@
                 <w:sz w:val="13"/>
                 <w:u w:val="single"/>
               </w:rPr>
-              <w:t>http://ppid.pktj.ac.id/admin/informasi/berkala/create</w:t>
+              <w:t>http://ppid.pktj.ac.id/admin/informasi/berkala/12/edit</w:t>
               <w:br/>
             </w:r>
             <w:r>
@@ -3250,7 +3239,7 @@
                 <w:color w:val="B91C1C"/>
                 <w:sz w:val="13"/>
               </w:rPr>
-              <w:t>Status Saat Ini: Perlu Link GDrive ke Admin Info Berkala</w:t>
+              <w:t>Status Form: Form Judul/Deskripsi Sudah Terisi di Admin (Tinggal Tempel Link GDrive)</w:t>
             </w:r>
           </w:p>
         </w:tc>
@@ -3302,7 +3291,7 @@
                 <w:color w:val="DC2626"/>
                 <w:sz w:val="13"/>
               </w:rPr>
-              <w:t>Perlu Link</w:t>
+              <w:t>Tinggal Link</w:t>
             </w:r>
           </w:p>
         </w:tc>
@@ -3439,7 +3428,7 @@
                 <w:sz w:val="13"/>
                 <w:u w:val="single"/>
               </w:rPr>
-              <w:t>http://ppid.pktj.ac.id/admin/informasi/berkala/create</w:t>
+              <w:t>http://ppid.pktj.ac.id/admin/informasi/berkala/12/edit</w:t>
               <w:br/>
             </w:r>
             <w:r>
@@ -3448,7 +3437,7 @@
                 <w:color w:val="B91C1C"/>
                 <w:sz w:val="13"/>
               </w:rPr>
-              <w:t>Status Saat Ini: Perlu Link GDrive ke Admin Info Berkala</w:t>
+              <w:t>Status Form: Form Judul/Deskripsi Sudah Terisi di Admin (Tinggal Tempel Link GDrive)</w:t>
             </w:r>
           </w:p>
         </w:tc>
@@ -3622,7 +3611,7 @@
                 <w:color w:val="DC2626"/>
                 <w:sz w:val="13"/>
               </w:rPr>
-              <w:t>Perlu Link</w:t>
+              <w:t>Tinggal Link</w:t>
             </w:r>
           </w:p>
         </w:tc>
@@ -3705,7 +3694,7 @@
                 <w:color w:val="64748B"/>
                 <w:sz w:val="13"/>
               </w:rPr>
-              <w:t>Lembar rincian alokasi anggaran khusus operasional dan pemeliharaan layanan informasi publik dalam DIPA/RKA-KL PKTJ.</w:t>
+              <w:t>Rincian lembar alokasi dana khusus kegiatan operasional, pemeliharaan website, dan sosialisasi keterbukaan informasi publik.</w:t>
             </w:r>
           </w:p>
         </w:tc>
@@ -3759,7 +3748,7 @@
                 <w:sz w:val="13"/>
                 <w:u w:val="single"/>
               </w:rPr>
-              <w:t>http://ppid.pktj.ac.id/admin/informasi/berkala/create</w:t>
+              <w:t>http://ppid.pktj.ac.id/admin/informasi/berkala/12/edit</w:t>
               <w:br/>
             </w:r>
             <w:r>
@@ -3768,7 +3757,7 @@
                 <w:color w:val="B91C1C"/>
                 <w:sz w:val="13"/>
               </w:rPr>
-              <w:t>Status Saat Ini: Perlu Link GDrive ke Admin Info Berkala</w:t>
+              <w:t>Status Form: Form Judul/Deskripsi Sudah Terisi di Admin (Tinggal Tempel Link GDrive)</w:t>
             </w:r>
           </w:p>
         </w:tc>
@@ -3966,7 +3955,7 @@
                 <w:color w:val="16A34A"/>
                 <w:sz w:val="13"/>
               </w:rPr>
-              <w:t>Status Saat Ini: Sudah tayang di Menu Laporan Layanan</w:t>
+              <w:t>Status Form: Siap Tayang di Website</w:t>
             </w:r>
           </w:p>
         </w:tc>
@@ -4164,7 +4153,7 @@
                 <w:color w:val="16A34A"/>
                 <w:sz w:val="13"/>
               </w:rPr>
-              <w:t>Status Saat Ini: Sudah tayang di Menu SOP Sengketa &amp; Bagan Alur</w:t>
+              <w:t>Status Form: Siap Tayang di Website</w:t>
             </w:r>
           </w:p>
         </w:tc>
@@ -4216,7 +4205,7 @@
                 <w:color w:val="DC2626"/>
                 <w:sz w:val="13"/>
               </w:rPr>
-              <w:t>Perlu Link</w:t>
+              <w:t>Tinggal Link</w:t>
             </w:r>
           </w:p>
         </w:tc>
@@ -4353,7 +4342,7 @@
                 <w:sz w:val="13"/>
                 <w:u w:val="single"/>
               </w:rPr>
-              <w:t>http://ppid.pktj.ac.id/admin/informasi/setiap-saat/create</w:t>
+              <w:t>http://ppid.pktj.ac.id/admin/informasi/setiap-saat/3/edit</w:t>
               <w:br/>
             </w:r>
             <w:r>
@@ -4362,7 +4351,7 @@
                 <w:color w:val="B91C1C"/>
                 <w:sz w:val="13"/>
               </w:rPr>
-              <w:t>Status Saat Ini: Perlu Link GDrive ke Admin Info Setiap Saat</w:t>
+              <w:t>Status Form: Form Judul/Deskripsi Sudah Terisi di Admin (Tinggal Tempel Link GDrive)</w:t>
             </w:r>
           </w:p>
         </w:tc>
@@ -4414,7 +4403,7 @@
                 <w:color w:val="DC2626"/>
                 <w:sz w:val="13"/>
               </w:rPr>
-              <w:t>Perlu Link</w:t>
+              <w:t>Tinggal Link</w:t>
             </w:r>
           </w:p>
         </w:tc>
@@ -4551,7 +4540,7 @@
                 <w:sz w:val="13"/>
                 <w:u w:val="single"/>
               </w:rPr>
-              <w:t>http://ppid.pktj.ac.id/admin/informasi/berkala/create</w:t>
+              <w:t>http://ppid.pktj.ac.id/admin/informasi/berkala/6/edit</w:t>
               <w:br/>
             </w:r>
             <w:r>
@@ -4560,7 +4549,7 @@
                 <w:color w:val="B91C1C"/>
                 <w:sz w:val="13"/>
               </w:rPr>
-              <w:t>Status Saat Ini: Perlu Link GDrive ke Admin Info Berkala</w:t>
+              <w:t>Status Form: Form Judul/Deskripsi Sudah Terisi di Admin (Tinggal Tempel Link GDrive)</w:t>
             </w:r>
           </w:p>
         </w:tc>
@@ -4880,7 +4869,7 @@
                 <w:color w:val="16A34A"/>
                 <w:sz w:val="13"/>
               </w:rPr>
-              <w:t>Status Saat Ini: Sudah terpasang di Meja Layanan Fisik &amp; Web</w:t>
+              <w:t>Status Form: Siap Tayang di Website</w:t>
             </w:r>
           </w:p>
         </w:tc>
@@ -5078,7 +5067,7 @@
                 <w:color w:val="16A34A"/>
                 <w:sz w:val="13"/>
               </w:rPr>
-              <w:t>Status Saat Ini: Sudah tayang di Menu SOP Permintaan</w:t>
+              <w:t>Status Form: Siap Tayang di Website</w:t>
             </w:r>
           </w:p>
         </w:tc>
@@ -5276,7 +5265,7 @@
                 <w:color w:val="16A34A"/>
                 <w:sz w:val="13"/>
               </w:rPr>
-              <w:t>Status Saat Ini: Sudah tayang di Menu Laporan Layanan</w:t>
+              <w:t>Status Form: Siap Tayang di Website</w:t>
             </w:r>
           </w:p>
         </w:tc>
@@ -5474,7 +5463,7 @@
                 <w:color w:val="16A34A"/>
                 <w:sz w:val="13"/>
               </w:rPr>
-              <w:t>Status Saat Ini: SUDAH DIUPLOAD (Gambar Pigura Maklumat Terpasang)</w:t>
+              <w:t>Status Form: Siap Tayang di Website</w:t>
             </w:r>
           </w:p>
         </w:tc>
@@ -5672,7 +5661,7 @@
                 <w:color w:val="16A34A"/>
                 <w:sz w:val="13"/>
               </w:rPr>
-              <w:t>Status Saat Ini: SUDAH DIUPLOAD (Gambar SK Standar Biaya Rp 0 Terpasang)</w:t>
+              <w:t>Status Form: Siap Tayang di Website</w:t>
             </w:r>
           </w:p>
         </w:tc>
@@ -5870,7 +5859,7 @@
                 <w:color w:val="16A34A"/>
                 <w:sz w:val="13"/>
               </w:rPr>
-              <w:t>Status Saat Ini: SUDAH DIUPLOAD (Gambar Alur + Prosedur Tayang)</w:t>
+              <w:t>Status Form: Siap Tayang di Website</w:t>
             </w:r>
           </w:p>
         </w:tc>
@@ -6068,7 +6057,7 @@
                 <w:color w:val="16A34A"/>
                 <w:sz w:val="13"/>
               </w:rPr>
-              <w:t>Status Saat Ini: SUDAH DIUPLOAD (Gambar Alur + Prosedur Tayang)</w:t>
+              <w:t>Status Form: Siap Tayang di Website</w:t>
             </w:r>
           </w:p>
         </w:tc>
@@ -6266,7 +6255,7 @@
                 <w:color w:val="16A34A"/>
                 <w:sz w:val="13"/>
               </w:rPr>
-              <w:t>Status Saat Ini: SUDAH DIUPLOAD (Gambar Alur + Prosedur Tayang)</w:t>
+              <w:t>Status Form: Siap Tayang di Website</w:t>
             </w:r>
           </w:p>
         </w:tc>
@@ -6464,7 +6453,7 @@
                 <w:color w:val="16A34A"/>
                 <w:sz w:val="13"/>
               </w:rPr>
-              <w:t>Status Saat Ini: SUDAH DIUPLOAD (Gambar Alur + Prosedur Tayang)</w:t>
+              <w:t>Status Form: Siap Tayang di Website</w:t>
             </w:r>
           </w:p>
         </w:tc>
@@ -6662,7 +6651,7 @@
                 <w:color w:val="16A34A"/>
                 <w:sz w:val="13"/>
               </w:rPr>
-              <w:t>Status Saat Ini: SUDAH DIUPLOAD (Gambar Alur + Prosedur Tayang)</w:t>
+              <w:t>Status Form: Siap Tayang di Website</w:t>
             </w:r>
           </w:p>
         </w:tc>
@@ -6860,7 +6849,7 @@
                 <w:color w:val="16A34A"/>
                 <w:sz w:val="13"/>
               </w:rPr>
-              <w:t>Status Saat Ini: SUDAH DIUPLOAD (Gambar Alur + Prosedur Tayang)</w:t>
+              <w:t>Status Form: Siap Tayang di Website</w:t>
             </w:r>
           </w:p>
         </w:tc>
@@ -7180,7 +7169,7 @@
                 <w:color w:val="16A34A"/>
                 <w:sz w:val="13"/>
               </w:rPr>
-              <w:t>Status Saat Ini: Sudah tayang di Pusat Layanan Aksesibilitas Web</w:t>
+              <w:t>Status Form: Siap Tayang di Website</w:t>
             </w:r>
           </w:p>
         </w:tc>
@@ -7378,7 +7367,7 @@
                 <w:color w:val="16A34A"/>
                 <w:sz w:val="13"/>
               </w:rPr>
-              <w:t>Status Saat Ini: SUDAH DIUPLOAD (Terhubung di Widget Braille)</w:t>
+              <w:t>Status Form: Siap Tayang di Website</w:t>
             </w:r>
           </w:p>
         </w:tc>
@@ -7576,7 +7565,7 @@
                 <w:color w:val="16A34A"/>
                 <w:sz w:val="13"/>
               </w:rPr>
-              <w:t>Status Saat Ini: SUDAH DIUPLOAD (Terhubung di Widget Braille)</w:t>
+              <w:t>Status Form: Siap Tayang di Website</w:t>
             </w:r>
           </w:p>
         </w:tc>
@@ -7774,7 +7763,7 @@
                 <w:color w:val="16A34A"/>
                 <w:sz w:val="13"/>
               </w:rPr>
-              <w:t>Status Saat Ini: Sudah tayang di Widget Aksesibilitas (Bisindo Player)</w:t>
+              <w:t>Status Form: Siap Tayang di Website</w:t>
             </w:r>
           </w:p>
         </w:tc>
@@ -7972,7 +7961,7 @@
                 <w:color w:val="16A34A"/>
                 <w:sz w:val="13"/>
               </w:rPr>
-              <w:t>Status Saat Ini: Sudah tayang di Widget Aksesibilitas (Hotline WA Pendamping)</w:t>
+              <w:t>Status Form: Siap Tayang di Website</w:t>
             </w:r>
           </w:p>
         </w:tc>
@@ -8292,7 +8281,7 @@
                 <w:color w:val="16A34A"/>
                 <w:sz w:val="13"/>
               </w:rPr>
-              <w:t>Status Saat Ini: Aktif &amp; Live (http://ppid.pktj.ac.id)</w:t>
+              <w:t>Status Form: Siap Tayang di Website</w:t>
             </w:r>
           </w:p>
         </w:tc>
@@ -8490,7 +8479,7 @@
                 <w:color w:val="16A34A"/>
                 <w:sz w:val="13"/>
               </w:rPr>
-              <w:t>Status Saat Ini: Sudah terhubung di Header, Gateway SSO, &amp; Footer</w:t>
+              <w:t>Status Form: Siap Tayang di Website</w:t>
             </w:r>
           </w:p>
         </w:tc>
@@ -8688,7 +8677,7 @@
                 <w:color w:val="16A34A"/>
                 <w:sz w:val="13"/>
               </w:rPr>
-              <w:t>Status Saat Ini: Aktif &amp; Siap Menerima Permohonan Online</w:t>
+              <w:t>Status Form: Siap Tayang di Website</w:t>
             </w:r>
           </w:p>
         </w:tc>
@@ -8886,7 +8875,7 @@
                 <w:color w:val="16A34A"/>
                 <w:sz w:val="13"/>
               </w:rPr>
-              <w:t>Status Saat Ini: Aktif di Portal Publik</w:t>
+              <w:t>Status Form: Siap Tayang di Website</w:t>
             </w:r>
           </w:p>
         </w:tc>
@@ -9084,7 +9073,7 @@
                 <w:color w:val="16A34A"/>
                 <w:sz w:val="13"/>
               </w:rPr>
-              <w:t>Status Saat Ini: Sudah terhubung di Footer &amp; Menu Kontak</w:t>
+              <w:t>Status Form: Siap Tayang di Website</w:t>
             </w:r>
           </w:p>
         </w:tc>
@@ -9282,7 +9271,7 @@
                 <w:color w:val="16A34A"/>
                 <w:sz w:val="13"/>
               </w:rPr>
-              <w:t>Status Saat Ini: Sudah terhubung di Widget &amp; Footer (Hotline WA)</w:t>
+              <w:t>Status Form: Siap Tayang di Website</w:t>
             </w:r>
           </w:p>
         </w:tc>
@@ -9334,7 +9323,7 @@
                 <w:color w:val="DC2626"/>
                 <w:sz w:val="13"/>
               </w:rPr>
-              <w:t>Perlu Link</w:t>
+              <w:t>Tinggal Link</w:t>
             </w:r>
           </w:p>
         </w:tc>
@@ -9480,7 +9469,7 @@
                 <w:color w:val="B91C1C"/>
                 <w:sz w:val="13"/>
               </w:rPr>
-              <w:t>Status Saat Ini: Perlu Link GDrive ke Admin Laporan Layanan</w:t>
+              <w:t>Status Form: Form Judul/Deskripsi Sudah Terisi di Admin (Tinggal Tempel Link GDrive)</w:t>
             </w:r>
           </w:p>
         </w:tc>
@@ -9791,7 +9780,7 @@
                 <w:sz w:val="13"/>
                 <w:u w:val="single"/>
               </w:rPr>
-              <w:t>http://ppid.pktj.ac.id/admin/profil/edit/profil_singkat</w:t>
+              <w:t>http://ppid.pktj.ac.id/admin/informasi/berkala/5/edit</w:t>
               <w:br/>
             </w:r>
             <w:r>
@@ -9800,7 +9789,7 @@
                 <w:color w:val="16A34A"/>
                 <w:sz w:val="13"/>
               </w:rPr>
-              <w:t>Status Saat Ini: Sudah tayang di Menu Profil PKTJ</w:t>
+              <w:t>Status Form: Siap Tayang di Website</w:t>
             </w:r>
           </w:p>
         </w:tc>
@@ -9989,7 +9978,7 @@
                 <w:sz w:val="13"/>
                 <w:u w:val="single"/>
               </w:rPr>
-              <w:t>http://ppid.pktj.ac.id/admin/pejabat</w:t>
+              <w:t>http://ppid.pktj.ac.id/admin/informasi/berkala/6/edit</w:t>
               <w:br/>
             </w:r>
             <w:r>
@@ -9998,7 +9987,7 @@
                 <w:color w:val="16A34A"/>
                 <w:sz w:val="13"/>
               </w:rPr>
-              <w:t>Status Saat Ini: Sudah tayang di Menu Profil Pejabat</w:t>
+              <w:t>Status Form: Siap Tayang di Website</w:t>
             </w:r>
           </w:p>
         </w:tc>
@@ -10196,7 +10185,7 @@
                 <w:color w:val="16A34A"/>
                 <w:sz w:val="13"/>
               </w:rPr>
-              <w:t>Status Saat Ini: Sudah terhubung di Profil Pejabat (Tabel LHKPN)</w:t>
+              <w:t>Status Form: Siap Tayang di Website</w:t>
             </w:r>
           </w:p>
         </w:tc>
@@ -10248,7 +10237,7 @@
                 <w:color w:val="DC2626"/>
                 <w:sz w:val="13"/>
               </w:rPr>
-              <w:t>Perlu Link</w:t>
+              <w:t>Tinggal Link</w:t>
             </w:r>
           </w:p>
         </w:tc>
@@ -10385,7 +10374,7 @@
                 <w:sz w:val="13"/>
                 <w:u w:val="single"/>
               </w:rPr>
-              <w:t>http://ppid.pktj.ac.id/admin/informasi/berkala/create</w:t>
+              <w:t>http://ppid.pktj.ac.id/admin/informasi/berkala/7/edit</w:t>
               <w:br/>
             </w:r>
             <w:r>
@@ -10394,7 +10383,7 @@
                 <w:color w:val="B91C1C"/>
                 <w:sz w:val="13"/>
               </w:rPr>
-              <w:t>Status Saat Ini: Perlu Link GDrive ke Admin Info Berkala</w:t>
+              <w:t>Status Form: Form Judul/Deskripsi Sudah Terisi di Admin (Tinggal Tempel Link GDrive)</w:t>
             </w:r>
           </w:p>
         </w:tc>
@@ -10446,7 +10435,7 @@
                 <w:color w:val="DC2626"/>
                 <w:sz w:val="13"/>
               </w:rPr>
-              <w:t>Perlu Link</w:t>
+              <w:t>Tinggal Link</w:t>
             </w:r>
           </w:p>
         </w:tc>
@@ -10583,7 +10572,7 @@
                 <w:sz w:val="13"/>
                 <w:u w:val="single"/>
               </w:rPr>
-              <w:t>http://ppid.pktj.ac.id/admin/informasi/berkala/create</w:t>
+              <w:t>http://ppid.pktj.ac.id/admin/informasi/berkala/8/edit</w:t>
               <w:br/>
             </w:r>
             <w:r>
@@ -10592,7 +10581,7 @@
                 <w:color w:val="B91C1C"/>
                 <w:sz w:val="13"/>
               </w:rPr>
-              <w:t>Status Saat Ini: Perlu Link GDrive ke Admin Info Berkala</w:t>
+              <w:t>Status Form: Form Judul/Deskripsi Sudah Terisi di Admin (Tinggal Tempel Link GDrive)</w:t>
             </w:r>
           </w:p>
         </w:tc>
@@ -10644,7 +10633,7 @@
                 <w:color w:val="DC2626"/>
                 <w:sz w:val="13"/>
               </w:rPr>
-              <w:t>Perlu Link</w:t>
+              <w:t>Tinggal Link</w:t>
             </w:r>
           </w:p>
         </w:tc>
@@ -10781,7 +10770,7 @@
                 <w:sz w:val="13"/>
                 <w:u w:val="single"/>
               </w:rPr>
-              <w:t>http://ppid.pktj.ac.id/admin/informasi/berkala/create</w:t>
+              <w:t>http://ppid.pktj.ac.id/admin/informasi/berkala/9/edit</w:t>
               <w:br/>
             </w:r>
             <w:r>
@@ -10790,7 +10779,7 @@
                 <w:color w:val="B91C1C"/>
                 <w:sz w:val="13"/>
               </w:rPr>
-              <w:t>Status Saat Ini: Perlu Link GDrive ke Admin Info Berkala</w:t>
+              <w:t>Status Form: Form Judul/Deskripsi Sudah Terisi di Admin (Tinggal Tempel Link GDrive)</w:t>
             </w:r>
           </w:p>
         </w:tc>
@@ -10842,7 +10831,7 @@
                 <w:color w:val="DC2626"/>
                 <w:sz w:val="13"/>
               </w:rPr>
-              <w:t>Perlu Link</w:t>
+              <w:t>Tinggal Link</w:t>
             </w:r>
           </w:p>
         </w:tc>
@@ -10979,7 +10968,7 @@
                 <w:sz w:val="13"/>
                 <w:u w:val="single"/>
               </w:rPr>
-              <w:t>http://ppid.pktj.ac.id/admin/informasi/berkala/create</w:t>
+              <w:t>http://ppid.pktj.ac.id/admin/informasi/berkala/10/edit</w:t>
               <w:br/>
             </w:r>
             <w:r>
@@ -10988,7 +10977,7 @@
                 <w:color w:val="B91C1C"/>
                 <w:sz w:val="13"/>
               </w:rPr>
-              <w:t>Status Saat Ini: Perlu Link GDrive ke Admin Info Berkala</w:t>
+              <w:t>Status Form: Form Judul/Deskripsi Sudah Terisi di Admin (Tinggal Tempel Link GDrive)</w:t>
             </w:r>
           </w:p>
         </w:tc>
@@ -11040,7 +11029,7 @@
                 <w:color w:val="DC2626"/>
                 <w:sz w:val="13"/>
               </w:rPr>
-              <w:t>Perlu Link</w:t>
+              <w:t>Tinggal Link</w:t>
             </w:r>
           </w:p>
         </w:tc>
@@ -11177,7 +11166,7 @@
                 <w:sz w:val="13"/>
                 <w:u w:val="single"/>
               </w:rPr>
-              <w:t>http://ppid.pktj.ac.id/admin/informasi/berkala/create</w:t>
+              <w:t>http://ppid.pktj.ac.id/admin/informasi/berkala/11/edit</w:t>
               <w:br/>
             </w:r>
             <w:r>
@@ -11186,7 +11175,7 @@
                 <w:color w:val="B91C1C"/>
                 <w:sz w:val="13"/>
               </w:rPr>
-              <w:t>Status Saat Ini: Perlu Link GDrive ke Admin Info Berkala</w:t>
+              <w:t>Status Form: Form Judul/Deskripsi Sudah Terisi di Admin (Tinggal Tempel Link GDrive)</w:t>
             </w:r>
           </w:p>
         </w:tc>
@@ -11238,7 +11227,7 @@
                 <w:color w:val="DC2626"/>
                 <w:sz w:val="13"/>
               </w:rPr>
-              <w:t>Perlu Link</w:t>
+              <w:t>Tinggal Link</w:t>
             </w:r>
           </w:p>
         </w:tc>
@@ -11375,7 +11364,7 @@
                 <w:sz w:val="13"/>
                 <w:u w:val="single"/>
               </w:rPr>
-              <w:t>http://ppid.pktj.ac.id/admin/informasi/berkala/create</w:t>
+              <w:t>http://ppid.pktj.ac.id/admin/informasi/berkala/13/edit</w:t>
               <w:br/>
             </w:r>
             <w:r>
@@ -11384,7 +11373,7 @@
                 <w:color w:val="B91C1C"/>
                 <w:sz w:val="13"/>
               </w:rPr>
-              <w:t>Status Saat Ini: Perlu Link GDrive ke Admin Info Berkala</w:t>
+              <w:t>Status Form: Form Judul/Deskripsi Sudah Terisi di Admin (Tinggal Tempel Link GDrive)</w:t>
             </w:r>
           </w:p>
         </w:tc>
@@ -11436,7 +11425,7 @@
                 <w:color w:val="DC2626"/>
                 <w:sz w:val="13"/>
               </w:rPr>
-              <w:t>Perlu Link</w:t>
+              <w:t>Tinggal Link</w:t>
             </w:r>
           </w:p>
         </w:tc>
@@ -11573,7 +11562,7 @@
                 <w:sz w:val="13"/>
                 <w:u w:val="single"/>
               </w:rPr>
-              <w:t>http://ppid.pktj.ac.id/admin/informasi/berkala/create</w:t>
+              <w:t>http://ppid.pktj.ac.id/admin/informasi/berkala/14/edit</w:t>
               <w:br/>
             </w:r>
             <w:r>
@@ -11582,7 +11571,7 @@
                 <w:color w:val="B91C1C"/>
                 <w:sz w:val="13"/>
               </w:rPr>
-              <w:t>Status Saat Ini: Perlu Link GDrive ke Admin Info Berkala</w:t>
+              <w:t>Status Form: Form Judul/Deskripsi Sudah Terisi di Admin (Tinggal Tempel Link GDrive)</w:t>
             </w:r>
           </w:p>
         </w:tc>
@@ -11756,7 +11745,7 @@
                 <w:color w:val="DC2626"/>
                 <w:sz w:val="13"/>
               </w:rPr>
-              <w:t>Perlu Link</w:t>
+              <w:t>Tinggal Link</w:t>
             </w:r>
           </w:p>
         </w:tc>
@@ -11893,7 +11882,7 @@
                 <w:sz w:val="13"/>
                 <w:u w:val="single"/>
               </w:rPr>
-              <w:t>http://ppid.pktj.ac.id/admin/informasi/setiap-saat/create</w:t>
+              <w:t>http://ppid.pktj.ac.id/admin/informasi/setiap-saat/3/edit</w:t>
               <w:br/>
             </w:r>
             <w:r>
@@ -11902,7 +11891,7 @@
                 <w:color w:val="B91C1C"/>
                 <w:sz w:val="13"/>
               </w:rPr>
-              <w:t>Status Saat Ini: Perlu Link GDrive ke Admin Info Setiap Saat</w:t>
+              <w:t>Status Form: Form Judul/Deskripsi Sudah Terisi di Admin (Tinggal Tempel Link GDrive)</w:t>
             </w:r>
           </w:p>
         </w:tc>
@@ -11954,7 +11943,7 @@
                 <w:color w:val="DC2626"/>
                 <w:sz w:val="13"/>
               </w:rPr>
-              <w:t>Perlu Link</w:t>
+              <w:t>Tinggal Link</w:t>
             </w:r>
           </w:p>
         </w:tc>
@@ -12091,7 +12080,7 @@
                 <w:sz w:val="13"/>
                 <w:u w:val="single"/>
               </w:rPr>
-              <w:t>http://ppid.pktj.ac.id/admin/informasi/setiap-saat/create</w:t>
+              <w:t>http://ppid.pktj.ac.id/admin/informasi/setiap-saat/6/edit</w:t>
               <w:br/>
             </w:r>
             <w:r>
@@ -12100,7 +12089,7 @@
                 <w:color w:val="B91C1C"/>
                 <w:sz w:val="13"/>
               </w:rPr>
-              <w:t>Status Saat Ini: Perlu Link GDrive ke Admin Info Setiap Saat</w:t>
+              <w:t>Status Form: Form Judul/Deskripsi Sudah Terisi di Admin (Tinggal Tempel Link GDrive)</w:t>
             </w:r>
           </w:p>
         </w:tc>
@@ -12152,7 +12141,7 @@
                 <w:color w:val="DC2626"/>
                 <w:sz w:val="13"/>
               </w:rPr>
-              <w:t>Perlu Link</w:t>
+              <w:t>Tinggal Link</w:t>
             </w:r>
           </w:p>
         </w:tc>
@@ -12289,7 +12278,7 @@
                 <w:sz w:val="13"/>
                 <w:u w:val="single"/>
               </w:rPr>
-              <w:t>http://ppid.pktj.ac.id/admin/informasi/setiap-saat/create</w:t>
+              <w:t>http://ppid.pktj.ac.id/admin/informasi/setiap-saat/5/edit</w:t>
               <w:br/>
             </w:r>
             <w:r>
@@ -12298,7 +12287,7 @@
                 <w:color w:val="B91C1C"/>
                 <w:sz w:val="13"/>
               </w:rPr>
-              <w:t>Status Saat Ini: Perlu Link GDrive ke Admin Info Setiap Saat</w:t>
+              <w:t>Status Form: Form Judul/Deskripsi Sudah Terisi di Admin (Tinggal Tempel Link GDrive)</w:t>
             </w:r>
           </w:p>
         </w:tc>
@@ -12472,7 +12461,7 @@
                 <w:color w:val="DC2626"/>
                 <w:sz w:val="13"/>
               </w:rPr>
-              <w:t>Perlu Link</w:t>
+              <w:t>Tinggal Link</w:t>
             </w:r>
           </w:p>
         </w:tc>
@@ -12609,7 +12598,7 @@
                 <w:sz w:val="13"/>
                 <w:u w:val="single"/>
               </w:rPr>
-              <w:t>http://ppid.pktj.ac.id/admin/informasi/serta-merta/create</w:t>
+              <w:t>http://ppid.pktj.ac.id/admin/informasi/serta-merta/3/edit</w:t>
               <w:br/>
             </w:r>
             <w:r>
@@ -12618,7 +12607,7 @@
                 <w:color w:val="B91C1C"/>
                 <w:sz w:val="13"/>
               </w:rPr>
-              <w:t>Status Saat Ini: Perlu Link GDrive ke Admin Info Serta Merta</w:t>
+              <w:t>Status Form: Form Judul/Deskripsi Sudah Terisi di Admin (Tinggal Tempel Link GDrive)</w:t>
             </w:r>
           </w:p>
         </w:tc>
@@ -12670,7 +12659,7 @@
                 <w:color w:val="DC2626"/>
                 <w:sz w:val="13"/>
               </w:rPr>
-              <w:t>Perlu Link</w:t>
+              <w:t>Tinggal Link</w:t>
             </w:r>
           </w:p>
         </w:tc>
@@ -12807,7 +12796,7 @@
                 <w:sz w:val="13"/>
                 <w:u w:val="single"/>
               </w:rPr>
-              <w:t>http://ppid.pktj.ac.id/admin/informasi/serta-merta/create</w:t>
+              <w:t>http://ppid.pktj.ac.id/admin/informasi/serta-merta/4/edit</w:t>
               <w:br/>
             </w:r>
             <w:r>
@@ -12816,7 +12805,7 @@
                 <w:color w:val="B91C1C"/>
                 <w:sz w:val="13"/>
               </w:rPr>
-              <w:t>Status Saat Ini: Perlu Link GDrive ke Admin Info Serta Merta</w:t>
+              <w:t>Status Form: Form Judul/Deskripsi Sudah Terisi di Admin (Tinggal Tempel Link GDrive)</w:t>
             </w:r>
           </w:p>
         </w:tc>
@@ -12868,7 +12857,7 @@
                 <w:color w:val="DC2626"/>
                 <w:sz w:val="13"/>
               </w:rPr>
-              <w:t>Perlu Link</w:t>
+              <w:t>Tinggal Link</w:t>
             </w:r>
           </w:p>
         </w:tc>
@@ -13005,7 +12994,7 @@
                 <w:sz w:val="13"/>
                 <w:u w:val="single"/>
               </w:rPr>
-              <w:t>http://ppid.pktj.ac.id/admin/informasi/serta-merta/create</w:t>
+              <w:t>http://ppid.pktj.ac.id/admin/informasi/serta-merta/5/edit</w:t>
               <w:br/>
             </w:r>
             <w:r>
@@ -13014,7 +13003,7 @@
                 <w:color w:val="B91C1C"/>
                 <w:sz w:val="13"/>
               </w:rPr>
-              <w:t>Status Saat Ini: Perlu Link GDrive ke Admin Info Serta Merta</w:t>
+              <w:t>Status Form: Form Judul/Deskripsi Sudah Terisi di Admin (Tinggal Tempel Link GDrive)</w:t>
             </w:r>
           </w:p>
         </w:tc>
@@ -13334,7 +13323,1155 @@
                 <w:color w:val="16A34A"/>
                 <w:sz w:val="13"/>
               </w:rPr>
-              <w:t>Status Saat Ini: SUDAH DIUPLOAD (Widget Braille &amp; Inovasi Disabilitas Aktif)</w:t>
+              <w:t>Status Form: Siap Tayang di Website</w:t>
+            </w:r>
+          </w:p>
+        </w:tc>
+      </w:tr>
+    </w:tbl>
+    <w:p>
+      <w:r>
+        <w:br w:type="page"/>
+      </w:r>
+    </w:p>
+    <w:p>
+      <w:pPr>
+        <w:jc w:val="center"/>
+      </w:pPr>
+      <w:r>
+        <w:rPr>
+          <w:b/>
+          <w:color w:val="B91C1C"/>
+          <w:sz w:val="22"/>
+        </w:rPr>
+        <w:t>BAGIAN 3: DAFTAR DOKUMEN YANG BELUM MEMILIKI BERKAS DI GOOGLE DRIVE / LAPTOP</w:t>
+        <w:br/>
+        <w:t>(UNTUK DIMINTAKAN KE ATASAN / UNIT KERJA TERKAIT PKTJ TEGAL)</w:t>
+        <w:br/>
+      </w:r>
+    </w:p>
+    <w:p>
+      <w:pPr>
+        <w:jc w:val="both"/>
+      </w:pPr>
+      <w:r>
+        <w:rPr>
+          <w:i/>
+          <w:color w:val="475569"/>
+          <w:sz w:val="16"/>
+        </w:rPr>
+        <w:t>Halaman ini disusun khusus sebagai lembar kerja dan bahan koordinasi dengan Pimpinan / Atasan dan Kepala Unit Kerja di lingkungan PKTJ Tegal. Di bawah ini adalah daftar dokumen yang judul dan deskripsinya sudah tercatat pada instrumen AKIP dan sudah disiapkan formulirnya di website, namun berkas fisiknya belum ditemukan di folder laptop / Google Drive sehingga perlu dimintakan softcopy resminya:</w:t>
+      </w:r>
+    </w:p>
+    <w:p/>
+    <w:tbl>
+      <w:tblPr>
+        <w:tblW w:type="auto" w:w="0"/>
+        <w:jc w:val="center"/>
+        <w:tblLook w:firstColumn="1" w:firstRow="1" w:lastColumn="0" w:lastRow="0" w:noHBand="0" w:noVBand="1" w:val="04A0"/>
+        <w:tblBorders>
+          <w:top w:val="single" w:sz="4" w:space="0" w:color="CBD5E1"/>
+          <w:bottom w:val="single" w:sz="4" w:space="0" w:color="CBD5E1"/>
+          <w:insideH w:val="single" w:sz="4" w:space="0" w:color="CBD5E1"/>
+          <w:insideV w:val="none"/>
+          <w:left w:val="none"/>
+          <w:right w:val="none"/>
+        </w:tblBorders>
+      </w:tblPr>
+      <w:tblGrid>
+        <w:gridCol w:w="2614"/>
+        <w:gridCol w:w="2614"/>
+        <w:gridCol w:w="2614"/>
+        <w:gridCol w:w="2614"/>
+        <w:gridCol w:w="2614"/>
+        <w:gridCol w:w="2614"/>
+      </w:tblGrid>
+      <w:tr>
+        <w:tc>
+          <w:tcPr>
+            <w:tcW w:type="dxa" w:w="576"/>
+            <w:shd w:fill="B91C1C"/>
+            <w:tcMar>
+              <w:top w:w="80" w:type="dxa"/>
+              <w:bottom w:w="80" w:type="dxa"/>
+              <w:left w:w="50" w:type="dxa"/>
+              <w:right w:w="50" w:type="dxa"/>
+            </w:tcMar>
+          </w:tcPr>
+          <w:p>
+            <w:pPr>
+              <w:jc w:val="center"/>
+            </w:pPr>
+            <w:r>
+              <w:rPr>
+                <w:b/>
+                <w:color w:val="FFFFFF"/>
+                <w:sz w:val="15"/>
+              </w:rPr>
+              <w:t>No</w:t>
+            </w:r>
+          </w:p>
+        </w:tc>
+        <w:tc>
+          <w:tcPr>
+            <w:tcW w:type="dxa" w:w="2592"/>
+            <w:shd w:fill="B91C1C"/>
+            <w:tcMar>
+              <w:top w:w="80" w:type="dxa"/>
+              <w:bottom w:w="80" w:type="dxa"/>
+              <w:left w:w="50" w:type="dxa"/>
+              <w:right w:w="50" w:type="dxa"/>
+            </w:tcMar>
+          </w:tcPr>
+          <w:p>
+            <w:pPr>
+              <w:jc w:val="center"/>
+            </w:pPr>
+            <w:r>
+              <w:rPr>
+                <w:b/>
+                <w:color w:val="FFFFFF"/>
+                <w:sz w:val="15"/>
+              </w:rPr>
+              <w:t>Indikator AKIP 2026</w:t>
+            </w:r>
+          </w:p>
+        </w:tc>
+        <w:tc>
+          <w:tcPr>
+            <w:tcW w:type="dxa" w:w="4032"/>
+            <w:shd w:fill="B91C1C"/>
+            <w:tcMar>
+              <w:top w:w="80" w:type="dxa"/>
+              <w:bottom w:w="80" w:type="dxa"/>
+              <w:left w:w="50" w:type="dxa"/>
+              <w:right w:w="50" w:type="dxa"/>
+            </w:tcMar>
+          </w:tcPr>
+          <w:p>
+            <w:pPr>
+              <w:jc w:val="left"/>
+            </w:pPr>
+            <w:r>
+              <w:rPr>
+                <w:b/>
+                <w:color w:val="FFFFFF"/>
+                <w:sz w:val="15"/>
+              </w:rPr>
+              <w:t>Judul Dokumen yang Dibutuhkan Website</w:t>
+            </w:r>
+          </w:p>
+        </w:tc>
+        <w:tc>
+          <w:tcPr>
+            <w:tcW w:type="dxa" w:w="2880"/>
+            <w:shd w:fill="B91C1C"/>
+            <w:tcMar>
+              <w:top w:w="80" w:type="dxa"/>
+              <w:bottom w:w="80" w:type="dxa"/>
+              <w:left w:w="50" w:type="dxa"/>
+              <w:right w:w="50" w:type="dxa"/>
+            </w:tcMar>
+          </w:tcPr>
+          <w:p>
+            <w:pPr>
+              <w:jc w:val="left"/>
+            </w:pPr>
+            <w:r>
+              <w:rPr>
+                <w:b/>
+                <w:color w:val="FFFFFF"/>
+                <w:sz w:val="15"/>
+              </w:rPr>
+              <w:t>Unit Kerja yang Perlu Dihubungi</w:t>
+            </w:r>
+          </w:p>
+        </w:tc>
+        <w:tc>
+          <w:tcPr>
+            <w:tcW w:type="dxa" w:w="2592"/>
+            <w:shd w:fill="B91C1C"/>
+            <w:tcMar>
+              <w:top w:w="80" w:type="dxa"/>
+              <w:bottom w:w="80" w:type="dxa"/>
+              <w:left w:w="50" w:type="dxa"/>
+              <w:right w:w="50" w:type="dxa"/>
+            </w:tcMar>
+          </w:tcPr>
+          <w:p>
+            <w:pPr>
+              <w:jc w:val="left"/>
+            </w:pPr>
+            <w:r>
+              <w:rPr>
+                <w:b/>
+                <w:color w:val="FFFFFF"/>
+                <w:sz w:val="15"/>
+              </w:rPr>
+              <w:t>Format Berkas yang Diminta</w:t>
+            </w:r>
+          </w:p>
+        </w:tc>
+        <w:tc>
+          <w:tcPr>
+            <w:tcW w:type="dxa" w:w="3168"/>
+            <w:shd w:fill="B91C1C"/>
+            <w:tcMar>
+              <w:top w:w="80" w:type="dxa"/>
+              <w:bottom w:w="80" w:type="dxa"/>
+              <w:left w:w="50" w:type="dxa"/>
+              <w:right w:w="50" w:type="dxa"/>
+            </w:tcMar>
+          </w:tcPr>
+          <w:p>
+            <w:pPr>
+              <w:jc w:val="left"/>
+            </w:pPr>
+            <w:r>
+              <w:rPr>
+                <w:b/>
+                <w:color w:val="FFFFFF"/>
+                <w:sz w:val="15"/>
+              </w:rPr>
+              <w:t>Catatan &amp; Tindak Lanjut Koordinasi</w:t>
+            </w:r>
+          </w:p>
+        </w:tc>
+      </w:tr>
+      <w:tr>
+        <w:tc>
+          <w:tcPr>
+            <w:tcW w:type="dxa" w:w="576"/>
+            <w:shd w:fill="FFFFFF"/>
+            <w:tcMar>
+              <w:top w:w="60" w:type="dxa"/>
+              <w:bottom w:w="60" w:type="dxa"/>
+              <w:left w:w="30" w:type="dxa"/>
+              <w:right w:w="30" w:type="dxa"/>
+            </w:tcMar>
+          </w:tcPr>
+          <w:p>
+            <w:pPr>
+              <w:jc w:val="center"/>
+            </w:pPr>
+            <w:r>
+              <w:rPr>
+                <w:b/>
+                <w:sz w:val="16"/>
+              </w:rPr>
+              <w:t>1</w:t>
+            </w:r>
+          </w:p>
+        </w:tc>
+        <w:tc>
+          <w:tcPr>
+            <w:tcW w:type="dxa" w:w="2592"/>
+            <w:shd w:fill="FFFFFF"/>
+            <w:tcMar>
+              <w:top w:w="60" w:type="dxa"/>
+              <w:bottom w:w="60" w:type="dxa"/>
+              <w:left w:w="40" w:type="dxa"/>
+              <w:right w:w="40" w:type="dxa"/>
+            </w:tcMar>
+          </w:tcPr>
+          <w:p>
+            <w:r>
+              <w:rPr>
+                <w:b/>
+                <w:color w:val="B91C1C"/>
+                <w:sz w:val="14"/>
+              </w:rPr>
+              <w:t>Indikator B.1 / F.8 (Anggaran &amp; DIPA)</w:t>
+            </w:r>
+          </w:p>
+        </w:tc>
+        <w:tc>
+          <w:tcPr>
+            <w:tcW w:type="dxa" w:w="4032"/>
+            <w:shd w:fill="FFFFFF"/>
+            <w:tcMar>
+              <w:top w:w="60" w:type="dxa"/>
+              <w:bottom w:w="60" w:type="dxa"/>
+              <w:left w:w="50" w:type="dxa"/>
+              <w:right w:w="50" w:type="dxa"/>
+            </w:tcMar>
+          </w:tcPr>
+          <w:p>
+            <w:r>
+              <w:rPr>
+                <w:b/>
+                <w:color w:val="002B5C"/>
+                <w:sz w:val="15"/>
+              </w:rPr>
+              <w:t>DIPA Induk Petikan &amp; RKA-KL PKTJ Tahun Anggaran 2025/2026 Lengkap (Format Resmi Kemenkeu)</w:t>
+            </w:r>
+          </w:p>
+        </w:tc>
+        <w:tc>
+          <w:tcPr>
+            <w:tcW w:type="dxa" w:w="2880"/>
+            <w:shd w:fill="FFFFFF"/>
+            <w:tcMar>
+              <w:top w:w="60" w:type="dxa"/>
+              <w:bottom w:w="60" w:type="dxa"/>
+              <w:left w:w="40" w:type="dxa"/>
+              <w:right w:w="40" w:type="dxa"/>
+            </w:tcMar>
+          </w:tcPr>
+          <w:p>
+            <w:r>
+              <w:rPr>
+                <w:b/>
+                <w:color w:val="004A99"/>
+                <w:sz w:val="14"/>
+              </w:rPr>
+              <w:t>Subbag Keuangan / Bendahara Pengeluaran</w:t>
+            </w:r>
+          </w:p>
+        </w:tc>
+        <w:tc>
+          <w:tcPr>
+            <w:tcW w:type="dxa" w:w="2592"/>
+            <w:shd w:fill="FFFFFF"/>
+            <w:tcMar>
+              <w:top w:w="60" w:type="dxa"/>
+              <w:bottom w:w="60" w:type="dxa"/>
+              <w:left w:w="40" w:type="dxa"/>
+              <w:right w:w="40" w:type="dxa"/>
+            </w:tcMar>
+          </w:tcPr>
+          <w:p>
+            <w:r>
+              <w:rPr>
+                <w:i/>
+                <w:sz w:val="14"/>
+              </w:rPr>
+              <w:t>PDF Resmi &amp; Excel Lembar Alokasi Pagu POK</w:t>
+            </w:r>
+          </w:p>
+        </w:tc>
+        <w:tc>
+          <w:tcPr>
+            <w:tcW w:type="dxa" w:w="3168"/>
+            <w:shd w:fill="FFFFFF"/>
+            <w:tcMar>
+              <w:top w:w="60" w:type="dxa"/>
+              <w:bottom w:w="60" w:type="dxa"/>
+              <w:left w:w="40" w:type="dxa"/>
+              <w:right w:w="40" w:type="dxa"/>
+            </w:tcMar>
+          </w:tcPr>
+          <w:p>
+            <w:r>
+              <w:rPr>
+                <w:color w:val="475569"/>
+                <w:sz w:val="13"/>
+              </w:rPr>
+              <w:t>Diperlukan untuk bukti alokasi anggaran operasional PPID dan transparansi realisasi belanja triwulanan.</w:t>
+            </w:r>
+          </w:p>
+        </w:tc>
+      </w:tr>
+      <w:tr>
+        <w:tc>
+          <w:tcPr>
+            <w:tcW w:type="dxa" w:w="576"/>
+            <w:shd w:fill="FEF2F2"/>
+            <w:tcMar>
+              <w:top w:w="60" w:type="dxa"/>
+              <w:bottom w:w="60" w:type="dxa"/>
+              <w:left w:w="30" w:type="dxa"/>
+              <w:right w:w="30" w:type="dxa"/>
+            </w:tcMar>
+          </w:tcPr>
+          <w:p>
+            <w:pPr>
+              <w:jc w:val="center"/>
+            </w:pPr>
+            <w:r>
+              <w:rPr>
+                <w:b/>
+                <w:sz w:val="16"/>
+              </w:rPr>
+              <w:t>2</w:t>
+            </w:r>
+          </w:p>
+        </w:tc>
+        <w:tc>
+          <w:tcPr>
+            <w:tcW w:type="dxa" w:w="2592"/>
+            <w:shd w:fill="FEF2F2"/>
+            <w:tcMar>
+              <w:top w:w="60" w:type="dxa"/>
+              <w:bottom w:w="60" w:type="dxa"/>
+              <w:left w:w="40" w:type="dxa"/>
+              <w:right w:w="40" w:type="dxa"/>
+            </w:tcMar>
+          </w:tcPr>
+          <w:p>
+            <w:r>
+              <w:rPr>
+                <w:b/>
+                <w:color w:val="B91C1C"/>
+                <w:sz w:val="14"/>
+              </w:rPr>
+              <w:t>Indikator F.6 (Akuntabilitas Kinerja)</w:t>
+            </w:r>
+          </w:p>
+        </w:tc>
+        <w:tc>
+          <w:tcPr>
+            <w:tcW w:type="dxa" w:w="4032"/>
+            <w:shd w:fill="FEF2F2"/>
+            <w:tcMar>
+              <w:top w:w="60" w:type="dxa"/>
+              <w:bottom w:w="60" w:type="dxa"/>
+              <w:left w:w="50" w:type="dxa"/>
+              <w:right w:w="50" w:type="dxa"/>
+            </w:tcMar>
+          </w:tcPr>
+          <w:p>
+            <w:r>
+              <w:rPr>
+                <w:b/>
+                <w:color w:val="002B5C"/>
+                <w:sz w:val="15"/>
+              </w:rPr>
+              <w:t>Laporan Akuntabilitas Kinerja Instansi Pemerintah (LAKIP) PKTJ Tahun 2024/2025 Bertandatangan</w:t>
+            </w:r>
+          </w:p>
+        </w:tc>
+        <w:tc>
+          <w:tcPr>
+            <w:tcW w:type="dxa" w:w="2880"/>
+            <w:shd w:fill="FEF2F2"/>
+            <w:tcMar>
+              <w:top w:w="60" w:type="dxa"/>
+              <w:bottom w:w="60" w:type="dxa"/>
+              <w:left w:w="40" w:type="dxa"/>
+              <w:right w:w="40" w:type="dxa"/>
+            </w:tcMar>
+          </w:tcPr>
+          <w:p>
+            <w:r>
+              <w:rPr>
+                <w:b/>
+                <w:color w:val="004A99"/>
+                <w:sz w:val="14"/>
+              </w:rPr>
+              <w:t>Subbag Perencanaan / Tim SAKIP / SPI</w:t>
+            </w:r>
+          </w:p>
+        </w:tc>
+        <w:tc>
+          <w:tcPr>
+            <w:tcW w:type="dxa" w:w="2592"/>
+            <w:shd w:fill="FEF2F2"/>
+            <w:tcMar>
+              <w:top w:w="60" w:type="dxa"/>
+              <w:bottom w:w="60" w:type="dxa"/>
+              <w:left w:w="40" w:type="dxa"/>
+              <w:right w:w="40" w:type="dxa"/>
+            </w:tcMar>
+          </w:tcPr>
+          <w:p>
+            <w:r>
+              <w:rPr>
+                <w:i/>
+                <w:sz w:val="14"/>
+              </w:rPr>
+              <w:t>PDF Final Bertandatangan Direktur PKTJ</w:t>
+            </w:r>
+          </w:p>
+        </w:tc>
+        <w:tc>
+          <w:tcPr>
+            <w:tcW w:type="dxa" w:w="3168"/>
+            <w:shd w:fill="FEF2F2"/>
+            <w:tcMar>
+              <w:top w:w="60" w:type="dxa"/>
+              <w:bottom w:w="60" w:type="dxa"/>
+              <w:left w:w="40" w:type="dxa"/>
+              <w:right w:w="40" w:type="dxa"/>
+            </w:tcMar>
+          </w:tcPr>
+          <w:p>
+            <w:r>
+              <w:rPr>
+                <w:color w:val="475569"/>
+                <w:sz w:val="13"/>
+              </w:rPr>
+              <w:t>Diperlukan untuk pemenuhan pilar Informasi Berkala capaian kinerja tahunan institusi.</w:t>
+            </w:r>
+          </w:p>
+        </w:tc>
+      </w:tr>
+      <w:tr>
+        <w:tc>
+          <w:tcPr>
+            <w:tcW w:type="dxa" w:w="576"/>
+            <w:shd w:fill="FFFFFF"/>
+            <w:tcMar>
+              <w:top w:w="60" w:type="dxa"/>
+              <w:bottom w:w="60" w:type="dxa"/>
+              <w:left w:w="30" w:type="dxa"/>
+              <w:right w:w="30" w:type="dxa"/>
+            </w:tcMar>
+          </w:tcPr>
+          <w:p>
+            <w:pPr>
+              <w:jc w:val="center"/>
+            </w:pPr>
+            <w:r>
+              <w:rPr>
+                <w:b/>
+                <w:sz w:val="16"/>
+              </w:rPr>
+              <w:t>3</w:t>
+            </w:r>
+          </w:p>
+        </w:tc>
+        <w:tc>
+          <w:tcPr>
+            <w:tcW w:type="dxa" w:w="2592"/>
+            <w:shd w:fill="FFFFFF"/>
+            <w:tcMar>
+              <w:top w:w="60" w:type="dxa"/>
+              <w:bottom w:w="60" w:type="dxa"/>
+              <w:left w:w="40" w:type="dxa"/>
+              <w:right w:w="40" w:type="dxa"/>
+            </w:tcMar>
+          </w:tcPr>
+          <w:p>
+            <w:r>
+              <w:rPr>
+                <w:b/>
+                <w:color w:val="B91C1C"/>
+                <w:sz w:val="14"/>
+              </w:rPr>
+              <w:t>Indikator F.7 (Laporan Keuangan)</w:t>
+            </w:r>
+          </w:p>
+        </w:tc>
+        <w:tc>
+          <w:tcPr>
+            <w:tcW w:type="dxa" w:w="4032"/>
+            <w:shd w:fill="FFFFFF"/>
+            <w:tcMar>
+              <w:top w:w="60" w:type="dxa"/>
+              <w:bottom w:w="60" w:type="dxa"/>
+              <w:left w:w="50" w:type="dxa"/>
+              <w:right w:w="50" w:type="dxa"/>
+            </w:tcMar>
+          </w:tcPr>
+          <w:p>
+            <w:r>
+              <w:rPr>
+                <w:b/>
+                <w:color w:val="002B5C"/>
+                <w:sz w:val="15"/>
+              </w:rPr>
+              <w:t>Laporan Hasil Pemeriksaan BPK RI / Laporan Auditor Independen (LAI) Keuangan PKTJ 2024</w:t>
+            </w:r>
+          </w:p>
+        </w:tc>
+        <w:tc>
+          <w:tcPr>
+            <w:tcW w:type="dxa" w:w="2880"/>
+            <w:shd w:fill="FFFFFF"/>
+            <w:tcMar>
+              <w:top w:w="60" w:type="dxa"/>
+              <w:bottom w:w="60" w:type="dxa"/>
+              <w:left w:w="40" w:type="dxa"/>
+              <w:right w:w="40" w:type="dxa"/>
+            </w:tcMar>
+          </w:tcPr>
+          <w:p>
+            <w:r>
+              <w:rPr>
+                <w:b/>
+                <w:color w:val="004A99"/>
+                <w:sz w:val="14"/>
+              </w:rPr>
+              <w:t>Subbag Keuangan &amp; Tim Akuntansi PKTJ</w:t>
+            </w:r>
+          </w:p>
+        </w:tc>
+        <w:tc>
+          <w:tcPr>
+            <w:tcW w:type="dxa" w:w="2592"/>
+            <w:shd w:fill="FFFFFF"/>
+            <w:tcMar>
+              <w:top w:w="60" w:type="dxa"/>
+              <w:bottom w:w="60" w:type="dxa"/>
+              <w:left w:w="40" w:type="dxa"/>
+              <w:right w:w="40" w:type="dxa"/>
+            </w:tcMar>
+          </w:tcPr>
+          <w:p>
+            <w:r>
+              <w:rPr>
+                <w:i/>
+                <w:sz w:val="14"/>
+              </w:rPr>
+              <w:t>PDF Lengkap (Neraca, LO, LPE, CaLK)</w:t>
+            </w:r>
+          </w:p>
+        </w:tc>
+        <w:tc>
+          <w:tcPr>
+            <w:tcW w:type="dxa" w:w="3168"/>
+            <w:shd w:fill="FFFFFF"/>
+            <w:tcMar>
+              <w:top w:w="60" w:type="dxa"/>
+              <w:bottom w:w="60" w:type="dxa"/>
+              <w:left w:w="40" w:type="dxa"/>
+              <w:right w:w="40" w:type="dxa"/>
+            </w:tcMar>
+          </w:tcPr>
+          <w:p>
+            <w:r>
+              <w:rPr>
+                <w:color w:val="475569"/>
+                <w:sz w:val="13"/>
+              </w:rPr>
+              <w:t>Wajib diumumkan berkala sesuai PerKI 1 Tahun 2021 dan slide 28 Sosialisasi Kemenhub.</w:t>
+            </w:r>
+          </w:p>
+        </w:tc>
+      </w:tr>
+      <w:tr>
+        <w:tc>
+          <w:tcPr>
+            <w:tcW w:type="dxa" w:w="576"/>
+            <w:shd w:fill="FEF2F2"/>
+            <w:tcMar>
+              <w:top w:w="60" w:type="dxa"/>
+              <w:bottom w:w="60" w:type="dxa"/>
+              <w:left w:w="30" w:type="dxa"/>
+              <w:right w:w="30" w:type="dxa"/>
+            </w:tcMar>
+          </w:tcPr>
+          <w:p>
+            <w:pPr>
+              <w:jc w:val="center"/>
+            </w:pPr>
+            <w:r>
+              <w:rPr>
+                <w:b/>
+                <w:sz w:val="16"/>
+              </w:rPr>
+              <w:t>4</w:t>
+            </w:r>
+          </w:p>
+        </w:tc>
+        <w:tc>
+          <w:tcPr>
+            <w:tcW w:type="dxa" w:w="2592"/>
+            <w:shd w:fill="FEF2F2"/>
+            <w:tcMar>
+              <w:top w:w="60" w:type="dxa"/>
+              <w:bottom w:w="60" w:type="dxa"/>
+              <w:left w:w="40" w:type="dxa"/>
+              <w:right w:w="40" w:type="dxa"/>
+            </w:tcMar>
+          </w:tcPr>
+          <w:p>
+            <w:r>
+              <w:rPr>
+                <w:b/>
+                <w:color w:val="B91C1C"/>
+                <w:sz w:val="14"/>
+              </w:rPr>
+              <w:t>Indikator F.10 - F.18 (Pengadaan Barjas)</w:t>
+            </w:r>
+          </w:p>
+        </w:tc>
+        <w:tc>
+          <w:tcPr>
+            <w:tcW w:type="dxa" w:w="4032"/>
+            <w:shd w:fill="FEF2F2"/>
+            <w:tcMar>
+              <w:top w:w="60" w:type="dxa"/>
+              <w:bottom w:w="60" w:type="dxa"/>
+              <w:left w:w="50" w:type="dxa"/>
+              <w:right w:w="50" w:type="dxa"/>
+            </w:tcMar>
+          </w:tcPr>
+          <w:p>
+            <w:r>
+              <w:rPr>
+                <w:b/>
+                <w:color w:val="002B5C"/>
+                <w:sz w:val="15"/>
+              </w:rPr>
+              <w:t>Dokumen Kontrak Pengadaan (Tersensor), SPMK, BAPHP, dan BAST Fisik Pekerjaan Tahun 2025/2026</w:t>
+            </w:r>
+          </w:p>
+        </w:tc>
+        <w:tc>
+          <w:tcPr>
+            <w:tcW w:type="dxa" w:w="2880"/>
+            <w:shd w:fill="FEF2F2"/>
+            <w:tcMar>
+              <w:top w:w="60" w:type="dxa"/>
+              <w:bottom w:w="60" w:type="dxa"/>
+              <w:left w:w="40" w:type="dxa"/>
+              <w:right w:w="40" w:type="dxa"/>
+            </w:tcMar>
+          </w:tcPr>
+          <w:p>
+            <w:r>
+              <w:rPr>
+                <w:b/>
+                <w:color w:val="004A99"/>
+                <w:sz w:val="14"/>
+              </w:rPr>
+              <w:t>Pejabat Pembuat Komitmen (PPK) &amp; Unit Layanan Pengadaan (ULP/PBJ)</w:t>
+            </w:r>
+          </w:p>
+        </w:tc>
+        <w:tc>
+          <w:tcPr>
+            <w:tcW w:type="dxa" w:w="2592"/>
+            <w:shd w:fill="FEF2F2"/>
+            <w:tcMar>
+              <w:top w:w="60" w:type="dxa"/>
+              <w:bottom w:w="60" w:type="dxa"/>
+              <w:left w:w="40" w:type="dxa"/>
+              <w:right w:w="40" w:type="dxa"/>
+            </w:tcMar>
+          </w:tcPr>
+          <w:p>
+            <w:r>
+              <w:rPr>
+                <w:i/>
+                <w:sz w:val="14"/>
+              </w:rPr>
+              <w:t>PDF Salinan Kontrak Resmi (Informasi Pribadi/Rekening Disamarkan Sesuai Uji Konsekuensi)</w:t>
+            </w:r>
+          </w:p>
+        </w:tc>
+        <w:tc>
+          <w:tcPr>
+            <w:tcW w:type="dxa" w:w="3168"/>
+            <w:shd w:fill="FEF2F2"/>
+            <w:tcMar>
+              <w:top w:w="60" w:type="dxa"/>
+              <w:bottom w:w="60" w:type="dxa"/>
+              <w:left w:w="40" w:type="dxa"/>
+              <w:right w:w="40" w:type="dxa"/>
+            </w:tcMar>
+          </w:tcPr>
+          <w:p>
+            <w:r>
+              <w:rPr>
+                <w:color w:val="475569"/>
+                <w:sz w:val="13"/>
+              </w:rPr>
+              <w:t>Wajib untuk bukti transparansi pengadaan barang/jasa pemerintah pada penilaian AKIP.</w:t>
+            </w:r>
+          </w:p>
+        </w:tc>
+      </w:tr>
+      <w:tr>
+        <w:tc>
+          <w:tcPr>
+            <w:tcW w:type="dxa" w:w="576"/>
+            <w:shd w:fill="FFFFFF"/>
+            <w:tcMar>
+              <w:top w:w="60" w:type="dxa"/>
+              <w:bottom w:w="60" w:type="dxa"/>
+              <w:left w:w="30" w:type="dxa"/>
+              <w:right w:w="30" w:type="dxa"/>
+            </w:tcMar>
+          </w:tcPr>
+          <w:p>
+            <w:pPr>
+              <w:jc w:val="center"/>
+            </w:pPr>
+            <w:r>
+              <w:rPr>
+                <w:b/>
+                <w:sz w:val="16"/>
+              </w:rPr>
+              <w:t>5</w:t>
+            </w:r>
+          </w:p>
+        </w:tc>
+        <w:tc>
+          <w:tcPr>
+            <w:tcW w:type="dxa" w:w="2592"/>
+            <w:shd w:fill="FFFFFF"/>
+            <w:tcMar>
+              <w:top w:w="60" w:type="dxa"/>
+              <w:bottom w:w="60" w:type="dxa"/>
+              <w:left w:w="40" w:type="dxa"/>
+              <w:right w:w="40" w:type="dxa"/>
+            </w:tcMar>
+          </w:tcPr>
+          <w:p>
+            <w:r>
+              <w:rPr>
+                <w:b/>
+                <w:color w:val="B91C1C"/>
+                <w:sz w:val="14"/>
+              </w:rPr>
+              <w:t>Indikator G.2 (Aset &amp; BMN)</w:t>
+            </w:r>
+          </w:p>
+        </w:tc>
+        <w:tc>
+          <w:tcPr>
+            <w:tcW w:type="dxa" w:w="4032"/>
+            <w:shd w:fill="FFFFFF"/>
+            <w:tcMar>
+              <w:top w:w="60" w:type="dxa"/>
+              <w:bottom w:w="60" w:type="dxa"/>
+              <w:left w:w="50" w:type="dxa"/>
+              <w:right w:w="50" w:type="dxa"/>
+            </w:tcMar>
+          </w:tcPr>
+          <w:p>
+            <w:r>
+              <w:rPr>
+                <w:b/>
+                <w:color w:val="002B5C"/>
+                <w:sz w:val="15"/>
+              </w:rPr>
+              <w:t>Buku Inventaris &amp; Laporan Posisi Barang Milik Negara (BMN) PKTJ Tegal Semester Terakhir</w:t>
+            </w:r>
+          </w:p>
+        </w:tc>
+        <w:tc>
+          <w:tcPr>
+            <w:tcW w:type="dxa" w:w="2880"/>
+            <w:shd w:fill="FFFFFF"/>
+            <w:tcMar>
+              <w:top w:w="60" w:type="dxa"/>
+              <w:bottom w:w="60" w:type="dxa"/>
+              <w:left w:w="40" w:type="dxa"/>
+              <w:right w:w="40" w:type="dxa"/>
+            </w:tcMar>
+          </w:tcPr>
+          <w:p>
+            <w:r>
+              <w:rPr>
+                <w:b/>
+                <w:color w:val="004A99"/>
+                <w:sz w:val="14"/>
+              </w:rPr>
+              <w:t>Subbag Umum &amp; Pengelola BMN</w:t>
+            </w:r>
+          </w:p>
+        </w:tc>
+        <w:tc>
+          <w:tcPr>
+            <w:tcW w:type="dxa" w:w="2592"/>
+            <w:shd w:fill="FFFFFF"/>
+            <w:tcMar>
+              <w:top w:w="60" w:type="dxa"/>
+              <w:bottom w:w="60" w:type="dxa"/>
+              <w:left w:w="40" w:type="dxa"/>
+              <w:right w:w="40" w:type="dxa"/>
+            </w:tcMar>
+          </w:tcPr>
+          <w:p>
+            <w:r>
+              <w:rPr>
+                <w:i/>
+                <w:sz w:val="14"/>
+              </w:rPr>
+              <w:t>PDF / Excel Laporan SIMAK-BMN / SAKTI</w:t>
+            </w:r>
+          </w:p>
+        </w:tc>
+        <w:tc>
+          <w:tcPr>
+            <w:tcW w:type="dxa" w:w="3168"/>
+            <w:shd w:fill="FFFFFF"/>
+            <w:tcMar>
+              <w:top w:w="60" w:type="dxa"/>
+              <w:bottom w:w="60" w:type="dxa"/>
+              <w:left w:w="40" w:type="dxa"/>
+              <w:right w:w="40" w:type="dxa"/>
+            </w:tcMar>
+          </w:tcPr>
+          <w:p>
+            <w:r>
+              <w:rPr>
+                <w:color w:val="475569"/>
+                <w:sz w:val="13"/>
+              </w:rPr>
+              <w:t>Diperlukan untuk pemenuhan kategori Informasi Setiap Saat daftar perbendaharaan/inventaris.</w:t>
+            </w:r>
+          </w:p>
+        </w:tc>
+      </w:tr>
+      <w:tr>
+        <w:tc>
+          <w:tcPr>
+            <w:tcW w:type="dxa" w:w="576"/>
+            <w:shd w:fill="FEF2F2"/>
+            <w:tcMar>
+              <w:top w:w="60" w:type="dxa"/>
+              <w:bottom w:w="60" w:type="dxa"/>
+              <w:left w:w="30" w:type="dxa"/>
+              <w:right w:w="30" w:type="dxa"/>
+            </w:tcMar>
+          </w:tcPr>
+          <w:p>
+            <w:pPr>
+              <w:jc w:val="center"/>
+            </w:pPr>
+            <w:r>
+              <w:rPr>
+                <w:b/>
+                <w:sz w:val="16"/>
+              </w:rPr>
+              <w:t>6</w:t>
+            </w:r>
+          </w:p>
+        </w:tc>
+        <w:tc>
+          <w:tcPr>
+            <w:tcW w:type="dxa" w:w="2592"/>
+            <w:shd w:fill="FEF2F2"/>
+            <w:tcMar>
+              <w:top w:w="60" w:type="dxa"/>
+              <w:bottom w:w="60" w:type="dxa"/>
+              <w:left w:w="40" w:type="dxa"/>
+              <w:right w:w="40" w:type="dxa"/>
+            </w:tcMar>
+          </w:tcPr>
+          <w:p>
+            <w:r>
+              <w:rPr>
+                <w:b/>
+                <w:color w:val="B91C1C"/>
+                <w:sz w:val="14"/>
+              </w:rPr>
+              <w:t>Indikator G.1 (DIP &amp; DIK 2026)</w:t>
+            </w:r>
+          </w:p>
+        </w:tc>
+        <w:tc>
+          <w:tcPr>
+            <w:tcW w:type="dxa" w:w="4032"/>
+            <w:shd w:fill="FEF2F2"/>
+            <w:tcMar>
+              <w:top w:w="60" w:type="dxa"/>
+              <w:bottom w:w="60" w:type="dxa"/>
+              <w:left w:w="50" w:type="dxa"/>
+              <w:right w:w="50" w:type="dxa"/>
+            </w:tcMar>
+          </w:tcPr>
+          <w:p>
+            <w:r>
+              <w:rPr>
+                <w:b/>
+                <w:color w:val="002B5C"/>
+                <w:sz w:val="15"/>
+              </w:rPr>
+              <w:t>Surat Keputusan Penetapan DIP &amp; DIK PKTJ Tahun 2026 yang Telah Ditandatangani Direktur</w:t>
+            </w:r>
+          </w:p>
+        </w:tc>
+        <w:tc>
+          <w:tcPr>
+            <w:tcW w:type="dxa" w:w="2880"/>
+            <w:shd w:fill="FEF2F2"/>
+            <w:tcMar>
+              <w:top w:w="60" w:type="dxa"/>
+              <w:bottom w:w="60" w:type="dxa"/>
+              <w:left w:w="40" w:type="dxa"/>
+              <w:right w:w="40" w:type="dxa"/>
+            </w:tcMar>
+          </w:tcPr>
+          <w:p>
+            <w:r>
+              <w:rPr>
+                <w:b/>
+                <w:color w:val="004A99"/>
+                <w:sz w:val="14"/>
+              </w:rPr>
+              <w:t>Pengelola PPID Pelaksana / Subbag Umum &amp; Humas</w:t>
+            </w:r>
+          </w:p>
+        </w:tc>
+        <w:tc>
+          <w:tcPr>
+            <w:tcW w:type="dxa" w:w="2592"/>
+            <w:shd w:fill="FEF2F2"/>
+            <w:tcMar>
+              <w:top w:w="60" w:type="dxa"/>
+              <w:bottom w:w="60" w:type="dxa"/>
+              <w:left w:w="40" w:type="dxa"/>
+              <w:right w:w="40" w:type="dxa"/>
+            </w:tcMar>
+          </w:tcPr>
+          <w:p>
+            <w:r>
+              <w:rPr>
+                <w:i/>
+                <w:sz w:val="14"/>
+              </w:rPr>
+              <w:t>PDF SK Penetapan Resmi Berstempel Basah / TTE</w:t>
+            </w:r>
+          </w:p>
+        </w:tc>
+        <w:tc>
+          <w:tcPr>
+            <w:tcW w:type="dxa" w:w="3168"/>
+            <w:shd w:fill="FEF2F2"/>
+            <w:tcMar>
+              <w:top w:w="60" w:type="dxa"/>
+              <w:bottom w:w="60" w:type="dxa"/>
+              <w:left w:w="40" w:type="dxa"/>
+              <w:right w:w="40" w:type="dxa"/>
+            </w:tcMar>
+          </w:tcPr>
+          <w:p>
+            <w:r>
+              <w:rPr>
+                <w:color w:val="475569"/>
+                <w:sz w:val="13"/>
+              </w:rPr>
+              <w:t>Instrumen wajib utama AKIP 2026 sebagai bukti penguasaan klasifikasi dokumen terbuka &amp; tertutup.</w:t>
+            </w:r>
+          </w:p>
+        </w:tc>
+      </w:tr>
+      <w:tr>
+        <w:tc>
+          <w:tcPr>
+            <w:tcW w:type="dxa" w:w="576"/>
+            <w:shd w:fill="FFFFFF"/>
+            <w:tcMar>
+              <w:top w:w="60" w:type="dxa"/>
+              <w:bottom w:w="60" w:type="dxa"/>
+              <w:left w:w="30" w:type="dxa"/>
+              <w:right w:w="30" w:type="dxa"/>
+            </w:tcMar>
+          </w:tcPr>
+          <w:p>
+            <w:pPr>
+              <w:jc w:val="center"/>
+            </w:pPr>
+            <w:r>
+              <w:rPr>
+                <w:b/>
+                <w:sz w:val="16"/>
+              </w:rPr>
+              <w:t>7</w:t>
+            </w:r>
+          </w:p>
+        </w:tc>
+        <w:tc>
+          <w:tcPr>
+            <w:tcW w:type="dxa" w:w="2592"/>
+            <w:shd w:fill="FFFFFF"/>
+            <w:tcMar>
+              <w:top w:w="60" w:type="dxa"/>
+              <w:bottom w:w="60" w:type="dxa"/>
+              <w:left w:w="40" w:type="dxa"/>
+              <w:right w:w="40" w:type="dxa"/>
+            </w:tcMar>
+          </w:tcPr>
+          <w:p>
+            <w:r>
+              <w:rPr>
+                <w:b/>
+                <w:color w:val="B91C1C"/>
+                <w:sz w:val="14"/>
+              </w:rPr>
+              <w:t>Indikator A.8 &amp; A.9 (Forum &amp; Monev)</w:t>
+            </w:r>
+          </w:p>
+        </w:tc>
+        <w:tc>
+          <w:tcPr>
+            <w:tcW w:type="dxa" w:w="4032"/>
+            <w:shd w:fill="FFFFFF"/>
+            <w:tcMar>
+              <w:top w:w="60" w:type="dxa"/>
+              <w:bottom w:w="60" w:type="dxa"/>
+              <w:left w:w="50" w:type="dxa"/>
+              <w:right w:w="50" w:type="dxa"/>
+            </w:tcMar>
+          </w:tcPr>
+          <w:p>
+            <w:r>
+              <w:rPr>
+                <w:b/>
+                <w:color w:val="002B5C"/>
+                <w:sz w:val="15"/>
+              </w:rPr>
+              <w:t>Notulensi Rapat Koordinasi PPID &amp; Sertifikat Keikutsertaan Monev Kemenhub 2025/2026</w:t>
+            </w:r>
+          </w:p>
+        </w:tc>
+        <w:tc>
+          <w:tcPr>
+            <w:tcW w:type="dxa" w:w="2880"/>
+            <w:shd w:fill="FFFFFF"/>
+            <w:tcMar>
+              <w:top w:w="60" w:type="dxa"/>
+              <w:bottom w:w="60" w:type="dxa"/>
+              <w:left w:w="40" w:type="dxa"/>
+              <w:right w:w="40" w:type="dxa"/>
+            </w:tcMar>
+          </w:tcPr>
+          <w:p>
+            <w:r>
+              <w:rPr>
+                <w:b/>
+                <w:color w:val="004A99"/>
+                <w:sz w:val="14"/>
+              </w:rPr>
+              <w:t>Humas PKTJ / Tim PPID</w:t>
+            </w:r>
+          </w:p>
+        </w:tc>
+        <w:tc>
+          <w:tcPr>
+            <w:tcW w:type="dxa" w:w="2592"/>
+            <w:shd w:fill="FFFFFF"/>
+            <w:tcMar>
+              <w:top w:w="60" w:type="dxa"/>
+              <w:bottom w:w="60" w:type="dxa"/>
+              <w:left w:w="40" w:type="dxa"/>
+              <w:right w:w="40" w:type="dxa"/>
+            </w:tcMar>
+          </w:tcPr>
+          <w:p>
+            <w:r>
+              <w:rPr>
+                <w:i/>
+                <w:sz w:val="14"/>
+              </w:rPr>
+              <w:t>PDF Notulensi + Foto Dokumentasi + Absensi</w:t>
+            </w:r>
+          </w:p>
+        </w:tc>
+        <w:tc>
+          <w:tcPr>
+            <w:tcW w:type="dxa" w:w="3168"/>
+            <w:shd w:fill="FFFFFF"/>
+            <w:tcMar>
+              <w:top w:w="60" w:type="dxa"/>
+              <w:bottom w:w="60" w:type="dxa"/>
+              <w:left w:w="40" w:type="dxa"/>
+              <w:right w:w="40" w:type="dxa"/>
+            </w:tcMar>
+          </w:tcPr>
+          <w:p>
+            <w:r>
+              <w:rPr>
+                <w:color w:val="475569"/>
+                <w:sz w:val="13"/>
+              </w:rPr>
+              <w:t>Bukti pelaksanaan forum koordinasi berkala dan partisipasi bimtek PPID Utama Kemenhub.</w:t>
             </w:r>
           </w:p>
         </w:tc>

</xml_diff>

<commit_message>
Implement dedicated AKIP indicator routes to auto-create and edit new AKIP items with exact titles and descriptions without modifying existing database rows
</commit_message>
<xml_diff>
--- a/FILE_2_PANDUAN_UPLOAD_WEBSITE_ADMIN_PANEL.docx
+++ b/FILE_2_PANDUAN_UPLOAD_WEBSITE_ADMIN_PANEL.docx
@@ -3224,21 +3224,8 @@
           </w:tcPr>
           <w:p>
             <w:r>
-              <w:rPr>
-                <w:b/>
-                <w:color w:val="004A99"/>
-                <w:sz w:val="13"/>
-                <w:u w:val="single"/>
-              </w:rPr>
-              <w:t>http://ppid.pktj.ac.id/admin/informasi/berkala/12/edit</w:t>
+              <w:t>http://ppid.pktj.ac.id/admin/akip/A8/edit</w:t>
               <w:br/>
-            </w:r>
-            <w:r>
-              <w:rPr>
-                <w:b/>
-                <w:color w:val="B91C1C"/>
-                <w:sz w:val="13"/>
-              </w:rPr>
               <w:t>Status Form: Form Judul/Deskripsi Sudah Terisi di Admin (Tinggal Tempel Link GDrive)</w:t>
             </w:r>
           </w:p>
@@ -3422,21 +3409,8 @@
           </w:tcPr>
           <w:p>
             <w:r>
-              <w:rPr>
-                <w:b/>
-                <w:color w:val="004A99"/>
-                <w:sz w:val="13"/>
-                <w:u w:val="single"/>
-              </w:rPr>
-              <w:t>http://ppid.pktj.ac.id/admin/informasi/berkala/12/edit</w:t>
+              <w:t>http://ppid.pktj.ac.id/admin/akip/A9/edit</w:t>
               <w:br/>
-            </w:r>
-            <w:r>
-              <w:rPr>
-                <w:b/>
-                <w:color w:val="B91C1C"/>
-                <w:sz w:val="13"/>
-              </w:rPr>
               <w:t>Status Form: Form Judul/Deskripsi Sudah Terisi di Admin (Tinggal Tempel Link GDrive)</w:t>
             </w:r>
           </w:p>
@@ -3742,21 +3716,8 @@
           </w:tcPr>
           <w:p>
             <w:r>
-              <w:rPr>
-                <w:b/>
-                <w:color w:val="004A99"/>
-                <w:sz w:val="13"/>
-                <w:u w:val="single"/>
-              </w:rPr>
-              <w:t>http://ppid.pktj.ac.id/admin/informasi/berkala/12/edit</w:t>
+              <w:t>http://ppid.pktj.ac.id/admin/akip/B1/edit</w:t>
               <w:br/>
-            </w:r>
-            <w:r>
-              <w:rPr>
-                <w:b/>
-                <w:color w:val="B91C1C"/>
-                <w:sz w:val="13"/>
-              </w:rPr>
               <w:t>Status Form: Form Judul/Deskripsi Sudah Terisi di Admin (Tinggal Tempel Link GDrive)</w:t>
             </w:r>
           </w:p>
@@ -4336,21 +4297,8 @@
           </w:tcPr>
           <w:p>
             <w:r>
-              <w:rPr>
-                <w:b/>
-                <w:color w:val="004A99"/>
-                <w:sz w:val="13"/>
-                <w:u w:val="single"/>
-              </w:rPr>
-              <w:t>http://ppid.pktj.ac.id/admin/informasi/setiap-saat/3/edit</w:t>
+              <w:t>http://ppid.pktj.ac.id/admin/akip/B4/edit</w:t>
               <w:br/>
-            </w:r>
-            <w:r>
-              <w:rPr>
-                <w:b/>
-                <w:color w:val="B91C1C"/>
-                <w:sz w:val="13"/>
-              </w:rPr>
               <w:t>Status Form: Form Judul/Deskripsi Sudah Terisi di Admin (Tinggal Tempel Link GDrive)</w:t>
             </w:r>
           </w:p>
@@ -4534,21 +4482,8 @@
           </w:tcPr>
           <w:p>
             <w:r>
-              <w:rPr>
-                <w:b/>
-                <w:color w:val="004A99"/>
-                <w:sz w:val="13"/>
-                <w:u w:val="single"/>
-              </w:rPr>
-              <w:t>http://ppid.pktj.ac.id/admin/informasi/berkala/6/edit</w:t>
+              <w:t>http://ppid.pktj.ac.id/admin/akip/B5/edit</w:t>
               <w:br/>
-            </w:r>
-            <w:r>
-              <w:rPr>
-                <w:b/>
-                <w:color w:val="B91C1C"/>
-                <w:sz w:val="13"/>
-              </w:rPr>
               <w:t>Status Form: Form Judul/Deskripsi Sudah Terisi di Admin (Tinggal Tempel Link GDrive)</w:t>
             </w:r>
           </w:p>
@@ -9774,22 +9709,9 @@
           </w:tcPr>
           <w:p>
             <w:r>
-              <w:rPr>
-                <w:b/>
-                <w:color w:val="004A99"/>
-                <w:sz w:val="13"/>
-                <w:u w:val="single"/>
-              </w:rPr>
-              <w:t>http://ppid.pktj.ac.id/admin/informasi/berkala/5/edit</w:t>
+              <w:t>http://ppid.pktj.ac.id/admin/akip/F1/edit</w:t>
               <w:br/>
-            </w:r>
-            <w:r>
-              <w:rPr>
-                <w:b/>
-                <w:color w:val="16A34A"/>
-                <w:sz w:val="13"/>
-              </w:rPr>
-              <w:t>Status Form: Siap Tayang di Website</w:t>
+              <w:t>Status Form: Form Judul/Deskripsi Sudah Terisi di Admin (Tinggal Tempel Link GDrive)</w:t>
             </w:r>
           </w:p>
         </w:tc>
@@ -9972,22 +9894,9 @@
           </w:tcPr>
           <w:p>
             <w:r>
-              <w:rPr>
-                <w:b/>
-                <w:color w:val="004A99"/>
-                <w:sz w:val="13"/>
-                <w:u w:val="single"/>
-              </w:rPr>
-              <w:t>http://ppid.pktj.ac.id/admin/informasi/berkala/6/edit</w:t>
+              <w:t>http://ppid.pktj.ac.id/admin/akip/F2/edit</w:t>
               <w:br/>
-            </w:r>
-            <w:r>
-              <w:rPr>
-                <w:b/>
-                <w:color w:val="16A34A"/>
-                <w:sz w:val="13"/>
-              </w:rPr>
-              <w:t>Status Form: Siap Tayang di Website</w:t>
+              <w:t>Status Form: Form Judul/Deskripsi Sudah Terisi di Admin (Tinggal Tempel Link GDrive)</w:t>
             </w:r>
           </w:p>
         </w:tc>
@@ -10368,21 +10277,8 @@
           </w:tcPr>
           <w:p>
             <w:r>
-              <w:rPr>
-                <w:b/>
-                <w:color w:val="004A99"/>
-                <w:sz w:val="13"/>
-                <w:u w:val="single"/>
-              </w:rPr>
-              <w:t>http://ppid.pktj.ac.id/admin/informasi/berkala/7/edit</w:t>
+              <w:t>http://ppid.pktj.ac.id/admin/akip/F4/edit</w:t>
               <w:br/>
-            </w:r>
-            <w:r>
-              <w:rPr>
-                <w:b/>
-                <w:color w:val="B91C1C"/>
-                <w:sz w:val="13"/>
-              </w:rPr>
               <w:t>Status Form: Form Judul/Deskripsi Sudah Terisi di Admin (Tinggal Tempel Link GDrive)</w:t>
             </w:r>
           </w:p>
@@ -10566,21 +10462,8 @@
           </w:tcPr>
           <w:p>
             <w:r>
-              <w:rPr>
-                <w:b/>
-                <w:color w:val="004A99"/>
-                <w:sz w:val="13"/>
-                <w:u w:val="single"/>
-              </w:rPr>
-              <w:t>http://ppid.pktj.ac.id/admin/informasi/berkala/8/edit</w:t>
+              <w:t>http://ppid.pktj.ac.id/admin/akip/F5/edit</w:t>
               <w:br/>
-            </w:r>
-            <w:r>
-              <w:rPr>
-                <w:b/>
-                <w:color w:val="B91C1C"/>
-                <w:sz w:val="13"/>
-              </w:rPr>
               <w:t>Status Form: Form Judul/Deskripsi Sudah Terisi di Admin (Tinggal Tempel Link GDrive)</w:t>
             </w:r>
           </w:p>
@@ -10764,21 +10647,8 @@
           </w:tcPr>
           <w:p>
             <w:r>
-              <w:rPr>
-                <w:b/>
-                <w:color w:val="004A99"/>
-                <w:sz w:val="13"/>
-                <w:u w:val="single"/>
-              </w:rPr>
-              <w:t>http://ppid.pktj.ac.id/admin/informasi/berkala/9/edit</w:t>
+              <w:t>http://ppid.pktj.ac.id/admin/akip/F6/edit</w:t>
               <w:br/>
-            </w:r>
-            <w:r>
-              <w:rPr>
-                <w:b/>
-                <w:color w:val="B91C1C"/>
-                <w:sz w:val="13"/>
-              </w:rPr>
               <w:t>Status Form: Form Judul/Deskripsi Sudah Terisi di Admin (Tinggal Tempel Link GDrive)</w:t>
             </w:r>
           </w:p>
@@ -10962,21 +10832,8 @@
           </w:tcPr>
           <w:p>
             <w:r>
-              <w:rPr>
-                <w:b/>
-                <w:color w:val="004A99"/>
-                <w:sz w:val="13"/>
-                <w:u w:val="single"/>
-              </w:rPr>
-              <w:t>http://ppid.pktj.ac.id/admin/informasi/berkala/10/edit</w:t>
+              <w:t>http://ppid.pktj.ac.id/admin/akip/F7/edit</w:t>
               <w:br/>
-            </w:r>
-            <w:r>
-              <w:rPr>
-                <w:b/>
-                <w:color w:val="B91C1C"/>
-                <w:sz w:val="13"/>
-              </w:rPr>
               <w:t>Status Form: Form Judul/Deskripsi Sudah Terisi di Admin (Tinggal Tempel Link GDrive)</w:t>
             </w:r>
           </w:p>
@@ -11160,21 +11017,8 @@
           </w:tcPr>
           <w:p>
             <w:r>
-              <w:rPr>
-                <w:b/>
-                <w:color w:val="004A99"/>
-                <w:sz w:val="13"/>
-                <w:u w:val="single"/>
-              </w:rPr>
-              <w:t>http://ppid.pktj.ac.id/admin/informasi/berkala/11/edit</w:t>
+              <w:t>http://ppid.pktj.ac.id/admin/akip/F8/edit</w:t>
               <w:br/>
-            </w:r>
-            <w:r>
-              <w:rPr>
-                <w:b/>
-                <w:color w:val="B91C1C"/>
-                <w:sz w:val="13"/>
-              </w:rPr>
               <w:t>Status Form: Form Judul/Deskripsi Sudah Terisi di Admin (Tinggal Tempel Link GDrive)</w:t>
             </w:r>
           </w:p>
@@ -11358,21 +11202,8 @@
           </w:tcPr>
           <w:p>
             <w:r>
-              <w:rPr>
-                <w:b/>
-                <w:color w:val="004A99"/>
-                <w:sz w:val="13"/>
-                <w:u w:val="single"/>
-              </w:rPr>
-              <w:t>http://ppid.pktj.ac.id/admin/informasi/berkala/13/edit</w:t>
+              <w:t>http://ppid.pktj.ac.id/admin/akip/F9/edit</w:t>
               <w:br/>
-            </w:r>
-            <w:r>
-              <w:rPr>
-                <w:b/>
-                <w:color w:val="B91C1C"/>
-                <w:sz w:val="13"/>
-              </w:rPr>
               <w:t>Status Form: Form Judul/Deskripsi Sudah Terisi di Admin (Tinggal Tempel Link GDrive)</w:t>
             </w:r>
           </w:p>
@@ -11556,21 +11387,8 @@
           </w:tcPr>
           <w:p>
             <w:r>
-              <w:rPr>
-                <w:b/>
-                <w:color w:val="004A99"/>
-                <w:sz w:val="13"/>
-                <w:u w:val="single"/>
-              </w:rPr>
-              <w:t>http://ppid.pktj.ac.id/admin/informasi/berkala/14/edit</w:t>
+              <w:t>http://ppid.pktj.ac.id/admin/akip/F10/edit</w:t>
               <w:br/>
-            </w:r>
-            <w:r>
-              <w:rPr>
-                <w:b/>
-                <w:color w:val="B91C1C"/>
-                <w:sz w:val="13"/>
-              </w:rPr>
               <w:t>Status Form: Form Judul/Deskripsi Sudah Terisi di Admin (Tinggal Tempel Link GDrive)</w:t>
             </w:r>
           </w:p>
@@ -11876,21 +11694,8 @@
           </w:tcPr>
           <w:p>
             <w:r>
-              <w:rPr>
-                <w:b/>
-                <w:color w:val="004A99"/>
-                <w:sz w:val="13"/>
-                <w:u w:val="single"/>
-              </w:rPr>
-              <w:t>http://ppid.pktj.ac.id/admin/informasi/setiap-saat/3/edit</w:t>
+              <w:t>http://ppid.pktj.ac.id/admin/akip/G1/edit</w:t>
               <w:br/>
-            </w:r>
-            <w:r>
-              <w:rPr>
-                <w:b/>
-                <w:color w:val="B91C1C"/>
-                <w:sz w:val="13"/>
-              </w:rPr>
               <w:t>Status Form: Form Judul/Deskripsi Sudah Terisi di Admin (Tinggal Tempel Link GDrive)</w:t>
             </w:r>
           </w:p>
@@ -12074,21 +11879,8 @@
           </w:tcPr>
           <w:p>
             <w:r>
-              <w:rPr>
-                <w:b/>
-                <w:color w:val="004A99"/>
-                <w:sz w:val="13"/>
-                <w:u w:val="single"/>
-              </w:rPr>
-              <w:t>http://ppid.pktj.ac.id/admin/informasi/setiap-saat/6/edit</w:t>
+              <w:t>http://ppid.pktj.ac.id/admin/akip/G2/edit</w:t>
               <w:br/>
-            </w:r>
-            <w:r>
-              <w:rPr>
-                <w:b/>
-                <w:color w:val="B91C1C"/>
-                <w:sz w:val="13"/>
-              </w:rPr>
               <w:t>Status Form: Form Judul/Deskripsi Sudah Terisi di Admin (Tinggal Tempel Link GDrive)</w:t>
             </w:r>
           </w:p>
@@ -12272,21 +12064,8 @@
           </w:tcPr>
           <w:p>
             <w:r>
-              <w:rPr>
-                <w:b/>
-                <w:color w:val="004A99"/>
-                <w:sz w:val="13"/>
-                <w:u w:val="single"/>
-              </w:rPr>
-              <w:t>http://ppid.pktj.ac.id/admin/informasi/setiap-saat/5/edit</w:t>
+              <w:t>http://ppid.pktj.ac.id/admin/akip/G3/edit</w:t>
               <w:br/>
-            </w:r>
-            <w:r>
-              <w:rPr>
-                <w:b/>
-                <w:color w:val="B91C1C"/>
-                <w:sz w:val="13"/>
-              </w:rPr>
               <w:t>Status Form: Form Judul/Deskripsi Sudah Terisi di Admin (Tinggal Tempel Link GDrive)</w:t>
             </w:r>
           </w:p>
@@ -12592,21 +12371,8 @@
           </w:tcPr>
           <w:p>
             <w:r>
-              <w:rPr>
-                <w:b/>
-                <w:color w:val="004A99"/>
-                <w:sz w:val="13"/>
-                <w:u w:val="single"/>
-              </w:rPr>
-              <w:t>http://ppid.pktj.ac.id/admin/informasi/serta-merta/3/edit</w:t>
+              <w:t>http://ppid.pktj.ac.id/admin/akip/H1/edit</w:t>
               <w:br/>
-            </w:r>
-            <w:r>
-              <w:rPr>
-                <w:b/>
-                <w:color w:val="B91C1C"/>
-                <w:sz w:val="13"/>
-              </w:rPr>
               <w:t>Status Form: Form Judul/Deskripsi Sudah Terisi di Admin (Tinggal Tempel Link GDrive)</w:t>
             </w:r>
           </w:p>
@@ -12790,21 +12556,8 @@
           </w:tcPr>
           <w:p>
             <w:r>
-              <w:rPr>
-                <w:b/>
-                <w:color w:val="004A99"/>
-                <w:sz w:val="13"/>
-                <w:u w:val="single"/>
-              </w:rPr>
-              <w:t>http://ppid.pktj.ac.id/admin/informasi/serta-merta/4/edit</w:t>
+              <w:t>http://ppid.pktj.ac.id/admin/akip/H2/edit</w:t>
               <w:br/>
-            </w:r>
-            <w:r>
-              <w:rPr>
-                <w:b/>
-                <w:color w:val="B91C1C"/>
-                <w:sz w:val="13"/>
-              </w:rPr>
               <w:t>Status Form: Form Judul/Deskripsi Sudah Terisi di Admin (Tinggal Tempel Link GDrive)</w:t>
             </w:r>
           </w:p>
@@ -12988,21 +12741,8 @@
           </w:tcPr>
           <w:p>
             <w:r>
-              <w:rPr>
-                <w:b/>
-                <w:color w:val="004A99"/>
-                <w:sz w:val="13"/>
-                <w:u w:val="single"/>
-              </w:rPr>
-              <w:t>http://ppid.pktj.ac.id/admin/informasi/serta-merta/5/edit</w:t>
+              <w:t>http://ppid.pktj.ac.id/admin/akip/H3/edit</w:t>
               <w:br/>
-            </w:r>
-            <w:r>
-              <w:rPr>
-                <w:b/>
-                <w:color w:val="B91C1C"/>
-                <w:sz w:val="13"/>
-              </w:rPr>
               <w:t>Status Form: Form Judul/Deskripsi Sudah Terisi di Admin (Tinggal Tempel Link GDrive)</w:t>
             </w:r>
           </w:p>

</xml_diff>

<commit_message>
Update all Word document links to clickable hyperlinks with dedicated AKIP indicator URLs
</commit_message>
<xml_diff>
--- a/FILE_2_PANDUAN_UPLOAD_WEBSITE_ADMIN_PANEL.docx
+++ b/FILE_2_PANDUAN_UPLOAD_WEBSITE_ADMIN_PANEL.docx
@@ -1837,22 +1837,24 @@
             </w:tcMar>
           </w:tcPr>
           <w:p>
-            <w:r>
-              <w:rPr>
-                <w:b/>
-                <w:color w:val="004A99"/>
-                <w:sz w:val="13"/>
-                <w:u w:val="single"/>
-              </w:rPr>
-              <w:t>http://ppid.pktj.ac.id/admin/regulasi</w:t>
+            <w:r/>
+            <w:hyperlink r:id="rId9" w:history="1">
+              <w:r>
+                <w:rPr>
+                  <w:color w:val="004B87"/>
+                  <w:u w:val="single"/>
+                  <w:b/>
+                  <w:sz w:val="18"/>
+                </w:rPr>
+                <w:t>http://ppid.pktj.ac.id/admin/regulasi</w:t>
+              </w:r>
+            </w:hyperlink>
+            <w:r>
+              <w:rPr>
+                <w:color w:val="007832"/>
+                <w:sz w:val="17"/>
+              </w:rPr>
               <w:br/>
-            </w:r>
-            <w:r>
-              <w:rPr>
-                <w:b/>
-                <w:color w:val="16A34A"/>
-                <w:sz w:val="13"/>
-              </w:rPr>
               <w:t>Status Form: Siap Tayang di Website</w:t>
             </w:r>
           </w:p>
@@ -2035,22 +2037,24 @@
             </w:tcMar>
           </w:tcPr>
           <w:p>
-            <w:r>
-              <w:rPr>
-                <w:b/>
-                <w:color w:val="004A99"/>
-                <w:sz w:val="13"/>
-                <w:u w:val="single"/>
-              </w:rPr>
-              <w:t>http://ppid.pktj.ac.id/admin/regulasi</w:t>
+            <w:r/>
+            <w:hyperlink r:id="rId9" w:history="1">
+              <w:r>
+                <w:rPr>
+                  <w:color w:val="004B87"/>
+                  <w:u w:val="single"/>
+                  <w:b/>
+                  <w:sz w:val="18"/>
+                </w:rPr>
+                <w:t>http://ppid.pktj.ac.id/admin/regulasi</w:t>
+              </w:r>
+            </w:hyperlink>
+            <w:r>
+              <w:rPr>
+                <w:color w:val="007832"/>
+                <w:sz w:val="17"/>
+              </w:rPr>
               <w:br/>
-            </w:r>
-            <w:r>
-              <w:rPr>
-                <w:b/>
-                <w:color w:val="16A34A"/>
-                <w:sz w:val="13"/>
-              </w:rPr>
               <w:t>Status Form: Siap Tayang di Website</w:t>
             </w:r>
           </w:p>
@@ -2233,22 +2237,24 @@
             </w:tcMar>
           </w:tcPr>
           <w:p>
-            <w:r>
-              <w:rPr>
-                <w:b/>
-                <w:color w:val="004A99"/>
-                <w:sz w:val="13"/>
-                <w:u w:val="single"/>
-              </w:rPr>
-              <w:t>http://ppid.pktj.ac.id/admin/regulasi</w:t>
+            <w:r/>
+            <w:hyperlink r:id="rId9" w:history="1">
+              <w:r>
+                <w:rPr>
+                  <w:color w:val="004B87"/>
+                  <w:u w:val="single"/>
+                  <w:b/>
+                  <w:sz w:val="18"/>
+                </w:rPr>
+                <w:t>http://ppid.pktj.ac.id/admin/regulasi</w:t>
+              </w:r>
+            </w:hyperlink>
+            <w:r>
+              <w:rPr>
+                <w:color w:val="007832"/>
+                <w:sz w:val="17"/>
+              </w:rPr>
               <w:br/>
-            </w:r>
-            <w:r>
-              <w:rPr>
-                <w:b/>
-                <w:color w:val="16A34A"/>
-                <w:sz w:val="13"/>
-              </w:rPr>
               <w:t>Status Form: Siap Tayang di Website</w:t>
             </w:r>
           </w:p>
@@ -2431,22 +2437,24 @@
             </w:tcMar>
           </w:tcPr>
           <w:p>
-            <w:r>
-              <w:rPr>
-                <w:b/>
-                <w:color w:val="004A99"/>
-                <w:sz w:val="13"/>
-                <w:u w:val="single"/>
-              </w:rPr>
-              <w:t>http://ppid.pktj.ac.id/admin/profil/edit/profil_singkat</w:t>
+            <w:r/>
+            <w:hyperlink r:id="rId10" w:history="1">
+              <w:r>
+                <w:rPr>
+                  <w:color w:val="004B87"/>
+                  <w:u w:val="single"/>
+                  <w:b/>
+                  <w:sz w:val="18"/>
+                </w:rPr>
+                <w:t>http://ppid.pktj.ac.id/admin/profil/edit/profil_singkat</w:t>
+              </w:r>
+            </w:hyperlink>
+            <w:r>
+              <w:rPr>
+                <w:color w:val="007832"/>
+                <w:sz w:val="17"/>
+              </w:rPr>
               <w:br/>
-            </w:r>
-            <w:r>
-              <w:rPr>
-                <w:b/>
-                <w:color w:val="16A34A"/>
-                <w:sz w:val="13"/>
-              </w:rPr>
               <w:t>Status Form: Siap Tayang di Website</w:t>
             </w:r>
           </w:p>
@@ -2629,22 +2637,24 @@
             </w:tcMar>
           </w:tcPr>
           <w:p>
-            <w:r>
-              <w:rPr>
-                <w:b/>
-                <w:color w:val="004A99"/>
-                <w:sz w:val="13"/>
-                <w:u w:val="single"/>
-              </w:rPr>
-              <w:t>http://ppid.pktj.ac.id/admin/profil/edit/tugas_fungsi</w:t>
+            <w:r/>
+            <w:hyperlink r:id="rId11" w:history="1">
+              <w:r>
+                <w:rPr>
+                  <w:color w:val="004B87"/>
+                  <w:u w:val="single"/>
+                  <w:b/>
+                  <w:sz w:val="18"/>
+                </w:rPr>
+                <w:t>http://ppid.pktj.ac.id/admin/profil/edit/tugas_fungsi</w:t>
+              </w:r>
+            </w:hyperlink>
+            <w:r>
+              <w:rPr>
+                <w:color w:val="007832"/>
+                <w:sz w:val="17"/>
+              </w:rPr>
               <w:br/>
-            </w:r>
-            <w:r>
-              <w:rPr>
-                <w:b/>
-                <w:color w:val="16A34A"/>
-                <w:sz w:val="13"/>
-              </w:rPr>
               <w:t>Status Form: Siap Tayang di Website</w:t>
             </w:r>
           </w:p>
@@ -2827,22 +2837,24 @@
             </w:tcMar>
           </w:tcPr>
           <w:p>
-            <w:r>
-              <w:rPr>
-                <w:b/>
-                <w:color w:val="004A99"/>
-                <w:sz w:val="13"/>
-                <w:u w:val="single"/>
-              </w:rPr>
-              <w:t>http://ppid.pktj.ac.id/admin/profil/edit/struktur_organisasi</w:t>
+            <w:r/>
+            <w:hyperlink r:id="rId12" w:history="1">
+              <w:r>
+                <w:rPr>
+                  <w:color w:val="004B87"/>
+                  <w:u w:val="single"/>
+                  <w:b/>
+                  <w:sz w:val="18"/>
+                </w:rPr>
+                <w:t>http://ppid.pktj.ac.id/admin/profil/edit/struktur_organisasi</w:t>
+              </w:r>
+            </w:hyperlink>
+            <w:r>
+              <w:rPr>
+                <w:color w:val="007832"/>
+                <w:sz w:val="17"/>
+              </w:rPr>
               <w:br/>
-            </w:r>
-            <w:r>
-              <w:rPr>
-                <w:b/>
-                <w:color w:val="16A34A"/>
-                <w:sz w:val="13"/>
-              </w:rPr>
               <w:t>Status Form: Siap Tayang di Website</w:t>
             </w:r>
           </w:p>
@@ -3025,22 +3037,24 @@
             </w:tcMar>
           </w:tcPr>
           <w:p>
-            <w:r>
-              <w:rPr>
-                <w:b/>
-                <w:color w:val="004A99"/>
-                <w:sz w:val="13"/>
-                <w:u w:val="single"/>
-              </w:rPr>
-              <w:t>http://ppid.pktj.ac.id/admin/profil/edit/visi_misi</w:t>
+            <w:r/>
+            <w:hyperlink r:id="rId13" w:history="1">
+              <w:r>
+                <w:rPr>
+                  <w:color w:val="004B87"/>
+                  <w:u w:val="single"/>
+                  <w:b/>
+                  <w:sz w:val="18"/>
+                </w:rPr>
+                <w:t>http://ppid.pktj.ac.id/admin/profil/edit/visi_misi</w:t>
+              </w:r>
+            </w:hyperlink>
+            <w:r>
+              <w:rPr>
+                <w:color w:val="007832"/>
+                <w:sz w:val="17"/>
+              </w:rPr>
               <w:br/>
-            </w:r>
-            <w:r>
-              <w:rPr>
-                <w:b/>
-                <w:color w:val="16A34A"/>
-                <w:sz w:val="13"/>
-              </w:rPr>
               <w:t>Status Form: Siap Tayang di Website</w:t>
             </w:r>
           </w:p>
@@ -3223,8 +3237,24 @@
             </w:tcMar>
           </w:tcPr>
           <w:p>
-            <w:r>
-              <w:t>http://ppid.pktj.ac.id/admin/akip/A8/edit</w:t>
+            <w:r/>
+            <w:hyperlink r:id="rId14" w:history="1">
+              <w:r>
+                <w:rPr>
+                  <w:color w:val="004B87"/>
+                  <w:u w:val="single"/>
+                  <w:b/>
+                  <w:sz w:val="18"/>
+                </w:rPr>
+                <w:t>http://ppid.pktj.ac.id/admin/akip/A8/edit</w:t>
+              </w:r>
+            </w:hyperlink>
+            <w:r>
+              <w:rPr>
+                <w:b/>
+                <w:color w:val="B42800"/>
+                <w:sz w:val="17"/>
+              </w:rPr>
               <w:br/>
               <w:t>Status Form: Form Judul/Deskripsi Sudah Terisi di Admin (Tinggal Tempel Link GDrive)</w:t>
             </w:r>
@@ -3408,8 +3438,24 @@
             </w:tcMar>
           </w:tcPr>
           <w:p>
-            <w:r>
-              <w:t>http://ppid.pktj.ac.id/admin/akip/A9/edit</w:t>
+            <w:r/>
+            <w:hyperlink r:id="rId15" w:history="1">
+              <w:r>
+                <w:rPr>
+                  <w:color w:val="004B87"/>
+                  <w:u w:val="single"/>
+                  <w:b/>
+                  <w:sz w:val="18"/>
+                </w:rPr>
+                <w:t>http://ppid.pktj.ac.id/admin/akip/A9/edit</w:t>
+              </w:r>
+            </w:hyperlink>
+            <w:r>
+              <w:rPr>
+                <w:b/>
+                <w:color w:val="B42800"/>
+                <w:sz w:val="17"/>
+              </w:rPr>
               <w:br/>
               <w:t>Status Form: Form Judul/Deskripsi Sudah Terisi di Admin (Tinggal Tempel Link GDrive)</w:t>
             </w:r>
@@ -3715,8 +3761,24 @@
             </w:tcMar>
           </w:tcPr>
           <w:p>
-            <w:r>
-              <w:t>http://ppid.pktj.ac.id/admin/akip/B1/edit</w:t>
+            <w:r/>
+            <w:hyperlink r:id="rId16" w:history="1">
+              <w:r>
+                <w:rPr>
+                  <w:color w:val="004B87"/>
+                  <w:u w:val="single"/>
+                  <w:b/>
+                  <w:sz w:val="18"/>
+                </w:rPr>
+                <w:t>http://ppid.pktj.ac.id/admin/akip/B1/edit</w:t>
+              </w:r>
+            </w:hyperlink>
+            <w:r>
+              <w:rPr>
+                <w:b/>
+                <w:color w:val="B42800"/>
+                <w:sz w:val="17"/>
+              </w:rPr>
               <w:br/>
               <w:t>Status Form: Form Judul/Deskripsi Sudah Terisi di Admin (Tinggal Tempel Link GDrive)</w:t>
             </w:r>
@@ -3900,22 +3962,24 @@
             </w:tcMar>
           </w:tcPr>
           <w:p>
-            <w:r>
-              <w:rPr>
-                <w:b/>
-                <w:color w:val="004A99"/>
-                <w:sz w:val="13"/>
-                <w:u w:val="single"/>
-              </w:rPr>
-              <w:t>http://ppid.pktj.ac.id/admin/layanan/laporan-layanan</w:t>
+            <w:r/>
+            <w:hyperlink r:id="rId17" w:history="1">
+              <w:r>
+                <w:rPr>
+                  <w:color w:val="004B87"/>
+                  <w:u w:val="single"/>
+                  <w:b/>
+                  <w:sz w:val="18"/>
+                </w:rPr>
+                <w:t>http://ppid.pktj.ac.id/admin/layanan/laporan-layanan</w:t>
+              </w:r>
+            </w:hyperlink>
+            <w:r>
+              <w:rPr>
+                <w:color w:val="007832"/>
+                <w:sz w:val="17"/>
+              </w:rPr>
               <w:br/>
-            </w:r>
-            <w:r>
-              <w:rPr>
-                <w:b/>
-                <w:color w:val="16A34A"/>
-                <w:sz w:val="13"/>
-              </w:rPr>
               <w:t>Status Form: Siap Tayang di Website</w:t>
             </w:r>
           </w:p>
@@ -4098,22 +4162,24 @@
             </w:tcMar>
           </w:tcPr>
           <w:p>
-            <w:r>
-              <w:rPr>
-                <w:b/>
-                <w:color w:val="004A99"/>
-                <w:sz w:val="13"/>
-                <w:u w:val="single"/>
-              </w:rPr>
-              <w:t>http://ppid.pktj.ac.id/admin/prosedur/sop-sengketa</w:t>
+            <w:r/>
+            <w:hyperlink r:id="rId18" w:history="1">
+              <w:r>
+                <w:rPr>
+                  <w:color w:val="004B87"/>
+                  <w:u w:val="single"/>
+                  <w:b/>
+                  <w:sz w:val="18"/>
+                </w:rPr>
+                <w:t>http://ppid.pktj.ac.id/admin/prosedur/sop-sengketa</w:t>
+              </w:r>
+            </w:hyperlink>
+            <w:r>
+              <w:rPr>
+                <w:color w:val="007832"/>
+                <w:sz w:val="17"/>
+              </w:rPr>
               <w:br/>
-            </w:r>
-            <w:r>
-              <w:rPr>
-                <w:b/>
-                <w:color w:val="16A34A"/>
-                <w:sz w:val="13"/>
-              </w:rPr>
               <w:t>Status Form: Siap Tayang di Website</w:t>
             </w:r>
           </w:p>
@@ -4296,8 +4362,24 @@
             </w:tcMar>
           </w:tcPr>
           <w:p>
-            <w:r>
-              <w:t>http://ppid.pktj.ac.id/admin/akip/B4/edit</w:t>
+            <w:r/>
+            <w:hyperlink r:id="rId19" w:history="1">
+              <w:r>
+                <w:rPr>
+                  <w:color w:val="004B87"/>
+                  <w:u w:val="single"/>
+                  <w:b/>
+                  <w:sz w:val="18"/>
+                </w:rPr>
+                <w:t>http://ppid.pktj.ac.id/admin/akip/B4/edit</w:t>
+              </w:r>
+            </w:hyperlink>
+            <w:r>
+              <w:rPr>
+                <w:b/>
+                <w:color w:val="B42800"/>
+                <w:sz w:val="17"/>
+              </w:rPr>
               <w:br/>
               <w:t>Status Form: Form Judul/Deskripsi Sudah Terisi di Admin (Tinggal Tempel Link GDrive)</w:t>
             </w:r>
@@ -4481,8 +4563,24 @@
             </w:tcMar>
           </w:tcPr>
           <w:p>
-            <w:r>
-              <w:t>http://ppid.pktj.ac.id/admin/akip/B5/edit</w:t>
+            <w:r/>
+            <w:hyperlink r:id="rId20" w:history="1">
+              <w:r>
+                <w:rPr>
+                  <w:color w:val="004B87"/>
+                  <w:u w:val="single"/>
+                  <w:b/>
+                  <w:sz w:val="18"/>
+                </w:rPr>
+                <w:t>http://ppid.pktj.ac.id/admin/akip/B5/edit</w:t>
+              </w:r>
+            </w:hyperlink>
+            <w:r>
+              <w:rPr>
+                <w:b/>
+                <w:color w:val="B42800"/>
+                <w:sz w:val="17"/>
+              </w:rPr>
               <w:br/>
               <w:t>Status Form: Form Judul/Deskripsi Sudah Terisi di Admin (Tinggal Tempel Link GDrive)</w:t>
             </w:r>
@@ -4788,22 +4886,24 @@
             </w:tcMar>
           </w:tcPr>
           <w:p>
-            <w:r>
-              <w:rPr>
-                <w:b/>
-                <w:color w:val="004A99"/>
-                <w:sz w:val="13"/>
-                <w:u w:val="single"/>
-              </w:rPr>
-              <w:t>http://ppid.pktj.ac.id/admin/layanan/maklumat-pelayanan</w:t>
+            <w:r/>
+            <w:hyperlink r:id="rId21" w:history="1">
+              <w:r>
+                <w:rPr>
+                  <w:color w:val="004B87"/>
+                  <w:u w:val="single"/>
+                  <w:b/>
+                  <w:sz w:val="18"/>
+                </w:rPr>
+                <w:t>http://ppid.pktj.ac.id/admin/layanan/maklumat-pelayanan</w:t>
+              </w:r>
+            </w:hyperlink>
+            <w:r>
+              <w:rPr>
+                <w:color w:val="007832"/>
+                <w:sz w:val="17"/>
+              </w:rPr>
               <w:br/>
-            </w:r>
-            <w:r>
-              <w:rPr>
-                <w:b/>
-                <w:color w:val="16A34A"/>
-                <w:sz w:val="13"/>
-              </w:rPr>
               <w:t>Status Form: Siap Tayang di Website</w:t>
             </w:r>
           </w:p>
@@ -4986,22 +5086,24 @@
             </w:tcMar>
           </w:tcPr>
           <w:p>
-            <w:r>
-              <w:rPr>
-                <w:b/>
-                <w:color w:val="004A99"/>
-                <w:sz w:val="13"/>
-                <w:u w:val="single"/>
-              </w:rPr>
-              <w:t>http://ppid.pktj.ac.id/admin/prosedur/sop-permintaan</w:t>
+            <w:r/>
+            <w:hyperlink r:id="rId22" w:history="1">
+              <w:r>
+                <w:rPr>
+                  <w:color w:val="004B87"/>
+                  <w:u w:val="single"/>
+                  <w:b/>
+                  <w:sz w:val="18"/>
+                </w:rPr>
+                <w:t>http://ppid.pktj.ac.id/admin/prosedur/sop-permintaan</w:t>
+              </w:r>
+            </w:hyperlink>
+            <w:r>
+              <w:rPr>
+                <w:color w:val="007832"/>
+                <w:sz w:val="17"/>
+              </w:rPr>
               <w:br/>
-            </w:r>
-            <w:r>
-              <w:rPr>
-                <w:b/>
-                <w:color w:val="16A34A"/>
-                <w:sz w:val="13"/>
-              </w:rPr>
               <w:t>Status Form: Siap Tayang di Website</w:t>
             </w:r>
           </w:p>
@@ -5184,22 +5286,24 @@
             </w:tcMar>
           </w:tcPr>
           <w:p>
-            <w:r>
-              <w:rPr>
-                <w:b/>
-                <w:color w:val="004A99"/>
-                <w:sz w:val="13"/>
-                <w:u w:val="single"/>
-              </w:rPr>
-              <w:t>http://ppid.pktj.ac.id/admin/layanan/laporan-layanan</w:t>
+            <w:r/>
+            <w:hyperlink r:id="rId17" w:history="1">
+              <w:r>
+                <w:rPr>
+                  <w:color w:val="004B87"/>
+                  <w:u w:val="single"/>
+                  <w:b/>
+                  <w:sz w:val="18"/>
+                </w:rPr>
+                <w:t>http://ppid.pktj.ac.id/admin/layanan/laporan-layanan</w:t>
+              </w:r>
+            </w:hyperlink>
+            <w:r>
+              <w:rPr>
+                <w:color w:val="007832"/>
+                <w:sz w:val="17"/>
+              </w:rPr>
               <w:br/>
-            </w:r>
-            <w:r>
-              <w:rPr>
-                <w:b/>
-                <w:color w:val="16A34A"/>
-                <w:sz w:val="13"/>
-              </w:rPr>
               <w:t>Status Form: Siap Tayang di Website</w:t>
             </w:r>
           </w:p>
@@ -5382,22 +5486,24 @@
             </w:tcMar>
           </w:tcPr>
           <w:p>
-            <w:r>
-              <w:rPr>
-                <w:b/>
-                <w:color w:val="004A99"/>
-                <w:sz w:val="13"/>
-                <w:u w:val="single"/>
-              </w:rPr>
-              <w:t>http://ppid.pktj.ac.id/admin/layanan/maklumat-pelayanan</w:t>
+            <w:r/>
+            <w:hyperlink r:id="rId21" w:history="1">
+              <w:r>
+                <w:rPr>
+                  <w:color w:val="004B87"/>
+                  <w:u w:val="single"/>
+                  <w:b/>
+                  <w:sz w:val="18"/>
+                </w:rPr>
+                <w:t>http://ppid.pktj.ac.id/admin/layanan/maklumat-pelayanan</w:t>
+              </w:r>
+            </w:hyperlink>
+            <w:r>
+              <w:rPr>
+                <w:color w:val="007832"/>
+                <w:sz w:val="17"/>
+              </w:rPr>
               <w:br/>
-            </w:r>
-            <w:r>
-              <w:rPr>
-                <w:b/>
-                <w:color w:val="16A34A"/>
-                <w:sz w:val="13"/>
-              </w:rPr>
               <w:t>Status Form: Siap Tayang di Website</w:t>
             </w:r>
           </w:p>
@@ -5580,22 +5686,24 @@
             </w:tcMar>
           </w:tcPr>
           <w:p>
-            <w:r>
-              <w:rPr>
-                <w:b/>
-                <w:color w:val="004A99"/>
-                <w:sz w:val="13"/>
-                <w:u w:val="single"/>
-              </w:rPr>
-              <w:t>http://ppid.pktj.ac.id/admin/layanan/maklumat-pelayanan</w:t>
+            <w:r/>
+            <w:hyperlink r:id="rId21" w:history="1">
+              <w:r>
+                <w:rPr>
+                  <w:color w:val="004B87"/>
+                  <w:u w:val="single"/>
+                  <w:b/>
+                  <w:sz w:val="18"/>
+                </w:rPr>
+                <w:t>http://ppid.pktj.ac.id/admin/layanan/maklumat-pelayanan</w:t>
+              </w:r>
+            </w:hyperlink>
+            <w:r>
+              <w:rPr>
+                <w:color w:val="007832"/>
+                <w:sz w:val="17"/>
+              </w:rPr>
               <w:br/>
-            </w:r>
-            <w:r>
-              <w:rPr>
-                <w:b/>
-                <w:color w:val="16A34A"/>
-                <w:sz w:val="13"/>
-              </w:rPr>
               <w:t>Status Form: Siap Tayang di Website</w:t>
             </w:r>
           </w:p>
@@ -5778,22 +5886,24 @@
             </w:tcMar>
           </w:tcPr>
           <w:p>
-            <w:r>
-              <w:rPr>
-                <w:b/>
-                <w:color w:val="004A99"/>
-                <w:sz w:val="13"/>
-                <w:u w:val="single"/>
-              </w:rPr>
-              <w:t>http://ppid.pktj.ac.id/admin/prosedur/sop-permintaan</w:t>
+            <w:r/>
+            <w:hyperlink r:id="rId22" w:history="1">
+              <w:r>
+                <w:rPr>
+                  <w:color w:val="004B87"/>
+                  <w:u w:val="single"/>
+                  <w:b/>
+                  <w:sz w:val="18"/>
+                </w:rPr>
+                <w:t>http://ppid.pktj.ac.id/admin/prosedur/sop-permintaan</w:t>
+              </w:r>
+            </w:hyperlink>
+            <w:r>
+              <w:rPr>
+                <w:color w:val="007832"/>
+                <w:sz w:val="17"/>
+              </w:rPr>
               <w:br/>
-            </w:r>
-            <w:r>
-              <w:rPr>
-                <w:b/>
-                <w:color w:val="16A34A"/>
-                <w:sz w:val="13"/>
-              </w:rPr>
               <w:t>Status Form: Siap Tayang di Website</w:t>
             </w:r>
           </w:p>
@@ -5976,22 +6086,24 @@
             </w:tcMar>
           </w:tcPr>
           <w:p>
-            <w:r>
-              <w:rPr>
-                <w:b/>
-                <w:color w:val="004A99"/>
-                <w:sz w:val="13"/>
-                <w:u w:val="single"/>
-              </w:rPr>
-              <w:t>http://ppid.pktj.ac.id/admin/prosedur/sop-keberatan</w:t>
+            <w:r/>
+            <w:hyperlink r:id="rId23" w:history="1">
+              <w:r>
+                <w:rPr>
+                  <w:color w:val="004B87"/>
+                  <w:u w:val="single"/>
+                  <w:b/>
+                  <w:sz w:val="18"/>
+                </w:rPr>
+                <w:t>http://ppid.pktj.ac.id/admin/prosedur/sop-keberatan</w:t>
+              </w:r>
+            </w:hyperlink>
+            <w:r>
+              <w:rPr>
+                <w:color w:val="007832"/>
+                <w:sz w:val="17"/>
+              </w:rPr>
               <w:br/>
-            </w:r>
-            <w:r>
-              <w:rPr>
-                <w:b/>
-                <w:color w:val="16A34A"/>
-                <w:sz w:val="13"/>
-              </w:rPr>
               <w:t>Status Form: Siap Tayang di Website</w:t>
             </w:r>
           </w:p>
@@ -6174,22 +6286,24 @@
             </w:tcMar>
           </w:tcPr>
           <w:p>
-            <w:r>
-              <w:rPr>
-                <w:b/>
-                <w:color w:val="004A99"/>
-                <w:sz w:val="13"/>
-                <w:u w:val="single"/>
-              </w:rPr>
-              <w:t>http://ppid.pktj.ac.id/admin/prosedur/sop-sengketa</w:t>
+            <w:r/>
+            <w:hyperlink r:id="rId18" w:history="1">
+              <w:r>
+                <w:rPr>
+                  <w:color w:val="004B87"/>
+                  <w:u w:val="single"/>
+                  <w:b/>
+                  <w:sz w:val="18"/>
+                </w:rPr>
+                <w:t>http://ppid.pktj.ac.id/admin/prosedur/sop-sengketa</w:t>
+              </w:r>
+            </w:hyperlink>
+            <w:r>
+              <w:rPr>
+                <w:color w:val="007832"/>
+                <w:sz w:val="17"/>
+              </w:rPr>
               <w:br/>
-            </w:r>
-            <w:r>
-              <w:rPr>
-                <w:b/>
-                <w:color w:val="16A34A"/>
-                <w:sz w:val="13"/>
-              </w:rPr>
               <w:t>Status Form: Siap Tayang di Website</w:t>
             </w:r>
           </w:p>
@@ -6372,22 +6486,24 @@
             </w:tcMar>
           </w:tcPr>
           <w:p>
-            <w:r>
-              <w:rPr>
-                <w:b/>
-                <w:color w:val="004A99"/>
-                <w:sz w:val="13"/>
-                <w:u w:val="single"/>
-              </w:rPr>
-              <w:t>http://ppid.pktj.ac.id/admin/prosedur/sop-penetapan</w:t>
+            <w:r/>
+            <w:hyperlink r:id="rId24" w:history="1">
+              <w:r>
+                <w:rPr>
+                  <w:color w:val="004B87"/>
+                  <w:u w:val="single"/>
+                  <w:b/>
+                  <w:sz w:val="18"/>
+                </w:rPr>
+                <w:t>http://ppid.pktj.ac.id/admin/prosedur/sop-penetapan</w:t>
+              </w:r>
+            </w:hyperlink>
+            <w:r>
+              <w:rPr>
+                <w:color w:val="007832"/>
+                <w:sz w:val="17"/>
+              </w:rPr>
               <w:br/>
-            </w:r>
-            <w:r>
-              <w:rPr>
-                <w:b/>
-                <w:color w:val="16A34A"/>
-                <w:sz w:val="13"/>
-              </w:rPr>
               <w:t>Status Form: Siap Tayang di Website</w:t>
             </w:r>
           </w:p>
@@ -6570,22 +6686,24 @@
             </w:tcMar>
           </w:tcPr>
           <w:p>
-            <w:r>
-              <w:rPr>
-                <w:b/>
-                <w:color w:val="004A99"/>
-                <w:sz w:val="13"/>
-                <w:u w:val="single"/>
-              </w:rPr>
-              <w:t>http://ppid.pktj.ac.id/admin/prosedur/sop-pengujian</w:t>
+            <w:r/>
+            <w:hyperlink r:id="rId25" w:history="1">
+              <w:r>
+                <w:rPr>
+                  <w:color w:val="004B87"/>
+                  <w:u w:val="single"/>
+                  <w:b/>
+                  <w:sz w:val="18"/>
+                </w:rPr>
+                <w:t>http://ppid.pktj.ac.id/admin/prosedur/sop-pengujian</w:t>
+              </w:r>
+            </w:hyperlink>
+            <w:r>
+              <w:rPr>
+                <w:color w:val="007832"/>
+                <w:sz w:val="17"/>
+              </w:rPr>
               <w:br/>
-            </w:r>
-            <w:r>
-              <w:rPr>
-                <w:b/>
-                <w:color w:val="16A34A"/>
-                <w:sz w:val="13"/>
-              </w:rPr>
               <w:t>Status Form: Siap Tayang di Website</w:t>
             </w:r>
           </w:p>
@@ -6768,22 +6886,24 @@
             </w:tcMar>
           </w:tcPr>
           <w:p>
-            <w:r>
-              <w:rPr>
-                <w:b/>
-                <w:color w:val="004A99"/>
-                <w:sz w:val="13"/>
-                <w:u w:val="single"/>
-              </w:rPr>
-              <w:t>http://ppid.pktj.ac.id/admin/prosedur/sop-pendokumentasian</w:t>
+            <w:r/>
+            <w:hyperlink r:id="rId26" w:history="1">
+              <w:r>
+                <w:rPr>
+                  <w:color w:val="004B87"/>
+                  <w:u w:val="single"/>
+                  <w:b/>
+                  <w:sz w:val="18"/>
+                </w:rPr>
+                <w:t>http://ppid.pktj.ac.id/admin/prosedur/sop-pendokumentasian</w:t>
+              </w:r>
+            </w:hyperlink>
+            <w:r>
+              <w:rPr>
+                <w:color w:val="007832"/>
+                <w:sz w:val="17"/>
+              </w:rPr>
               <w:br/>
-            </w:r>
-            <w:r>
-              <w:rPr>
-                <w:b/>
-                <w:color w:val="16A34A"/>
-                <w:sz w:val="13"/>
-              </w:rPr>
               <w:t>Status Form: Siap Tayang di Website</w:t>
             </w:r>
           </w:p>
@@ -7088,22 +7208,24 @@
             </w:tcMar>
           </w:tcPr>
           <w:p>
-            <w:r>
-              <w:rPr>
-                <w:b/>
-                <w:color w:val="004A99"/>
-                <w:sz w:val="13"/>
-                <w:u w:val="single"/>
-              </w:rPr>
-              <w:t>http://ppid.pktj.ac.id/admin/layanan/aksesibilitas</w:t>
+            <w:r/>
+            <w:hyperlink r:id="rId27" w:history="1">
+              <w:r>
+                <w:rPr>
+                  <w:color w:val="004B87"/>
+                  <w:u w:val="single"/>
+                  <w:b/>
+                  <w:sz w:val="18"/>
+                </w:rPr>
+                <w:t>http://ppid.pktj.ac.id/admin/layanan/aksesibilitas</w:t>
+              </w:r>
+            </w:hyperlink>
+            <w:r>
+              <w:rPr>
+                <w:color w:val="007832"/>
+                <w:sz w:val="17"/>
+              </w:rPr>
               <w:br/>
-            </w:r>
-            <w:r>
-              <w:rPr>
-                <w:b/>
-                <w:color w:val="16A34A"/>
-                <w:sz w:val="13"/>
-              </w:rPr>
               <w:t>Status Form: Siap Tayang di Website</w:t>
             </w:r>
           </w:p>
@@ -7286,22 +7408,24 @@
             </w:tcMar>
           </w:tcPr>
           <w:p>
-            <w:r>
-              <w:rPr>
-                <w:b/>
-                <w:color w:val="004A99"/>
-                <w:sz w:val="13"/>
-                <w:u w:val="single"/>
-              </w:rPr>
-              <w:t>http://ppid.pktj.ac.id/admin/layanan/aksesibilitas</w:t>
+            <w:r/>
+            <w:hyperlink r:id="rId27" w:history="1">
+              <w:r>
+                <w:rPr>
+                  <w:color w:val="004B87"/>
+                  <w:u w:val="single"/>
+                  <w:b/>
+                  <w:sz w:val="18"/>
+                </w:rPr>
+                <w:t>http://ppid.pktj.ac.id/admin/layanan/aksesibilitas</w:t>
+              </w:r>
+            </w:hyperlink>
+            <w:r>
+              <w:rPr>
+                <w:color w:val="007832"/>
+                <w:sz w:val="17"/>
+              </w:rPr>
               <w:br/>
-            </w:r>
-            <w:r>
-              <w:rPr>
-                <w:b/>
-                <w:color w:val="16A34A"/>
-                <w:sz w:val="13"/>
-              </w:rPr>
               <w:t>Status Form: Siap Tayang di Website</w:t>
             </w:r>
           </w:p>
@@ -7484,22 +7608,24 @@
             </w:tcMar>
           </w:tcPr>
           <w:p>
-            <w:r>
-              <w:rPr>
-                <w:b/>
-                <w:color w:val="004A99"/>
-                <w:sz w:val="13"/>
-                <w:u w:val="single"/>
-              </w:rPr>
-              <w:t>http://ppid.pktj.ac.id/admin/layanan/aksesibilitas</w:t>
+            <w:r/>
+            <w:hyperlink r:id="rId27" w:history="1">
+              <w:r>
+                <w:rPr>
+                  <w:color w:val="004B87"/>
+                  <w:u w:val="single"/>
+                  <w:b/>
+                  <w:sz w:val="18"/>
+                </w:rPr>
+                <w:t>http://ppid.pktj.ac.id/admin/layanan/aksesibilitas</w:t>
+              </w:r>
+            </w:hyperlink>
+            <w:r>
+              <w:rPr>
+                <w:color w:val="007832"/>
+                <w:sz w:val="17"/>
+              </w:rPr>
               <w:br/>
-            </w:r>
-            <w:r>
-              <w:rPr>
-                <w:b/>
-                <w:color w:val="16A34A"/>
-                <w:sz w:val="13"/>
-              </w:rPr>
               <w:t>Status Form: Siap Tayang di Website</w:t>
             </w:r>
           </w:p>
@@ -7682,22 +7808,24 @@
             </w:tcMar>
           </w:tcPr>
           <w:p>
-            <w:r>
-              <w:rPr>
-                <w:b/>
-                <w:color w:val="004A99"/>
-                <w:sz w:val="13"/>
-                <w:u w:val="single"/>
-              </w:rPr>
-              <w:t>http://ppid.pktj.ac.id/admin/layanan/aksesibilitas</w:t>
+            <w:r/>
+            <w:hyperlink r:id="rId27" w:history="1">
+              <w:r>
+                <w:rPr>
+                  <w:color w:val="004B87"/>
+                  <w:u w:val="single"/>
+                  <w:b/>
+                  <w:sz w:val="18"/>
+                </w:rPr>
+                <w:t>http://ppid.pktj.ac.id/admin/layanan/aksesibilitas</w:t>
+              </w:r>
+            </w:hyperlink>
+            <w:r>
+              <w:rPr>
+                <w:color w:val="007832"/>
+                <w:sz w:val="17"/>
+              </w:rPr>
               <w:br/>
-            </w:r>
-            <w:r>
-              <w:rPr>
-                <w:b/>
-                <w:color w:val="16A34A"/>
-                <w:sz w:val="13"/>
-              </w:rPr>
               <w:t>Status Form: Siap Tayang di Website</w:t>
             </w:r>
           </w:p>
@@ -7880,22 +8008,24 @@
             </w:tcMar>
           </w:tcPr>
           <w:p>
-            <w:r>
-              <w:rPr>
-                <w:b/>
-                <w:color w:val="004A99"/>
-                <w:sz w:val="13"/>
-                <w:u w:val="single"/>
-              </w:rPr>
-              <w:t>http://ppid.pktj.ac.id/admin/layanan/aksesibilitas</w:t>
+            <w:r/>
+            <w:hyperlink r:id="rId27" w:history="1">
+              <w:r>
+                <w:rPr>
+                  <w:color w:val="004B87"/>
+                  <w:u w:val="single"/>
+                  <w:b/>
+                  <w:sz w:val="18"/>
+                </w:rPr>
+                <w:t>http://ppid.pktj.ac.id/admin/layanan/aksesibilitas</w:t>
+              </w:r>
+            </w:hyperlink>
+            <w:r>
+              <w:rPr>
+                <w:color w:val="007832"/>
+                <w:sz w:val="17"/>
+              </w:rPr>
               <w:br/>
-            </w:r>
-            <w:r>
-              <w:rPr>
-                <w:b/>
-                <w:color w:val="16A34A"/>
-                <w:sz w:val="13"/>
-              </w:rPr>
               <w:t>Status Form: Siap Tayang di Website</w:t>
             </w:r>
           </w:p>
@@ -8200,22 +8330,24 @@
             </w:tcMar>
           </w:tcPr>
           <w:p>
-            <w:r>
-              <w:rPr>
-                <w:b/>
-                <w:color w:val="004A99"/>
-                <w:sz w:val="13"/>
-                <w:u w:val="single"/>
-              </w:rPr>
-              <w:t>http://ppid.pktj.ac.id/admin/dashboard</w:t>
+            <w:r/>
+            <w:hyperlink r:id="rId28" w:history="1">
+              <w:r>
+                <w:rPr>
+                  <w:color w:val="004B87"/>
+                  <w:u w:val="single"/>
+                  <w:b/>
+                  <w:sz w:val="18"/>
+                </w:rPr>
+                <w:t>http://ppid.pktj.ac.id/admin/dashboard</w:t>
+              </w:r>
+            </w:hyperlink>
+            <w:r>
+              <w:rPr>
+                <w:color w:val="007832"/>
+                <w:sz w:val="17"/>
+              </w:rPr>
               <w:br/>
-            </w:r>
-            <w:r>
-              <w:rPr>
-                <w:b/>
-                <w:color w:val="16A34A"/>
-                <w:sz w:val="13"/>
-              </w:rPr>
               <w:t>Status Form: Siap Tayang di Website</w:t>
             </w:r>
           </w:p>
@@ -8398,22 +8530,24 @@
             </w:tcMar>
           </w:tcPr>
           <w:p>
-            <w:r>
-              <w:rPr>
-                <w:b/>
-                <w:color w:val="004A99"/>
-                <w:sz w:val="13"/>
-                <w:u w:val="single"/>
-              </w:rPr>
-              <w:t>http://ppid.pktj.ac.id/admin/dashboard</w:t>
+            <w:r/>
+            <w:hyperlink r:id="rId28" w:history="1">
+              <w:r>
+                <w:rPr>
+                  <w:color w:val="004B87"/>
+                  <w:u w:val="single"/>
+                  <w:b/>
+                  <w:sz w:val="18"/>
+                </w:rPr>
+                <w:t>http://ppid.pktj.ac.id/admin/dashboard</w:t>
+              </w:r>
+            </w:hyperlink>
+            <w:r>
+              <w:rPr>
+                <w:color w:val="007832"/>
+                <w:sz w:val="17"/>
+              </w:rPr>
               <w:br/>
-            </w:r>
-            <w:r>
-              <w:rPr>
-                <w:b/>
-                <w:color w:val="16A34A"/>
-                <w:sz w:val="13"/>
-              </w:rPr>
               <w:t>Status Form: Siap Tayang di Website</w:t>
             </w:r>
           </w:p>
@@ -8596,22 +8730,24 @@
             </w:tcMar>
           </w:tcPr>
           <w:p>
-            <w:r>
-              <w:rPr>
-                <w:b/>
-                <w:color w:val="004A99"/>
-                <w:sz w:val="13"/>
-                <w:u w:val="single"/>
-              </w:rPr>
-              <w:t>http://ppid.pktj.ac.id/admin/permohonan-informasi</w:t>
+            <w:r/>
+            <w:hyperlink r:id="rId29" w:history="1">
+              <w:r>
+                <w:rPr>
+                  <w:color w:val="004B87"/>
+                  <w:u w:val="single"/>
+                  <w:b/>
+                  <w:sz w:val="18"/>
+                </w:rPr>
+                <w:t>http://ppid.pktj.ac.id/admin/permohonan-informasi</w:t>
+              </w:r>
+            </w:hyperlink>
+            <w:r>
+              <w:rPr>
+                <w:color w:val="007832"/>
+                <w:sz w:val="17"/>
+              </w:rPr>
               <w:br/>
-            </w:r>
-            <w:r>
-              <w:rPr>
-                <w:b/>
-                <w:color w:val="16A34A"/>
-                <w:sz w:val="13"/>
-              </w:rPr>
               <w:t>Status Form: Siap Tayang di Website</w:t>
             </w:r>
           </w:p>
@@ -8794,22 +8930,24 @@
             </w:tcMar>
           </w:tcPr>
           <w:p>
-            <w:r>
-              <w:rPr>
-                <w:b/>
-                <w:color w:val="004A99"/>
-                <w:sz w:val="13"/>
-                <w:u w:val="single"/>
-              </w:rPr>
-              <w:t>http://ppid.pktj.ac.id/admin/keberatan</w:t>
+            <w:r/>
+            <w:hyperlink r:id="rId30" w:history="1">
+              <w:r>
+                <w:rPr>
+                  <w:color w:val="004B87"/>
+                  <w:u w:val="single"/>
+                  <w:b/>
+                  <w:sz w:val="18"/>
+                </w:rPr>
+                <w:t>http://ppid.pktj.ac.id/admin/keberatan</w:t>
+              </w:r>
+            </w:hyperlink>
+            <w:r>
+              <w:rPr>
+                <w:color w:val="007832"/>
+                <w:sz w:val="17"/>
+              </w:rPr>
               <w:br/>
-            </w:r>
-            <w:r>
-              <w:rPr>
-                <w:b/>
-                <w:color w:val="16A34A"/>
-                <w:sz w:val="13"/>
-              </w:rPr>
               <w:t>Status Form: Siap Tayang di Website</w:t>
             </w:r>
           </w:p>
@@ -8992,22 +9130,24 @@
             </w:tcMar>
           </w:tcPr>
           <w:p>
-            <w:r>
-              <w:rPr>
-                <w:b/>
-                <w:color w:val="004A99"/>
-                <w:sz w:val="13"/>
-                <w:u w:val="single"/>
-              </w:rPr>
-              <w:t>http://ppid.pktj.ac.id/admin/kontak</w:t>
+            <w:r/>
+            <w:hyperlink r:id="rId31" w:history="1">
+              <w:r>
+                <w:rPr>
+                  <w:color w:val="004B87"/>
+                  <w:u w:val="single"/>
+                  <w:b/>
+                  <w:sz w:val="18"/>
+                </w:rPr>
+                <w:t>http://ppid.pktj.ac.id/admin/kontak</w:t>
+              </w:r>
+            </w:hyperlink>
+            <w:r>
+              <w:rPr>
+                <w:color w:val="007832"/>
+                <w:sz w:val="17"/>
+              </w:rPr>
               <w:br/>
-            </w:r>
-            <w:r>
-              <w:rPr>
-                <w:b/>
-                <w:color w:val="16A34A"/>
-                <w:sz w:val="13"/>
-              </w:rPr>
               <w:t>Status Form: Siap Tayang di Website</w:t>
             </w:r>
           </w:p>
@@ -9190,22 +9330,24 @@
             </w:tcMar>
           </w:tcPr>
           <w:p>
-            <w:r>
-              <w:rPr>
-                <w:b/>
-                <w:color w:val="004A99"/>
-                <w:sz w:val="13"/>
-                <w:u w:val="single"/>
-              </w:rPr>
-              <w:t>http://ppid.pktj.ac.id/admin/kontak</w:t>
+            <w:r/>
+            <w:hyperlink r:id="rId31" w:history="1">
+              <w:r>
+                <w:rPr>
+                  <w:color w:val="004B87"/>
+                  <w:u w:val="single"/>
+                  <w:b/>
+                  <w:sz w:val="18"/>
+                </w:rPr>
+                <w:t>http://ppid.pktj.ac.id/admin/kontak</w:t>
+              </w:r>
+            </w:hyperlink>
+            <w:r>
+              <w:rPr>
+                <w:color w:val="007832"/>
+                <w:sz w:val="17"/>
+              </w:rPr>
               <w:br/>
-            </w:r>
-            <w:r>
-              <w:rPr>
-                <w:b/>
-                <w:color w:val="16A34A"/>
-                <w:sz w:val="13"/>
-              </w:rPr>
               <w:t>Status Form: Siap Tayang di Website</w:t>
             </w:r>
           </w:p>
@@ -9388,23 +9530,25 @@
             </w:tcMar>
           </w:tcPr>
           <w:p>
-            <w:r>
-              <w:rPr>
-                <w:b/>
-                <w:color w:val="004A99"/>
-                <w:sz w:val="13"/>
-                <w:u w:val="single"/>
-              </w:rPr>
-              <w:t>http://ppid.pktj.ac.id/admin/layanan/laporan-layanan</w:t>
+            <w:r/>
+            <w:hyperlink r:id="rId17" w:history="1">
+              <w:r>
+                <w:rPr>
+                  <w:color w:val="004B87"/>
+                  <w:u w:val="single"/>
+                  <w:b/>
+                  <w:sz w:val="18"/>
+                </w:rPr>
+                <w:t>http://ppid.pktj.ac.id/admin/layanan/laporan-layanan</w:t>
+              </w:r>
+            </w:hyperlink>
+            <w:r>
+              <w:rPr>
+                <w:color w:val="007832"/>
+                <w:sz w:val="17"/>
+              </w:rPr>
               <w:br/>
-            </w:r>
-            <w:r>
-              <w:rPr>
-                <w:b/>
-                <w:color w:val="B91C1C"/>
-                <w:sz w:val="13"/>
-              </w:rPr>
-              <w:t>Status Form: Form Judul/Deskripsi Sudah Terisi di Admin (Tinggal Tempel Link GDrive)</w:t>
+              <w:t>Status Form: Siap Tayang di Website</w:t>
             </w:r>
           </w:p>
         </w:tc>
@@ -9708,8 +9852,24 @@
             </w:tcMar>
           </w:tcPr>
           <w:p>
-            <w:r>
-              <w:t>http://ppid.pktj.ac.id/admin/akip/F1/edit</w:t>
+            <w:r/>
+            <w:hyperlink r:id="rId32" w:history="1">
+              <w:r>
+                <w:rPr>
+                  <w:color w:val="004B87"/>
+                  <w:u w:val="single"/>
+                  <w:b/>
+                  <w:sz w:val="18"/>
+                </w:rPr>
+                <w:t>http://ppid.pktj.ac.id/admin/akip/F1/edit</w:t>
+              </w:r>
+            </w:hyperlink>
+            <w:r>
+              <w:rPr>
+                <w:b/>
+                <w:color w:val="B42800"/>
+                <w:sz w:val="17"/>
+              </w:rPr>
               <w:br/>
               <w:t>Status Form: Form Judul/Deskripsi Sudah Terisi di Admin (Tinggal Tempel Link GDrive)</w:t>
             </w:r>
@@ -9893,8 +10053,24 @@
             </w:tcMar>
           </w:tcPr>
           <w:p>
-            <w:r>
-              <w:t>http://ppid.pktj.ac.id/admin/akip/F2/edit</w:t>
+            <w:r/>
+            <w:hyperlink r:id="rId33" w:history="1">
+              <w:r>
+                <w:rPr>
+                  <w:color w:val="004B87"/>
+                  <w:u w:val="single"/>
+                  <w:b/>
+                  <w:sz w:val="18"/>
+                </w:rPr>
+                <w:t>http://ppid.pktj.ac.id/admin/akip/F2/edit</w:t>
+              </w:r>
+            </w:hyperlink>
+            <w:r>
+              <w:rPr>
+                <w:b/>
+                <w:color w:val="B42800"/>
+                <w:sz w:val="17"/>
+              </w:rPr>
               <w:br/>
               <w:t>Status Form: Form Judul/Deskripsi Sudah Terisi di Admin (Tinggal Tempel Link GDrive)</w:t>
             </w:r>
@@ -10078,22 +10254,24 @@
             </w:tcMar>
           </w:tcPr>
           <w:p>
-            <w:r>
-              <w:rPr>
-                <w:b/>
-                <w:color w:val="004A99"/>
-                <w:sz w:val="13"/>
-                <w:u w:val="single"/>
-              </w:rPr>
-              <w:t>http://ppid.pktj.ac.id/admin/pejabat</w:t>
+            <w:r/>
+            <w:hyperlink r:id="rId34" w:history="1">
+              <w:r>
+                <w:rPr>
+                  <w:color w:val="004B87"/>
+                  <w:u w:val="single"/>
+                  <w:b/>
+                  <w:sz w:val="18"/>
+                </w:rPr>
+                <w:t>http://ppid.pktj.ac.id/admin/pejabat</w:t>
+              </w:r>
+            </w:hyperlink>
+            <w:r>
+              <w:rPr>
+                <w:color w:val="007832"/>
+                <w:sz w:val="17"/>
+              </w:rPr>
               <w:br/>
-            </w:r>
-            <w:r>
-              <w:rPr>
-                <w:b/>
-                <w:color w:val="16A34A"/>
-                <w:sz w:val="13"/>
-              </w:rPr>
               <w:t>Status Form: Siap Tayang di Website</w:t>
             </w:r>
           </w:p>
@@ -10276,8 +10454,24 @@
             </w:tcMar>
           </w:tcPr>
           <w:p>
-            <w:r>
-              <w:t>http://ppid.pktj.ac.id/admin/akip/F4/edit</w:t>
+            <w:r/>
+            <w:hyperlink r:id="rId35" w:history="1">
+              <w:r>
+                <w:rPr>
+                  <w:color w:val="004B87"/>
+                  <w:u w:val="single"/>
+                  <w:b/>
+                  <w:sz w:val="18"/>
+                </w:rPr>
+                <w:t>http://ppid.pktj.ac.id/admin/akip/F4/edit</w:t>
+              </w:r>
+            </w:hyperlink>
+            <w:r>
+              <w:rPr>
+                <w:b/>
+                <w:color w:val="B42800"/>
+                <w:sz w:val="17"/>
+              </w:rPr>
               <w:br/>
               <w:t>Status Form: Form Judul/Deskripsi Sudah Terisi di Admin (Tinggal Tempel Link GDrive)</w:t>
             </w:r>
@@ -10461,8 +10655,24 @@
             </w:tcMar>
           </w:tcPr>
           <w:p>
-            <w:r>
-              <w:t>http://ppid.pktj.ac.id/admin/akip/F5/edit</w:t>
+            <w:r/>
+            <w:hyperlink r:id="rId36" w:history="1">
+              <w:r>
+                <w:rPr>
+                  <w:color w:val="004B87"/>
+                  <w:u w:val="single"/>
+                  <w:b/>
+                  <w:sz w:val="18"/>
+                </w:rPr>
+                <w:t>http://ppid.pktj.ac.id/admin/akip/F5/edit</w:t>
+              </w:r>
+            </w:hyperlink>
+            <w:r>
+              <w:rPr>
+                <w:b/>
+                <w:color w:val="B42800"/>
+                <w:sz w:val="17"/>
+              </w:rPr>
               <w:br/>
               <w:t>Status Form: Form Judul/Deskripsi Sudah Terisi di Admin (Tinggal Tempel Link GDrive)</w:t>
             </w:r>
@@ -10646,8 +10856,24 @@
             </w:tcMar>
           </w:tcPr>
           <w:p>
-            <w:r>
-              <w:t>http://ppid.pktj.ac.id/admin/akip/F6/edit</w:t>
+            <w:r/>
+            <w:hyperlink r:id="rId37" w:history="1">
+              <w:r>
+                <w:rPr>
+                  <w:color w:val="004B87"/>
+                  <w:u w:val="single"/>
+                  <w:b/>
+                  <w:sz w:val="18"/>
+                </w:rPr>
+                <w:t>http://ppid.pktj.ac.id/admin/akip/F6/edit</w:t>
+              </w:r>
+            </w:hyperlink>
+            <w:r>
+              <w:rPr>
+                <w:b/>
+                <w:color w:val="B42800"/>
+                <w:sz w:val="17"/>
+              </w:rPr>
               <w:br/>
               <w:t>Status Form: Form Judul/Deskripsi Sudah Terisi di Admin (Tinggal Tempel Link GDrive)</w:t>
             </w:r>
@@ -10831,8 +11057,24 @@
             </w:tcMar>
           </w:tcPr>
           <w:p>
-            <w:r>
-              <w:t>http://ppid.pktj.ac.id/admin/akip/F7/edit</w:t>
+            <w:r/>
+            <w:hyperlink r:id="rId38" w:history="1">
+              <w:r>
+                <w:rPr>
+                  <w:color w:val="004B87"/>
+                  <w:u w:val="single"/>
+                  <w:b/>
+                  <w:sz w:val="18"/>
+                </w:rPr>
+                <w:t>http://ppid.pktj.ac.id/admin/akip/F7/edit</w:t>
+              </w:r>
+            </w:hyperlink>
+            <w:r>
+              <w:rPr>
+                <w:b/>
+                <w:color w:val="B42800"/>
+                <w:sz w:val="17"/>
+              </w:rPr>
               <w:br/>
               <w:t>Status Form: Form Judul/Deskripsi Sudah Terisi di Admin (Tinggal Tempel Link GDrive)</w:t>
             </w:r>
@@ -11016,8 +11258,24 @@
             </w:tcMar>
           </w:tcPr>
           <w:p>
-            <w:r>
-              <w:t>http://ppid.pktj.ac.id/admin/akip/F8/edit</w:t>
+            <w:r/>
+            <w:hyperlink r:id="rId39" w:history="1">
+              <w:r>
+                <w:rPr>
+                  <w:color w:val="004B87"/>
+                  <w:u w:val="single"/>
+                  <w:b/>
+                  <w:sz w:val="18"/>
+                </w:rPr>
+                <w:t>http://ppid.pktj.ac.id/admin/akip/F8/edit</w:t>
+              </w:r>
+            </w:hyperlink>
+            <w:r>
+              <w:rPr>
+                <w:b/>
+                <w:color w:val="B42800"/>
+                <w:sz w:val="17"/>
+              </w:rPr>
               <w:br/>
               <w:t>Status Form: Form Judul/Deskripsi Sudah Terisi di Admin (Tinggal Tempel Link GDrive)</w:t>
             </w:r>
@@ -11201,8 +11459,24 @@
             </w:tcMar>
           </w:tcPr>
           <w:p>
-            <w:r>
-              <w:t>http://ppid.pktj.ac.id/admin/akip/F9/edit</w:t>
+            <w:r/>
+            <w:hyperlink r:id="rId40" w:history="1">
+              <w:r>
+                <w:rPr>
+                  <w:color w:val="004B87"/>
+                  <w:u w:val="single"/>
+                  <w:b/>
+                  <w:sz w:val="18"/>
+                </w:rPr>
+                <w:t>http://ppid.pktj.ac.id/admin/akip/F9/edit</w:t>
+              </w:r>
+            </w:hyperlink>
+            <w:r>
+              <w:rPr>
+                <w:b/>
+                <w:color w:val="B42800"/>
+                <w:sz w:val="17"/>
+              </w:rPr>
               <w:br/>
               <w:t>Status Form: Form Judul/Deskripsi Sudah Terisi di Admin (Tinggal Tempel Link GDrive)</w:t>
             </w:r>
@@ -11386,8 +11660,24 @@
             </w:tcMar>
           </w:tcPr>
           <w:p>
-            <w:r>
-              <w:t>http://ppid.pktj.ac.id/admin/akip/F10/edit</w:t>
+            <w:r/>
+            <w:hyperlink r:id="rId41" w:history="1">
+              <w:r>
+                <w:rPr>
+                  <w:color w:val="004B87"/>
+                  <w:u w:val="single"/>
+                  <w:b/>
+                  <w:sz w:val="18"/>
+                </w:rPr>
+                <w:t>http://ppid.pktj.ac.id/admin/akip/F10/edit</w:t>
+              </w:r>
+            </w:hyperlink>
+            <w:r>
+              <w:rPr>
+                <w:b/>
+                <w:color w:val="B42800"/>
+                <w:sz w:val="17"/>
+              </w:rPr>
               <w:br/>
               <w:t>Status Form: Form Judul/Deskripsi Sudah Terisi di Admin (Tinggal Tempel Link GDrive)</w:t>
             </w:r>
@@ -11693,8 +11983,24 @@
             </w:tcMar>
           </w:tcPr>
           <w:p>
-            <w:r>
-              <w:t>http://ppid.pktj.ac.id/admin/akip/G1/edit</w:t>
+            <w:r/>
+            <w:hyperlink r:id="rId42" w:history="1">
+              <w:r>
+                <w:rPr>
+                  <w:color w:val="004B87"/>
+                  <w:u w:val="single"/>
+                  <w:b/>
+                  <w:sz w:val="18"/>
+                </w:rPr>
+                <w:t>http://ppid.pktj.ac.id/admin/akip/G1/edit</w:t>
+              </w:r>
+            </w:hyperlink>
+            <w:r>
+              <w:rPr>
+                <w:b/>
+                <w:color w:val="B42800"/>
+                <w:sz w:val="17"/>
+              </w:rPr>
               <w:br/>
               <w:t>Status Form: Form Judul/Deskripsi Sudah Terisi di Admin (Tinggal Tempel Link GDrive)</w:t>
             </w:r>
@@ -11878,8 +12184,24 @@
             </w:tcMar>
           </w:tcPr>
           <w:p>
-            <w:r>
-              <w:t>http://ppid.pktj.ac.id/admin/akip/G2/edit</w:t>
+            <w:r/>
+            <w:hyperlink r:id="rId43" w:history="1">
+              <w:r>
+                <w:rPr>
+                  <w:color w:val="004B87"/>
+                  <w:u w:val="single"/>
+                  <w:b/>
+                  <w:sz w:val="18"/>
+                </w:rPr>
+                <w:t>http://ppid.pktj.ac.id/admin/akip/G2/edit</w:t>
+              </w:r>
+            </w:hyperlink>
+            <w:r>
+              <w:rPr>
+                <w:b/>
+                <w:color w:val="B42800"/>
+                <w:sz w:val="17"/>
+              </w:rPr>
               <w:br/>
               <w:t>Status Form: Form Judul/Deskripsi Sudah Terisi di Admin (Tinggal Tempel Link GDrive)</w:t>
             </w:r>
@@ -12063,8 +12385,24 @@
             </w:tcMar>
           </w:tcPr>
           <w:p>
-            <w:r>
-              <w:t>http://ppid.pktj.ac.id/admin/akip/G3/edit</w:t>
+            <w:r/>
+            <w:hyperlink r:id="rId44" w:history="1">
+              <w:r>
+                <w:rPr>
+                  <w:color w:val="004B87"/>
+                  <w:u w:val="single"/>
+                  <w:b/>
+                  <w:sz w:val="18"/>
+                </w:rPr>
+                <w:t>http://ppid.pktj.ac.id/admin/akip/G3/edit</w:t>
+              </w:r>
+            </w:hyperlink>
+            <w:r>
+              <w:rPr>
+                <w:b/>
+                <w:color w:val="B42800"/>
+                <w:sz w:val="17"/>
+              </w:rPr>
               <w:br/>
               <w:t>Status Form: Form Judul/Deskripsi Sudah Terisi di Admin (Tinggal Tempel Link GDrive)</w:t>
             </w:r>
@@ -12370,8 +12708,24 @@
             </w:tcMar>
           </w:tcPr>
           <w:p>
-            <w:r>
-              <w:t>http://ppid.pktj.ac.id/admin/akip/H1/edit</w:t>
+            <w:r/>
+            <w:hyperlink r:id="rId45" w:history="1">
+              <w:r>
+                <w:rPr>
+                  <w:color w:val="004B87"/>
+                  <w:u w:val="single"/>
+                  <w:b/>
+                  <w:sz w:val="18"/>
+                </w:rPr>
+                <w:t>http://ppid.pktj.ac.id/admin/akip/H1/edit</w:t>
+              </w:r>
+            </w:hyperlink>
+            <w:r>
+              <w:rPr>
+                <w:b/>
+                <w:color w:val="B42800"/>
+                <w:sz w:val="17"/>
+              </w:rPr>
               <w:br/>
               <w:t>Status Form: Form Judul/Deskripsi Sudah Terisi di Admin (Tinggal Tempel Link GDrive)</w:t>
             </w:r>
@@ -12555,8 +12909,24 @@
             </w:tcMar>
           </w:tcPr>
           <w:p>
-            <w:r>
-              <w:t>http://ppid.pktj.ac.id/admin/akip/H2/edit</w:t>
+            <w:r/>
+            <w:hyperlink r:id="rId46" w:history="1">
+              <w:r>
+                <w:rPr>
+                  <w:color w:val="004B87"/>
+                  <w:u w:val="single"/>
+                  <w:b/>
+                  <w:sz w:val="18"/>
+                </w:rPr>
+                <w:t>http://ppid.pktj.ac.id/admin/akip/H2/edit</w:t>
+              </w:r>
+            </w:hyperlink>
+            <w:r>
+              <w:rPr>
+                <w:b/>
+                <w:color w:val="B42800"/>
+                <w:sz w:val="17"/>
+              </w:rPr>
               <w:br/>
               <w:t>Status Form: Form Judul/Deskripsi Sudah Terisi di Admin (Tinggal Tempel Link GDrive)</w:t>
             </w:r>
@@ -12740,8 +13110,24 @@
             </w:tcMar>
           </w:tcPr>
           <w:p>
-            <w:r>
-              <w:t>http://ppid.pktj.ac.id/admin/akip/H3/edit</w:t>
+            <w:r/>
+            <w:hyperlink r:id="rId47" w:history="1">
+              <w:r>
+                <w:rPr>
+                  <w:color w:val="004B87"/>
+                  <w:u w:val="single"/>
+                  <w:b/>
+                  <w:sz w:val="18"/>
+                </w:rPr>
+                <w:t>http://ppid.pktj.ac.id/admin/akip/H3/edit</w:t>
+              </w:r>
+            </w:hyperlink>
+            <w:r>
+              <w:rPr>
+                <w:b/>
+                <w:color w:val="B42800"/>
+                <w:sz w:val="17"/>
+              </w:rPr>
               <w:br/>
               <w:t>Status Form: Form Judul/Deskripsi Sudah Terisi di Admin (Tinggal Tempel Link GDrive)</w:t>
             </w:r>
@@ -13047,22 +13433,24 @@
             </w:tcMar>
           </w:tcPr>
           <w:p>
-            <w:r>
-              <w:rPr>
-                <w:b/>
-                <w:color w:val="004A99"/>
-                <w:sz w:val="13"/>
-                <w:u w:val="single"/>
-              </w:rPr>
-              <w:t>http://ppid.pktj.ac.id/admin/layanan/aksesibilitas</w:t>
+            <w:r/>
+            <w:hyperlink r:id="rId27" w:history="1">
+              <w:r>
+                <w:rPr>
+                  <w:color w:val="004B87"/>
+                  <w:u w:val="single"/>
+                  <w:b/>
+                  <w:sz w:val="18"/>
+                </w:rPr>
+                <w:t>http://ppid.pktj.ac.id/admin/layanan/aksesibilitas</w:t>
+              </w:r>
+            </w:hyperlink>
+            <w:r>
+              <w:rPr>
+                <w:color w:val="007832"/>
+                <w:sz w:val="17"/>
+              </w:rPr>
               <w:br/>
-            </w:r>
-            <w:r>
-              <w:rPr>
-                <w:b/>
-                <w:color w:val="16A34A"/>
-                <w:sz w:val="13"/>
-              </w:rPr>
               <w:t>Status Form: Siap Tayang di Website</w:t>
             </w:r>
           </w:p>

</xml_diff>